<commit_message>
docs(diagnostics): change log, manual sections, README index
- docs/DIAGNOSTICS_CHANGES_DE.md / _EN.md: the four packages in detail,
  with the measurements over the real projects (17 builds, 3-9 marks
  each, none covering more than 12 % of an axis; Phase-0 probe: 0
  near-duplicate line pairs, 0 ports off the grid)
- ANLEITUNG DE/EN 5.1: coordinate alignment (default on), fine-cell
  attribution (P2, default on), critical cells in the Mesh Viewer
  (default off, count in the menu entry), mesh timing, simulation status;
  ANLEITUNG_DE.docx rebuilt
- F1 help (tab_help.py): the new menu entries and the diagnostics
  switches
- CHANGELOG: Unreleased section for all four packages
- README: link the two diagnostics documents
</commit_message>
<xml_diff>
--- a/docs/ANLEITUNG_DE.docx
+++ b/docs/ANLEITUNG_DE.docx
@@ -8,6 +8,17 @@
       </w:pPr>
       <w:r>
         <w:t>Anleitung: Antenne in FreeCAD zeichnen und mit der GUI simulieren</w:t>
+      </w:r>
+    </w:p>
+    <w:p>
+      <w:r>
+        <w:t xml:space="preserve">&gt; English version: </w:t>
+      </w:r>
+      <w:r>
+        <w:rPr>
+          <w:b/>
+        </w:rPr>
+        <w:t>[ANLEITUNG_EN.md](ANLEITUNG_EN.md)</w:t>
       </w:r>
     </w:p>
     <w:p>
@@ -305,7 +316,7 @@
           <w:p>
             <w:r/>
             <w:r>
-              <w:t>S-Params Viewer</w:t>
+              <w:t>S-Params Viewer; Antenna-Tab</w:t>
             </w:r>
           </w:p>
         </w:tc>
@@ -316,7 +327,7 @@
           <w:p>
             <w:r/>
             <w:r>
-              <w:t>S11/S21, Smith, Marker</w:t>
+              <w:t>S11/S21, Smith, Marker; Muster (Gain/Direktivität)</w:t>
             </w:r>
           </w:p>
         </w:tc>
@@ -342,6 +353,39 @@
       </w:r>
       <w:r>
         <w:t>).</w:t>
+      </w:r>
+    </w:p>
+    <w:p>
+      <w:r>
+        <w:rPr>
+          <w:b/>
+        </w:rPr>
+        <w:t>Kompakte Schritt-für-Schritt-Anleitung (FreeCAD → Geometry → Ports → Import → Simulation):</w:t>
+      </w:r>
+    </w:p>
+    <w:p>
+      <w:r>
+        <w:rPr>
+          <w:b/>
+        </w:rPr>
+        <w:t>[docs/FREECAD_WORKFLOW_DE.md](FREECAD_WORKFLOW_DE.md)</w:t>
+      </w:r>
+      <w:r>
+        <w:t xml:space="preserve"> — mit Checkliste und Fehler-Tabelle.</w:t>
+      </w:r>
+    </w:p>
+    <w:p>
+      <w:r>
+        <w:t xml:space="preserve">Details nur zur Port-Markierung: </w:t>
+      </w:r>
+      <w:r>
+        <w:rPr>
+          <w:b/>
+        </w:rPr>
+        <w:t>[docs/FREECAD_PORTS_DE.md](FREECAD_PORTS_DE.md)</w:t>
+      </w:r>
+      <w:r>
+        <w:t>.</w:t>
       </w:r>
     </w:p>
     <w:p>
@@ -714,6 +758,50 @@
       </w:r>
     </w:p>
     <w:p>
+      <w:r>
+        <w:rPr>
+          <w:b/>
+        </w:rPr>
+        <w:t>Ports schon in FreeCAD markieren (empfohlen):</w:t>
+      </w:r>
+    </w:p>
+    <w:p>
+      <w:r>
+        <w:t xml:space="preserve">Punkte </w:t>
+      </w:r>
+      <w:r>
+        <w:rPr>
+          <w:rFonts w:ascii="Consolas" w:hAnsi="Consolas"/>
+          <w:sz w:val="18"/>
+        </w:rPr>
+        <w:t>PORT_in1_start</w:t>
+      </w:r>
+      <w:r>
+        <w:t xml:space="preserve"> / </w:t>
+      </w:r>
+      <w:r>
+        <w:rPr>
+          <w:rFonts w:ascii="Consolas" w:hAnsi="Consolas"/>
+          <w:sz w:val="18"/>
+        </w:rPr>
+        <w:t>PORT_in1_stop</w:t>
+      </w:r>
+      <w:r>
+        <w:t xml:space="preserve"> anlegen → Import fügt den Port automatisch hinzu.</w:t>
+      </w:r>
+    </w:p>
+    <w:p>
+      <w:r>
+        <w:t xml:space="preserve">Schritt-für-Schritt: </w:t>
+      </w:r>
+      <w:r>
+        <w:rPr>
+          <w:b/>
+        </w:rPr>
+        <w:t>[docs/FREECAD_PORTS_DE.md](FREECAD_PORTS_DE.md)</w:t>
+      </w:r>
+    </w:p>
+    <w:p>
       <w:pPr>
         <w:pStyle w:val="Heading3"/>
       </w:pPr>
@@ -881,6 +969,342 @@
         <w:t>C:\Users\istra\Documents\claude_ps\FreeCAD_OpenEMS_GUI</w:t>
         <w:br/>
         <w:t>python app\main.py</w:t>
+      </w:r>
+    </w:p>
+    <w:p>
+      <w:r>
+        <w:rPr>
+          <w:b/>
+        </w:rPr>
+        <w:t>Menüleiste:</w:t>
+      </w:r>
+      <w:r>
+        <w:t xml:space="preserve"> </w:t>
+      </w:r>
+      <w:r>
+        <w:rPr>
+          <w:rFonts w:ascii="Consolas" w:hAnsi="Consolas"/>
+          <w:sz w:val="18"/>
+        </w:rPr>
+        <w:t>File</w:t>
+      </w:r>
+      <w:r>
+        <w:t xml:space="preserve"> (New/Open/Save, Import Geometry, Open Work Folder, Exit),</w:t>
+      </w:r>
+    </w:p>
+    <w:p>
+      <w:r>
+        <w:rPr>
+          <w:rFonts w:ascii="Consolas" w:hAnsi="Consolas"/>
+          <w:sz w:val="18"/>
+        </w:rPr>
+        <w:t>Project</w:t>
+      </w:r>
+      <w:r>
+        <w:t xml:space="preserve"> (Presets), </w:t>
+      </w:r>
+      <w:r>
+        <w:rPr>
+          <w:rFonts w:ascii="Consolas" w:hAnsi="Consolas"/>
+          <w:sz w:val="18"/>
+        </w:rPr>
+        <w:t>Geometry</w:t>
+      </w:r>
+      <w:r>
+        <w:t xml:space="preserve"> (Box/Cylinder/Port/Dump, Ports / Dumps… = </w:t>
+      </w:r>
+      <w:r>
+        <w:rPr>
+          <w:b/>
+        </w:rPr>
+        <w:t>Strg+Umschalt+D</w:t>
+      </w:r>
+      <w:r>
+        <w:t xml:space="preserve">, Edit/Duplicate/Delete Selected = </w:t>
+      </w:r>
+      <w:r>
+        <w:rPr>
+          <w:b/>
+        </w:rPr>
+        <w:t>Strg+D</w:t>
+      </w:r>
+      <w:r>
+        <w:t>/</w:t>
+      </w:r>
+      <w:r>
+        <w:rPr>
+          <w:b/>
+        </w:rPr>
+        <w:t>Entf</w:t>
+      </w:r>
+      <w:r>
+        <w:t>, Fit NF2FF — das Gleiche per Rechtsklick auf einen Tree-Eintrag),</w:t>
+      </w:r>
+    </w:p>
+    <w:p>
+      <w:r>
+        <w:rPr>
+          <w:rFonts w:ascii="Consolas" w:hAnsi="Consolas"/>
+          <w:sz w:val="18"/>
+        </w:rPr>
+        <w:t>Mesh</w:t>
+      </w:r>
+      <w:r>
+        <w:t xml:space="preserve"> (</w:t>
+      </w:r>
+      <w:r>
+        <w:rPr>
+          <w:rFonts w:ascii="Consolas" w:hAnsi="Consolas"/>
+          <w:sz w:val="18"/>
+        </w:rPr>
+        <w:t>Build CSX + Mesh + Validate</w:t>
+      </w:r>
+      <w:r>
+        <w:t xml:space="preserve"> = </w:t>
+      </w:r>
+      <w:r>
+        <w:rPr>
+          <w:b/>
+        </w:rPr>
+        <w:t>Strg+M</w:t>
+      </w:r>
+      <w:r>
+        <w:t xml:space="preserve">), </w:t>
+      </w:r>
+      <w:r>
+        <w:rPr>
+          <w:rFonts w:ascii="Consolas" w:hAnsi="Consolas"/>
+          <w:sz w:val="18"/>
+        </w:rPr>
+        <w:t>Simulation</w:t>
+      </w:r>
+      <w:r>
+        <w:t xml:space="preserve"> (</w:t>
+      </w:r>
+      <w:r>
+        <w:rPr>
+          <w:rFonts w:ascii="Consolas" w:hAnsi="Consolas"/>
+          <w:sz w:val="18"/>
+        </w:rPr>
+        <w:t>Run Simulation</w:t>
+      </w:r>
+      <w:r>
+        <w:t xml:space="preserve"> = </w:t>
+      </w:r>
+      <w:r>
+        <w:rPr>
+          <w:b/>
+        </w:rPr>
+        <w:t>Ctrl+R</w:t>
+      </w:r>
+      <w:r>
+        <w:t>, Script,</w:t>
+      </w:r>
+    </w:p>
+    <w:p>
+      <w:r>
+        <w:t>S-Params Viewer, Antenna Pattern Viewer / Pop-out Antenna Graph),</w:t>
+      </w:r>
+    </w:p>
+    <w:p>
+      <w:r>
+        <w:rPr>
+          <w:rFonts w:ascii="Consolas" w:hAnsi="Consolas"/>
+          <w:sz w:val="18"/>
+        </w:rPr>
+        <w:t>View</w:t>
+      </w:r>
+      <w:r>
+        <w:t xml:space="preserve"> (Tabs, Log Panel = </w:t>
+      </w:r>
+      <w:r>
+        <w:rPr>
+          <w:b/>
+        </w:rPr>
+        <w:t>Ctrl+L</w:t>
+      </w:r>
+      <w:r>
+        <w:t xml:space="preserve">, Project / Geometry Panel = </w:t>
+      </w:r>
+      <w:r>
+        <w:rPr>
+          <w:b/>
+        </w:rPr>
+        <w:t>Ctrl+B</w:t>
+      </w:r>
+      <w:r>
+        <w:t>),</w:t>
+      </w:r>
+    </w:p>
+    <w:p>
+      <w:r>
+        <w:rPr>
+          <w:rFonts w:ascii="Consolas" w:hAnsi="Consolas"/>
+          <w:sz w:val="18"/>
+        </w:rPr>
+        <w:t>Tools</w:t>
+      </w:r>
+      <w:r>
+        <w:t xml:space="preserve"> (Settings…),</w:t>
+      </w:r>
+    </w:p>
+    <w:p>
+      <w:r>
+        <w:rPr>
+          <w:rFonts w:ascii="Consolas" w:hAnsi="Consolas"/>
+          <w:sz w:val="18"/>
+        </w:rPr>
+        <w:t>Help</w:t>
+      </w:r>
+      <w:r>
+        <w:t xml:space="preserve"> (Help = </w:t>
+      </w:r>
+      <w:r>
+        <w:rPr>
+          <w:b/>
+        </w:rPr>
+        <w:t>F1</w:t>
+      </w:r>
+      <w:r>
+        <w:t>, ANLEITUNG, README, About).</w:t>
+      </w:r>
+    </w:p>
+    <w:p>
+      <w:r>
+        <w:t xml:space="preserve">Das </w:t>
+      </w:r>
+      <w:r>
+        <w:rPr>
+          <w:b/>
+        </w:rPr>
+        <w:t>Projekt-/Geometrie-Panel</w:t>
+      </w:r>
+      <w:r>
+        <w:t xml:space="preserve"> links (Tree) lässt sich per </w:t>
+      </w:r>
+      <w:r>
+        <w:rPr>
+          <w:b/>
+        </w:rPr>
+        <w:t>Rechtsklick</w:t>
+      </w:r>
+      <w:r>
+        <w:t xml:space="preserve"> auf</w:t>
+      </w:r>
+    </w:p>
+    <w:p>
+      <w:r>
+        <w:t xml:space="preserve">die leere Fläche darunter oder über </w:t>
+      </w:r>
+      <w:r>
+        <w:rPr>
+          <w:rFonts w:ascii="Consolas" w:hAnsi="Consolas"/>
+          <w:sz w:val="18"/>
+        </w:rPr>
+        <w:t>View</w:t>
+      </w:r>
+      <w:r>
+        <w:t xml:space="preserve"> → </w:t>
+      </w:r>
+      <w:r>
+        <w:rPr>
+          <w:b/>
+        </w:rPr>
+        <w:t>Project / Geometry Panel</w:t>
+      </w:r>
+    </w:p>
+    <w:p>
+      <w:r>
+        <w:t>(</w:t>
+      </w:r>
+      <w:r>
+        <w:rPr>
+          <w:b/>
+        </w:rPr>
+        <w:t>Ctrl+B</w:t>
+      </w:r>
+      <w:r>
+        <w:t>) aus- und wieder einblenden (Zustand wird gespeichert).</w:t>
+      </w:r>
+    </w:p>
+    <w:p>
+      <w:r>
+        <w:t xml:space="preserve">Das </w:t>
+      </w:r>
+      <w:r>
+        <w:rPr>
+          <w:b/>
+        </w:rPr>
+        <w:t>Log-Panel</w:t>
+      </w:r>
+      <w:r>
+        <w:t xml:space="preserve"> (unterhalb der Tabs, ein-/ausblendbar mit </w:t>
+      </w:r>
+      <w:r>
+        <w:rPr>
+          <w:b/>
+        </w:rPr>
+        <w:t>Ctrl+L</w:t>
+      </w:r>
+      <w:r>
+        <w:t>) hat zwei</w:t>
+      </w:r>
+    </w:p>
+    <w:p>
+      <w:r>
+        <w:t xml:space="preserve">Tabs: </w:t>
+      </w:r>
+      <w:r>
+        <w:rPr>
+          <w:b/>
+        </w:rPr>
+        <w:t>Log</w:t>
+      </w:r>
+      <w:r>
+        <w:t xml:space="preserve"> (openEMS-/App-Log) und </w:t>
+      </w:r>
+      <w:r>
+        <w:rPr>
+          <w:b/>
+        </w:rPr>
+        <w:t>Mesh Report</w:t>
+      </w:r>
+      <w:r>
+        <w:t xml:space="preserve"> (der Mesh-Check-Report,</w:t>
+      </w:r>
+    </w:p>
+    <w:p>
+      <w:r>
+        <w:t xml:space="preserve">einzige Quelle nach Build). </w:t>
+      </w:r>
+      <w:r>
+        <w:rPr>
+          <w:b/>
+        </w:rPr>
+        <w:t>Rechtsklick im gesamten Log-Bereich</w:t>
+      </w:r>
+      <w:r>
+        <w:t xml:space="preserve"> (Text,</w:t>
+      </w:r>
+    </w:p>
+    <w:p>
+      <w:r>
+        <w:t>Tab-Leiste, Knopfzeile, Zeilenzähler oder der Trenner darüber) öffnet die</w:t>
+      </w:r>
+    </w:p>
+    <w:p>
+      <w:r>
+        <w:t>Log-Optionen: Log-Panel und Projekt-/Geometrie-Panel ein-/ausblenden, Log-Tab</w:t>
+      </w:r>
+    </w:p>
+    <w:p>
+      <w:r>
+        <w:t>wählen, Auto-scroll, Save log…, Pop out log…. Im Text stehen darüber zusätzlich</w:t>
+      </w:r>
+    </w:p>
+    <w:p>
+      <w:r>
+        <w:t>Copy / Select All. Das gleiche Menü liegt auf der Statuszeile ganz unten.</w:t>
       </w:r>
     </w:p>
     <w:p>
@@ -1142,6 +1566,31 @@
         </w:rPr>
         <w:t>.obj</w:t>
       </w:r>
+      <w:r>
+        <w:t xml:space="preserve"> / </w:t>
+      </w:r>
+      <w:r>
+        <w:rPr>
+          <w:rFonts w:ascii="Consolas" w:hAnsi="Consolas"/>
+          <w:sz w:val="18"/>
+        </w:rPr>
+        <w:t>openems_export.json</w:t>
+      </w:r>
+    </w:p>
+    <w:p>
+      <w:r>
+        <w:t xml:space="preserve">(auch ein Ordner mit Objekt-STLs, z. B. </w:t>
+      </w:r>
+      <w:r>
+        <w:rPr>
+          <w:rFonts w:ascii="Consolas" w:hAnsi="Consolas"/>
+          <w:sz w:val="18"/>
+        </w:rPr>
+        <w:t>stl/</w:t>
+      </w:r>
+      <w:r>
+        <w:t>, ist möglich)</w:t>
+      </w:r>
     </w:p>
     <w:p>
       <w:pPr>
@@ -1158,7 +1607,21 @@
         <w:t>.npy</w:t>
       </w:r>
       <w:r>
-        <w:t>-Meshes</w:t>
+        <w:t>-Meshes; STL/Manifest werden direkt</w:t>
+      </w:r>
+    </w:p>
+    <w:p>
+      <w:r>
+        <w:t xml:space="preserve">geladen — </w:t>
+      </w:r>
+      <w:r>
+        <w:rPr>
+          <w:b/>
+        </w:rPr>
+        <w:t>ein Primitiv pro FreeCAD-Objekt</w:t>
+      </w:r>
+      <w:r>
+        <w:t>, Objektnamen bleiben erhalten</w:t>
       </w:r>
     </w:p>
     <w:p>
@@ -1245,7 +1708,7 @@
         <w:t>.fcstd</w:t>
       </w:r>
       <w:r>
-        <w:t xml:space="preserve"> oder </w:t>
+        <w:t xml:space="preserve"> (bevorzugt — Objektnamen bleiben erhalten) oder </w:t>
       </w:r>
       <w:r>
         <w:rPr>
@@ -1260,6 +1723,52 @@
         <w:pStyle w:val="ListBullet"/>
       </w:pPr>
       <w:r>
+        <w:rPr>
+          <w:b/>
+        </w:rPr>
+        <w:t>Import as:</w:t>
+      </w:r>
+      <w:r>
+        <w:t xml:space="preserve"> </w:t>
+      </w:r>
+      <w:r>
+        <w:rPr>
+          <w:rFonts w:ascii="Consolas" w:hAnsi="Consolas"/>
+          <w:sz w:val="18"/>
+        </w:rPr>
+        <w:t>STEP</w:t>
+      </w:r>
+      <w:r>
+        <w:t xml:space="preserve"> (tesselliert die App später) oder</w:t>
+      </w:r>
+    </w:p>
+    <w:p>
+      <w:r>
+        <w:rPr>
+          <w:rFonts w:ascii="Consolas" w:hAnsi="Consolas"/>
+          <w:sz w:val="18"/>
+        </w:rPr>
+        <w:t>STL (one mesh per FreeCAD object)</w:t>
+      </w:r>
+      <w:r>
+        <w:t xml:space="preserve"> (nutzt </w:t>
+      </w:r>
+      <w:r>
+        <w:rPr>
+          <w:rFonts w:ascii="Consolas" w:hAnsi="Consolas"/>
+          <w:sz w:val="18"/>
+        </w:rPr>
+        <w:t>openems_export.json</w:t>
+      </w:r>
+      <w:r>
+        <w:t>, kein FreeCAD zur Sim-Zeit nötig)</w:t>
+      </w:r>
+    </w:p>
+    <w:p>
+      <w:pPr>
+        <w:pStyle w:val="ListBullet"/>
+      </w:pPr>
+      <w:r>
         <w:t>Deflection: 0,1 mm (Standard)</w:t>
       </w:r>
     </w:p>
@@ -1286,6 +1795,23 @@
       </w:r>
     </w:p>
     <w:p>
+      <w:r>
+        <w:t>Headless (ohne GUI):</w:t>
+      </w:r>
+    </w:p>
+    <w:p>
+      <w:pPr>
+        <w:ind w:left="360"/>
+      </w:pPr>
+      <w:r>
+        <w:rPr>
+          <w:rFonts w:ascii="Consolas" w:hAnsi="Consolas"/>
+          <w:sz w:val="18"/>
+        </w:rPr>
+        <w:t>c:\Python\WPy64-31150\python-3.11.5.amd64\python.exe examples\run_stl_import_example.py</w:t>
+      </w:r>
+    </w:p>
+    <w:p>
       <w:pPr>
         <w:pStyle w:val="Heading3"/>
       </w:pPr>
@@ -1304,7 +1830,7 @@
         <w:t>Preset: Patch Antenna…</w:t>
       </w:r>
       <w:r>
-        <w:t xml:space="preserve"> oder </w:t>
+        <w:t xml:space="preserve">, </w:t>
       </w:r>
       <w:r>
         <w:rPr>
@@ -1312,13 +1838,1281 @@
         </w:rPr>
         <w:t>Preset: Yagi Antenna…</w:t>
       </w:r>
+      <w:r>
+        <w:t xml:space="preserve"> oder </w:t>
+      </w:r>
+      <w:r>
+        <w:rPr>
+          <w:b/>
+        </w:rPr>
+        <w:t>Preset: PCB Filter…</w:t>
+      </w:r>
     </w:p>
     <w:p>
       <w:pPr>
         <w:pStyle w:val="ListNumber"/>
       </w:pPr>
       <w:r>
-        <w:t>Kein FreeCAD nötig — geometrisches Modell direkt aus dem Projekt</w:t>
+        <w:rPr>
+          <w:b/>
+        </w:rPr>
+        <w:t>PCB Filter</w:t>
+      </w:r>
+      <w:r>
+        <w:t xml:space="preserve"> = 2-Port-Mikrostreifen-Notchfilter auf FR4 (Stopband bei 2,45 GHz):</w:t>
+      </w:r>
+    </w:p>
+    <w:p>
+      <w:r>
+        <w:t>zwei Lumped-Ports, damit misst das Beispiel beide S-Matrix-Spalten.</w:t>
+      </w:r>
+    </w:p>
+    <w:p>
+      <w:r>
+        <w:t xml:space="preserve">Die Geometrie kommt aus </w:t>
+      </w:r>
+      <w:r>
+        <w:rPr>
+          <w:b/>
+        </w:rPr>
+        <w:t>FreeCAD</w:t>
+      </w:r>
+      <w:r>
+        <w:t xml:space="preserve"> (FCStd → STL, 35 µm Kupfer); </w:t>
+      </w:r>
+      <w:r>
+        <w:rPr>
+          <w:rFonts w:ascii="Consolas" w:hAnsi="Consolas"/>
+          <w:sz w:val="18"/>
+        </w:rPr>
+        <w:t>--analytic</w:t>
+      </w:r>
+    </w:p>
+    <w:p>
+      <w:r>
+        <w:t>nutzt alternativ die analytischen Box-Primitives zum Vergleich</w:t>
+      </w:r>
+    </w:p>
+    <w:p>
+      <w:pPr>
+        <w:ind w:left="360"/>
+      </w:pPr>
+      <w:r>
+        <w:rPr>
+          <w:rFonts w:ascii="Consolas" w:hAnsi="Consolas"/>
+          <w:sz w:val="18"/>
+        </w:rPr>
+        <w:t>c:\Python\WPy64-31150\python-3.11.5.amd64\python.exe examples\run_pcb_filter_example.py</w:t>
+      </w:r>
+    </w:p>
+    <w:p>
+      <w:r>
+        <w:t>Ergebnis (</w:t>
+      </w:r>
+      <w:r>
+        <w:rPr>
+          <w:rFonts w:ascii="Consolas" w:hAnsi="Consolas"/>
+          <w:sz w:val="18"/>
+        </w:rPr>
+        <w:t>work\pcb_filter\simulation\</w:t>
+      </w:r>
+      <w:r>
+        <w:t xml:space="preserve">): FreeCAD-Lauf </w:t>
+      </w:r>
+      <w:r>
+        <w:rPr>
+          <w:b/>
+        </w:rPr>
+        <w:t>−29,99 dB bei 2,450 GHz</w:t>
+      </w:r>
+    </w:p>
+    <w:p>
+      <w:r>
+        <w:t>Zielwert, Durchlass −0,72 dB bei 0,3 GHz; analytischer Lauf −28,96 dB bei 2,429 GHz</w:t>
+      </w:r>
+    </w:p>
+    <w:p>
+      <w:r>
+        <w:t>(0,9 % Unterschied = echte 35 µm Kupferschicht vs. null dicke Leiterbahn im Tutorial).</w:t>
+      </w:r>
+    </w:p>
+    <w:p>
+      <w:r>
+        <w:t>Hinweise:</w:t>
+      </w:r>
+    </w:p>
+    <w:p>
+      <w:pPr>
+        <w:pStyle w:val="ListBullet"/>
+      </w:pPr>
+      <w:r>
+        <w:rPr>
+          <w:b/>
+        </w:rPr>
+        <w:t>Achsenparallele</w:t>
+      </w:r>
+      <w:r>
+        <w:t xml:space="preserve"> FreeCAD-Körper werden als openEMS-</w:t>
+      </w:r>
+      <w:r>
+        <w:rPr>
+          <w:b/>
+        </w:rPr>
+        <w:t>Box</w:t>
+      </w:r>
+      <w:r>
+        <w:t xml:space="preserve"> angelegt (exakte</w:t>
+      </w:r>
+    </w:p>
+    <w:p>
+      <w:r>
+        <w:t>Metallkanten auf den Gitterlinien), alles andere bleibt STL-</w:t>
+      </w:r>
+      <w:r>
+        <w:rPr>
+          <w:rFonts w:ascii="Consolas" w:hAnsi="Consolas"/>
+          <w:sz w:val="18"/>
+        </w:rPr>
+        <w:t>PolyhedronReader</w:t>
+      </w:r>
+      <w:r>
+        <w:t>.</w:t>
+      </w:r>
+    </w:p>
+    <w:p>
+      <w:r>
+        <w:t>In-Memory-</w:t>
+      </w:r>
+      <w:r>
+        <w:rPr>
+          <w:rFonts w:ascii="Consolas" w:hAnsi="Consolas"/>
+          <w:sz w:val="18"/>
+        </w:rPr>
+        <w:t>Polyhedron</w:t>
+      </w:r>
+      <w:r>
+        <w:t xml:space="preserve">-Primitive simuliert openEMS </w:t>
+      </w:r>
+      <w:r>
+        <w:rPr>
+          <w:b/>
+        </w:rPr>
+        <w:t>nicht</w:t>
+      </w:r>
+      <w:r>
+        <w:t xml:space="preserve"> (Warnung</w:t>
+      </w:r>
+    </w:p>
+    <w:p>
+      <w:r>
+        <w:rPr>
+          <w:i/>
+        </w:rPr>
+        <w:t>Unused primitive</w:t>
+      </w:r>
+      <w:r>
+        <w:t>).</w:t>
+      </w:r>
+    </w:p>
+    <w:p>
+      <w:pPr>
+        <w:pStyle w:val="ListBullet"/>
+      </w:pPr>
+      <w:r>
+        <w:rPr>
+          <w:rFonts w:ascii="Consolas" w:hAnsi="Consolas"/>
+          <w:sz w:val="18"/>
+        </w:rPr>
+        <w:t>[WARNING] grading_jump: Axis z 9.14</w:t>
+      </w:r>
+      <w:r>
+        <w:t xml:space="preserve"> ist normal: die 35 µm Kupfer erzwingen</w:t>
+      </w:r>
+    </w:p>
+    <w:p>
+      <w:r>
+        <w:t>0,035-mm-Zellen neben den 0,32-mm-Substratzellen — nur eine Warnung, Exit-Code 0.</w:t>
+      </w:r>
+    </w:p>
+    <w:p>
+      <w:pPr>
+        <w:pStyle w:val="ListBullet"/>
+      </w:pPr>
+      <w:r>
+        <w:rPr>
+          <w:rFonts w:ascii="Consolas" w:hAnsi="Consolas"/>
+          <w:sz w:val="18"/>
+        </w:rPr>
+        <w:t>Max. number of timesteps was reached</w:t>
+      </w:r>
+      <w:r>
+        <w:t xml:space="preserve"> ist hier erwartet; das Stopband ist stabil</w:t>
+      </w:r>
+    </w:p>
+    <w:p>
+      <w:r>
+        <w:t xml:space="preserve">(0,019 dB Änderung von 50 000 auf 150 000 Schritte, </w:t>
+      </w:r>
+      <w:r>
+        <w:rPr>
+          <w:rFonts w:ascii="Consolas" w:hAnsi="Consolas"/>
+          <w:sz w:val="18"/>
+        </w:rPr>
+        <w:t>work\pcb_filter_conv</w:t>
+      </w:r>
+      <w:r>
+        <w:t>).</w:t>
+      </w:r>
+    </w:p>
+    <w:p>
+      <w:pPr>
+        <w:pStyle w:val="Heading4"/>
+      </w:pPr>
+      <w:r>
+        <w:t>PCB-Bandpass 5,6 GHz (fünf Stubs, Teflon)</w:t>
+      </w:r>
+    </w:p>
+    <w:p>
+      <w:r>
+        <w:rPr>
+          <w:b/>
+        </w:rPr>
+        <w:t>Preset: PCB Bandpass (5.6 GHz)…</w:t>
+      </w:r>
+      <w:r>
+        <w:t xml:space="preserve"> lädt einen 5-poligen Chebyshev-Bandpass</w:t>
+      </w:r>
+    </w:p>
+    <w:p>
+      <w:r>
+        <w:t xml:space="preserve">(0,1 dB Welligkeit) auf </w:t>
+      </w:r>
+      <w:r>
+        <w:rPr>
+          <w:b/>
+        </w:rPr>
+        <w:t>PTFE/Teflon</w:t>
+      </w:r>
+      <w:r>
+        <w:t xml:space="preserve"> (0,254 mm, εr = 2,1, tanδ = 0,0002,</w:t>
+      </w:r>
+    </w:p>
+    <w:p>
+      <w:r>
+        <w:t xml:space="preserve">35 µm Kupfer). Fünf </w:t>
+      </w:r>
+      <w:r>
+        <w:rPr>
+          <w:b/>
+        </w:rPr>
+        <w:t>offene λ/2-Stubs</w:t>
+      </w:r>
+      <w:r>
+        <w:t xml:space="preserve"> hängen an einer 50-Ω-Leitung, dazwischen</w:t>
+      </w:r>
+    </w:p>
+    <w:p>
+      <w:r>
+        <w:t xml:space="preserve">liegen vier </w:t>
+      </w:r>
+      <w:r>
+        <w:rPr>
+          <w:b/>
+        </w:rPr>
+        <w:t>λ/4-Verbindungsleitungen</w:t>
+      </w:r>
+      <w:r>
+        <w:t xml:space="preserve"> als Impedanz-Inverter — ohne Vias, also</w:t>
+      </w:r>
+    </w:p>
+    <w:p>
+      <w:r>
+        <w:t>einseitig planar.</w:t>
+      </w:r>
+    </w:p>
+    <w:tbl>
+      <w:tblPr>
+        <w:tblStyle w:val="TableGrid"/>
+        <w:tblW w:type="auto" w:w="0"/>
+        <w:tblLook w:firstColumn="1" w:firstRow="1" w:lastColumn="0" w:lastRow="0" w:noHBand="0" w:noVBand="1" w:val="04A0"/>
+      </w:tblPr>
+      <w:tblGrid>
+        <w:gridCol w:w="2520"/>
+        <w:gridCol w:w="2520"/>
+        <w:gridCol w:w="2520"/>
+        <w:gridCol w:w="2520"/>
+      </w:tblGrid>
+      <w:tr>
+        <w:tc>
+          <w:tcPr>
+            <w:tcW w:type="dxa" w:w="2520"/>
+          </w:tcPr>
+          <w:p>
+            <w:r/>
+            <w:r>
+              <w:rPr>
+                <w:b/>
+              </w:rPr>
+              <w:t>---</w:t>
+            </w:r>
+          </w:p>
+        </w:tc>
+        <w:tc>
+          <w:tcPr>
+            <w:tcW w:type="dxa" w:w="2520"/>
+          </w:tcPr>
+          <w:p>
+            <w:r/>
+            <w:r>
+              <w:rPr>
+                <w:b/>
+              </w:rPr>
+              <w:t>---</w:t>
+            </w:r>
+          </w:p>
+        </w:tc>
+        <w:tc>
+          <w:tcPr>
+            <w:tcW w:type="dxa" w:w="2520"/>
+          </w:tcPr>
+          <w:p>
+            <w:r/>
+            <w:r>
+              <w:rPr>
+                <w:b/>
+              </w:rPr>
+              <w:t>---</w:t>
+            </w:r>
+          </w:p>
+        </w:tc>
+        <w:tc>
+          <w:tcPr>
+            <w:tcW w:type="dxa" w:w="2520"/>
+          </w:tcPr>
+          <w:p>
+            <w:r/>
+            <w:r>
+              <w:rPr>
+                <w:b/>
+              </w:rPr>
+              <w:t>---</w:t>
+            </w:r>
+          </w:p>
+        </w:tc>
+      </w:tr>
+      <w:tr>
+        <w:tc>
+          <w:tcPr>
+            <w:tcW w:type="dxa" w:w="2520"/>
+          </w:tcPr>
+          <w:p>
+            <w:r/>
+            <w:r>
+              <w:t>Stub 1 / 5 (außen)</w:t>
+            </w:r>
+          </w:p>
+        </w:tc>
+        <w:tc>
+          <w:tcPr>
+            <w:tcW w:type="dxa" w:w="2520"/>
+          </w:tcPr>
+          <w:p>
+            <w:r/>
+            <w:r>
+              <w:t>50,8</w:t>
+            </w:r>
+          </w:p>
+        </w:tc>
+        <w:tc>
+          <w:tcPr>
+            <w:tcW w:type="dxa" w:w="2520"/>
+          </w:tcPr>
+          <w:p>
+            <w:r/>
+            <w:r>
+              <w:t>0,80</w:t>
+            </w:r>
+          </w:p>
+        </w:tc>
+        <w:tc>
+          <w:tcPr>
+            <w:tcW w:type="dxa" w:w="2520"/>
+          </w:tcPr>
+          <w:p>
+            <w:r/>
+            <w:r>
+              <w:t>18,37</w:t>
+            </w:r>
+          </w:p>
+        </w:tc>
+      </w:tr>
+      <w:tr>
+        <w:tc>
+          <w:tcPr>
+            <w:tcW w:type="dxa" w:w="2520"/>
+          </w:tcPr>
+          <w:p>
+            <w:r/>
+            <w:r>
+              <w:t>Stub 2 / 4</w:t>
+            </w:r>
+          </w:p>
+        </w:tc>
+        <w:tc>
+          <w:tcPr>
+            <w:tcW w:type="dxa" w:w="2520"/>
+          </w:tcPr>
+          <w:p>
+            <w:r/>
+            <w:r>
+              <w:t>15,0</w:t>
+            </w:r>
+          </w:p>
+        </w:tc>
+        <w:tc>
+          <w:tcPr>
+            <w:tcW w:type="dxa" w:w="2520"/>
+          </w:tcPr>
+          <w:p>
+            <w:r/>
+            <w:r>
+              <w:t>3,74</w:t>
+            </w:r>
+          </w:p>
+        </w:tc>
+        <w:tc>
+          <w:tcPr>
+            <w:tcW w:type="dxa" w:w="2520"/>
+          </w:tcPr>
+          <w:p>
+            <w:r/>
+            <w:r>
+              <w:t>18,69</w:t>
+            </w:r>
+          </w:p>
+        </w:tc>
+      </w:tr>
+      <w:tr>
+        <w:tc>
+          <w:tcPr>
+            <w:tcW w:type="dxa" w:w="2520"/>
+          </w:tcPr>
+          <w:p>
+            <w:r/>
+            <w:r>
+              <w:t>Stub 3 (Mitte)</w:t>
+            </w:r>
+          </w:p>
+        </w:tc>
+        <w:tc>
+          <w:tcPr>
+            <w:tcW w:type="dxa" w:w="2520"/>
+          </w:tcPr>
+          <w:p>
+            <w:r/>
+            <w:r>
+              <w:t>68,0</w:t>
+            </w:r>
+          </w:p>
+        </w:tc>
+        <w:tc>
+          <w:tcPr>
+            <w:tcW w:type="dxa" w:w="2520"/>
+          </w:tcPr>
+          <w:p>
+            <w:r/>
+            <w:r>
+              <w:t>0,50</w:t>
+            </w:r>
+          </w:p>
+        </w:tc>
+        <w:tc>
+          <w:tcPr>
+            <w:tcW w:type="dxa" w:w="2520"/>
+          </w:tcPr>
+          <w:p>
+            <w:r/>
+            <w:r>
+              <w:t>22,91</w:t>
+            </w:r>
+          </w:p>
+        </w:tc>
+      </w:tr>
+      <w:tr>
+        <w:tc>
+          <w:tcPr>
+            <w:tcW w:type="dxa" w:w="2520"/>
+          </w:tcPr>
+          <w:p>
+            <w:r/>
+            <w:r>
+              <w:t>Linie 1 / 4</w:t>
+            </w:r>
+          </w:p>
+        </w:tc>
+        <w:tc>
+          <w:tcPr>
+            <w:tcW w:type="dxa" w:w="2520"/>
+          </w:tcPr>
+          <w:p>
+            <w:r/>
+            <w:r>
+              <w:t>43,9</w:t>
+            </w:r>
+          </w:p>
+        </w:tc>
+        <w:tc>
+          <w:tcPr>
+            <w:tcW w:type="dxa" w:w="2520"/>
+          </w:tcPr>
+          <w:p>
+            <w:r/>
+            <w:r>
+              <w:t>1,01</w:t>
+            </w:r>
+          </w:p>
+        </w:tc>
+        <w:tc>
+          <w:tcPr>
+            <w:tcW w:type="dxa" w:w="2520"/>
+          </w:tcPr>
+          <w:p>
+            <w:r/>
+            <w:r>
+              <w:t>11,78</w:t>
+            </w:r>
+          </w:p>
+        </w:tc>
+      </w:tr>
+      <w:tr>
+        <w:tc>
+          <w:tcPr>
+            <w:tcW w:type="dxa" w:w="2520"/>
+          </w:tcPr>
+          <w:p>
+            <w:r/>
+            <w:r>
+              <w:t>Linie 2 / 3</w:t>
+            </w:r>
+          </w:p>
+        </w:tc>
+        <w:tc>
+          <w:tcPr>
+            <w:tcW w:type="dxa" w:w="2520"/>
+          </w:tcPr>
+          <w:p>
+            <w:r/>
+            <w:r>
+              <w:t>61,0</w:t>
+            </w:r>
+          </w:p>
+        </w:tc>
+        <w:tc>
+          <w:tcPr>
+            <w:tcW w:type="dxa" w:w="2520"/>
+          </w:tcPr>
+          <w:p>
+            <w:r/>
+            <w:r>
+              <w:t>0,60</w:t>
+            </w:r>
+          </w:p>
+        </w:tc>
+        <w:tc>
+          <w:tcPr>
+            <w:tcW w:type="dxa" w:w="2520"/>
+          </w:tcPr>
+          <w:p>
+            <w:r/>
+            <w:r>
+              <w:t>8,04</w:t>
+            </w:r>
+          </w:p>
+        </w:tc>
+      </w:tr>
+    </w:tbl>
+    <w:p/>
+    <w:p>
+      <w:pPr>
+        <w:ind w:left="360"/>
+      </w:pPr>
+      <w:r>
+        <w:rPr>
+          <w:rFonts w:ascii="Consolas" w:hAnsi="Consolas"/>
+          <w:sz w:val="18"/>
+        </w:rPr>
+        <w:t>c:\Python\WPy64-31150\python-3.11.5.amd64\python.exe examples\run_pcb_bandpass_example.py</w:t>
+      </w:r>
+    </w:p>
+    <w:p>
+      <w:r>
+        <w:t>Ergebnis (</w:t>
+      </w:r>
+      <w:r>
+        <w:rPr>
+          <w:rFonts w:ascii="Consolas" w:hAnsi="Consolas"/>
+          <w:sz w:val="18"/>
+        </w:rPr>
+        <w:t>work\pcb_bandpass\sparams\</w:t>
+      </w:r>
+      <w:r>
+        <w:t>): **|S11| &lt; −10 dB von 4,90 bis</w:t>
+      </w:r>
+    </w:p>
+    <w:p>
+      <w:r>
+        <w:t>6,45 GHz</w:t>
+      </w:r>
+      <w:r>
+        <w:rPr>
+          <w:b/>
+        </w:rPr>
+        <w:t xml:space="preserve">, Durchlass </w:t>
+      </w:r>
+      <w:r>
+        <w:t>−0,1 … −0,3 dB</w:t>
+      </w:r>
+      <w:r>
+        <w:rPr>
+          <w:b/>
+        </w:rPr>
+        <w:t xml:space="preserve">, Sperrdämpfung </w:t>
+      </w:r>
+      <w:r>
+        <w:t>−42 dB bei 4,0 GHz**</w:t>
+      </w:r>
+    </w:p>
+    <w:p>
+      <w:r>
+        <w:t xml:space="preserve">und </w:t>
+      </w:r>
+      <w:r>
+        <w:rPr>
+          <w:b/>
+        </w:rPr>
+        <w:t>−38 dB bei 7,2 GHz</w:t>
+      </w:r>
+      <w:r>
+        <w:t xml:space="preserve"> (2 FDTD-Läufe, je eine S-Matrix-Spalte, danach</w:t>
+      </w:r>
+    </w:p>
+    <w:p>
+      <w:r>
+        <w:t>zusammengeführt; Laufzeit ≈ 80 s pro Port auf 8 Kernen).</w:t>
+      </w:r>
+    </w:p>
+    <w:p>
+      <w:r>
+        <w:t>Hinweise:</w:t>
+      </w:r>
+    </w:p>
+    <w:p>
+      <w:pPr>
+        <w:pStyle w:val="ListBullet"/>
+      </w:pPr>
+      <w:r>
+        <w:t xml:space="preserve">Das Gitter nutzt </w:t>
+      </w:r>
+      <w:r>
+        <w:rPr>
+          <w:rFonts w:ascii="Consolas" w:hAnsi="Consolas"/>
+          <w:sz w:val="18"/>
+        </w:rPr>
+        <w:t>min_cellsize = 0,15 mm</w:t>
+      </w:r>
+      <w:r>
+        <w:t xml:space="preserve"> (schmalster Stub 0,50 mm) und</w:t>
+      </w:r>
+    </w:p>
+    <w:p>
+      <w:r>
+        <w:rPr>
+          <w:rFonts w:ascii="Consolas" w:hAnsi="Consolas"/>
+          <w:sz w:val="18"/>
+        </w:rPr>
+        <w:t>min_cellsize_z = 0,085 mm</w:t>
+      </w:r>
+      <w:r>
+        <w:t xml:space="preserve"> (drei Zellen im 0,254-mm-Substrat).</w:t>
+      </w:r>
+    </w:p>
+    <w:p>
+      <w:pPr>
+        <w:pStyle w:val="ListBullet"/>
+      </w:pPr>
+      <w:r>
+        <w:rPr>
+          <w:rFonts w:ascii="Consolas" w:hAnsi="Consolas"/>
+          <w:sz w:val="18"/>
+        </w:rPr>
+        <w:t>smooth_metal_edge = False</w:t>
+      </w:r>
+      <w:r>
+        <w:t xml:space="preserve"> und </w:t>
+      </w:r>
+      <w:r>
+        <w:rPr>
+          <w:rFonts w:ascii="Consolas" w:hAnsi="Consolas"/>
+          <w:sz w:val="18"/>
+        </w:rPr>
+        <w:t>handle_closely_placed_edges = False</w:t>
+      </w:r>
+      <w:r>
+        <w:t>:</w:t>
+      </w:r>
+    </w:p>
+    <w:p>
+      <w:r>
+        <w:t>easyMesh erzeugte sonst zwischen 0,41 mm und 0,50 mm breiten Leiterkanten eine</w:t>
+      </w:r>
+    </w:p>
+    <w:p>
+      <w:r>
+        <w:t>4-µm-Zelle, die den CFL-Zeitschritt um Faktor 8 verkleinert (Simulation lief</w:t>
+      </w:r>
+    </w:p>
+    <w:p>
+      <w:r>
+        <w:t>nicht aus).</w:t>
+      </w:r>
+    </w:p>
+    <w:p>
+      <w:pPr>
+        <w:pStyle w:val="ListBullet"/>
+      </w:pPr>
+      <w:r>
+        <w:t>Die Sperrdämpfung ist bei Stub-Bandpässen prinzipbedingt nur im Bereich um f0</w:t>
+      </w:r>
+    </w:p>
+    <w:p>
+      <w:r>
+        <w:t>gut; bei 2·f0 entsteht ein weiterer Durchlass (Spurious-Passband).</w:t>
+      </w:r>
+    </w:p>
+    <w:p>
+      <w:pPr>
+        <w:pStyle w:val="Heading4"/>
+      </w:pPr>
+      <w:r>
+        <w:t>PCB-Hairpin-Bandpass 2,4 GHz (fünf gefaltete Resonatoren, RT/duroid)</w:t>
+      </w:r>
+    </w:p>
+    <w:p>
+      <w:r>
+        <w:rPr>
+          <w:b/>
+        </w:rPr>
+        <w:t>Preset: PCB Hairpin Bandpass (2.4 GHz)…</w:t>
+      </w:r>
+      <w:r>
+        <w:t xml:space="preserve"> lädt einen 5-poligen</w:t>
+      </w:r>
+    </w:p>
+    <w:p>
+      <w:r>
+        <w:t>Chebyshev-Bandpass (0,1 dB Welligkeit, 10 % Bandbreite → 2,28–2,52 GHz) auf</w:t>
+      </w:r>
+    </w:p>
+    <w:p>
+      <w:r>
+        <w:rPr>
+          <w:b/>
+        </w:rPr>
+        <w:t>RT/duroid 6010LM</w:t>
+      </w:r>
+      <w:r>
+        <w:t xml:space="preserve"> (1,27 mm, εr = 10,2, tanδ = 0,0023, 35 µm Kupfer). Fünf</w:t>
+      </w:r>
+    </w:p>
+    <w:p>
+      <w:r>
+        <w:rPr>
+          <w:b/>
+        </w:rPr>
+        <w:t>gefaltete λ/2-Resonatoren</w:t>
+      </w:r>
+      <w:r>
+        <w:t xml:space="preserve"> (Hairpins) sind nebeneinander über ihre Armlänge</w:t>
+      </w:r>
+    </w:p>
+    <w:p>
+      <w:r>
+        <w:t>gekoppelt — ohne Vias, ohne Stichleitungen, Leiterbild nur 25,1 × 14,3 mm.</w:t>
+      </w:r>
+    </w:p>
+    <w:tbl>
+      <w:tblPr>
+        <w:tblStyle w:val="TableGrid"/>
+        <w:tblW w:type="auto" w:w="0"/>
+        <w:tblLook w:firstColumn="1" w:firstRow="1" w:lastColumn="0" w:lastRow="0" w:noHBand="0" w:noVBand="1" w:val="04A0"/>
+      </w:tblPr>
+      <w:tblGrid>
+        <w:gridCol w:w="5040"/>
+        <w:gridCol w:w="5040"/>
+      </w:tblGrid>
+      <w:tr>
+        <w:tc>
+          <w:tcPr>
+            <w:tcW w:type="dxa" w:w="5040"/>
+          </w:tcPr>
+          <w:p>
+            <w:r/>
+            <w:r>
+              <w:rPr>
+                <w:b/>
+              </w:rPr>
+              <w:t>---</w:t>
+            </w:r>
+          </w:p>
+        </w:tc>
+        <w:tc>
+          <w:tcPr>
+            <w:tcW w:type="dxa" w:w="5040"/>
+          </w:tcPr>
+          <w:p>
+            <w:r/>
+            <w:r>
+              <w:rPr>
+                <w:b/>
+              </w:rPr>
+              <w:t>---</w:t>
+            </w:r>
+          </w:p>
+        </w:tc>
+      </w:tr>
+      <w:tr>
+        <w:tc>
+          <w:tcPr>
+            <w:tcW w:type="dxa" w:w="5040"/>
+          </w:tcPr>
+          <w:p>
+            <w:r/>
+            <w:r>
+              <w:t>Mittenfrequenz f0 / Bandbreite</w:t>
+            </w:r>
+          </w:p>
+        </w:tc>
+        <w:tc>
+          <w:tcPr>
+            <w:tcW w:type="dxa" w:w="5040"/>
+          </w:tcPr>
+          <w:p>
+            <w:r/>
+            <w:r>
+              <w:t>2,40 GHz / 10 %</w:t>
+            </w:r>
+          </w:p>
+        </w:tc>
+      </w:tr>
+      <w:tr>
+        <w:tc>
+          <w:tcPr>
+            <w:tcW w:type="dxa" w:w="5040"/>
+          </w:tcPr>
+          <w:p>
+            <w:r/>
+            <w:r>
+              <w:t>λg im ungeradzahligen Modus</w:t>
+            </w:r>
+          </w:p>
+        </w:tc>
+        <w:tc>
+          <w:tcPr>
+            <w:tcW w:type="dxa" w:w="5040"/>
+          </w:tcPr>
+          <w:p>
+            <w:r/>
+            <w:r>
+              <w:t>51,23 mm (εeff = 5,946)</w:t>
+            </w:r>
+          </w:p>
+        </w:tc>
+      </w:tr>
+      <w:tr>
+        <w:tc>
+          <w:tcPr>
+            <w:tcW w:type="dxa" w:w="5040"/>
+          </w:tcPr>
+          <w:p>
+            <w:r/>
+            <w:r>
+              <w:t>Streifenbreite (alle Arme)</w:t>
+            </w:r>
+          </w:p>
+        </w:tc>
+        <w:tc>
+          <w:tcPr>
+            <w:tcW w:type="dxa" w:w="5040"/>
+          </w:tcPr>
+          <w:p>
+            <w:r/>
+            <w:r>
+              <w:t>1,186 mm (50 Ω)</w:t>
+            </w:r>
+          </w:p>
+        </w:tc>
+      </w:tr>
+      <w:tr>
+        <w:tc>
+          <w:tcPr>
+            <w:tcW w:type="dxa" w:w="5040"/>
+          </w:tcPr>
+          <w:p>
+            <w:r/>
+            <w:r>
+              <w:t>Armlänge</w:t>
+            </w:r>
+          </w:p>
+        </w:tc>
+        <w:tc>
+          <w:tcPr>
+            <w:tcW w:type="dxa" w:w="5040"/>
+          </w:tcPr>
+          <w:p>
+            <w:r/>
+            <w:r>
+              <w:t>11,814 mm</w:t>
+            </w:r>
+          </w:p>
+        </w:tc>
+      </w:tr>
+      <w:tr>
+        <w:tc>
+          <w:tcPr>
+            <w:tcW w:type="dxa" w:w="5040"/>
+          </w:tcPr>
+          <w:p>
+            <w:r/>
+            <w:r>
+              <w:t>Innenabstand der U-Arme</w:t>
+            </w:r>
+          </w:p>
+        </w:tc>
+        <w:tc>
+          <w:tcPr>
+            <w:tcW w:type="dxa" w:w="5040"/>
+          </w:tcPr>
+          <w:p>
+            <w:r/>
+            <w:r>
+              <w:t>0,80 mm</w:t>
+            </w:r>
+          </w:p>
+        </w:tc>
+      </w:tr>
+      <w:tr>
+        <w:tc>
+          <w:tcPr>
+            <w:tcW w:type="dxa" w:w="5040"/>
+          </w:tcPr>
+          <w:p>
+            <w:r/>
+            <w:r>
+              <w:t>Faltung außen / elektrisch</w:t>
+            </w:r>
+          </w:p>
+        </w:tc>
+        <w:tc>
+          <w:tcPr>
+            <w:tcW w:type="dxa" w:w="5040"/>
+          </w:tcPr>
+          <w:p>
+            <w:r/>
+            <w:r>
+              <w:t>3,172 / 1,986 mm</w:t>
+            </w:r>
+          </w:p>
+        </w:tc>
+      </w:tr>
+      <w:tr>
+        <w:tc>
+          <w:tcPr>
+            <w:tcW w:type="dxa" w:w="5040"/>
+          </w:tcPr>
+          <w:p>
+            <w:r/>
+            <w:r>
+              <w:t>Koppelspalte s0…s5</w:t>
+            </w:r>
+          </w:p>
+        </w:tc>
+        <w:tc>
+          <w:tcPr>
+            <w:tcW w:type="dxa" w:w="5040"/>
+          </w:tcPr>
+          <w:p>
+            <w:r/>
+            <w:r>
+              <w:t>0,316 / 1,387 / 1,753 / 1,753 / 1,387 / 0,316 mm</w:t>
+            </w:r>
+          </w:p>
+        </w:tc>
+      </w:tr>
+      <w:tr>
+        <w:tc>
+          <w:tcPr>
+            <w:tcW w:type="dxa" w:w="5040"/>
+          </w:tcPr>
+          <w:p>
+            <w:r/>
+            <w:r>
+              <w:t>J-Inverter (normiert)</w:t>
+            </w:r>
+          </w:p>
+        </w:tc>
+        <w:tc>
+          <w:tcPr>
+            <w:tcW w:type="dxa" w:w="5040"/>
+          </w:tcPr>
+          <w:p>
+            <w:r/>
+            <w:r>
+              <w:t>0,370 / 0,125 / 0,096 / 0,096 / 0,125 / 0,370</w:t>
+            </w:r>
+          </w:p>
+        </w:tc>
+      </w:tr>
+      <w:tr>
+        <w:tc>
+          <w:tcPr>
+            <w:tcW w:type="dxa" w:w="5040"/>
+          </w:tcPr>
+          <w:p>
+            <w:r/>
+            <w:r>
+              <w:t>Z0e / Z0o</w:t>
+            </w:r>
+          </w:p>
+        </w:tc>
+        <w:tc>
+          <w:tcPr>
+            <w:tcW w:type="dxa" w:w="5040"/>
+          </w:tcPr>
+          <w:p>
+            <w:r/>
+            <w:r>
+              <w:t>75,4/38,3 · 57,1/44,5 · 55,2/45,7 Ω</w:t>
+            </w:r>
+          </w:p>
+        </w:tc>
+      </w:tr>
+    </w:tbl>
+    <w:p/>
+    <w:p>
+      <w:r>
+        <w:t>Synthese: Die beiden Arme eines Hairpins tragen Gegenströme, der Resonator</w:t>
+      </w:r>
+    </w:p>
+    <w:p>
+      <w:r>
+        <w:t xml:space="preserve">schwingt also im </w:t>
+      </w:r>
+      <w:r>
+        <w:rPr>
+          <w:b/>
+        </w:rPr>
+        <w:t>ungeradzahligen Modus</w:t>
+      </w:r>
+      <w:r>
+        <w:t xml:space="preserve"> des Arm-Paares. Die Armlänge folgt</w:t>
+      </w:r>
+    </w:p>
+    <w:p>
+      <w:r>
+        <w:t>deshalb εeff,odd = 5,946 (nicht dem Einzelleiter-εeff — damit wären die Arme</w:t>
+      </w:r>
+    </w:p>
+    <w:p>
+      <w:r>
+        <w:t>~15 % zu kurz). Die Spalte liefert das Hammerstad-Jensen-Modell (even/odd) über</w:t>
+      </w:r>
+    </w:p>
+    <w:p>
+      <w:r>
+        <w:t>die J-Inverter der Chebyshev-Prototypparameter; die Streifenbreite bleibt</w:t>
+      </w:r>
+    </w:p>
+    <w:p>
+      <w:r>
+        <w:t>einheitlich, allein der Spalt stellt die Kopplung ein.</w:t>
+      </w:r>
+    </w:p>
+    <w:p>
+      <w:pPr>
+        <w:ind w:left="360"/>
+      </w:pPr>
+      <w:r>
+        <w:rPr>
+          <w:rFonts w:ascii="Consolas" w:hAnsi="Consolas"/>
+          <w:sz w:val="18"/>
+        </w:rPr>
+        <w:t>c:\Python\WPy64-31150\python-3.11.5.amd64\python.exe examples\run_pcb_hairpin_example.py</w:t>
+      </w:r>
+    </w:p>
+    <w:p>
+      <w:r>
+        <w:t xml:space="preserve">Verifiziert ist der </w:t>
+      </w:r>
+      <w:r>
+        <w:rPr>
+          <w:b/>
+        </w:rPr>
+        <w:t>Einzelresonator</w:t>
+      </w:r>
+      <w:r>
+        <w:t>: ein Hairpin (Arm 11,814 mm, gespeiste</w:t>
+      </w:r>
+    </w:p>
+    <w:p>
+      <w:r>
+        <w:t xml:space="preserve">Kopplung 0,316 mm) resoniert bei </w:t>
+      </w:r>
+      <w:r>
+        <w:rPr>
+          <w:b/>
+        </w:rPr>
+        <w:t>2,365 GHz</w:t>
+      </w:r>
+      <w:r>
+        <w:t xml:space="preserve"> mit </w:t>
+      </w:r>
+      <w:r>
+        <w:rPr>
+          <w:b/>
+        </w:rPr>
+        <w:t>S21 = −0,16 dB</w:t>
+      </w:r>
+      <w:r>
+        <w:t xml:space="preserve"> und</w:t>
+      </w:r>
+    </w:p>
+    <w:p>
+      <w:r>
+        <w:rPr>
+          <w:b/>
+        </w:rPr>
+        <w:t>S11 = −47,6 dB</w:t>
+      </w:r>
+      <w:r>
+        <w:t>; die Flankenbreite entspricht Qe ≈ 12,5 (Synthese 13,1).</w:t>
+      </w:r>
+    </w:p>
+    <w:p>
+      <w:r>
+        <w:t>Hinweise:</w:t>
+      </w:r>
+    </w:p>
+    <w:p>
+      <w:pPr>
+        <w:pStyle w:val="ListBullet"/>
+      </w:pPr>
+      <w:r>
+        <w:rPr>
+          <w:b/>
+        </w:rPr>
+        <w:t>Simulationsdauer:</w:t>
+      </w:r>
+      <w:r>
+        <w:t xml:space="preserve"> Die DFT-Auflösung ist 1/T_sim. Für 240 MHz Durchlass</w:t>
+      </w:r>
+    </w:p>
+    <w:p>
+      <w:r>
+        <w:t>mit ~50 MHz Modenabstand braucht es T_sim ≳ 60 ns (≳ 1,2 Mio. Schritte).</w:t>
+      </w:r>
+    </w:p>
+    <w:p>
+      <w:r>
+        <w:t>Wegen tanδ = 0,0023 (Q0 ≈ 435) klingt das Sperrband sehr langsam ab. Das</w:t>
+      </w:r>
+    </w:p>
+    <w:p>
+      <w:r>
+        <w:t xml:space="preserve">Preset stoppt deshalb bei </w:t>
+      </w:r>
+      <w:r>
+        <w:rPr>
+          <w:rFonts w:ascii="Consolas" w:hAnsi="Consolas"/>
+          <w:sz w:val="18"/>
+        </w:rPr>
+        <w:t>end_criteria = 1e-4</w:t>
+      </w:r>
+      <w:r>
+        <w:t xml:space="preserve"> (−40 dB) und</w:t>
+      </w:r>
+    </w:p>
+    <w:p>
+      <w:r>
+        <w:rPr>
+          <w:rFonts w:ascii="Consolas" w:hAnsi="Consolas"/>
+          <w:sz w:val="18"/>
+        </w:rPr>
+        <w:t>max_timesteps = 600_000</w:t>
+      </w:r>
+      <w:r>
+        <w:t>.</w:t>
+      </w:r>
+    </w:p>
+    <w:p>
+      <w:pPr>
+        <w:pStyle w:val="ListBullet"/>
+      </w:pPr>
+      <w:r>
+        <w:rPr>
+          <w:b/>
+        </w:rPr>
+        <w:t>Validierungsstand:</w:t>
+      </w:r>
+      <w:r>
+        <w:t xml:space="preserve"> Einzelresonator und Einzelkopplung sind im FDTD</w:t>
+      </w:r>
+    </w:p>
+    <w:p>
+      <w:r>
+        <w:t>verifiziert. Kurze Läufe (&lt; 200 k Schritte) lösen den Modenabstand des</w:t>
+      </w:r>
+    </w:p>
+    <w:p>
+      <w:r>
+        <w:t>Filters nicht auf und zeigen dann keinen sauberen Durchlass — für die volle</w:t>
+      </w:r>
+    </w:p>
+    <w:p>
+      <w:r>
+        <w:t>5-Pol-Kurve den Lauf wie oben verlängern.</w:t>
+      </w:r>
+    </w:p>
+    <w:p>
+      <w:pPr>
+        <w:pStyle w:val="ListBullet"/>
+      </w:pPr>
+      <w:r>
+        <w:t xml:space="preserve">Gitter: </w:t>
+      </w:r>
+      <w:r>
+        <w:rPr>
+          <w:rFonts w:ascii="Consolas" w:hAnsi="Consolas"/>
+          <w:sz w:val="18"/>
+        </w:rPr>
+        <w:t>min_cellsize = min(s)/3 = 0,105 mm</w:t>
+      </w:r>
+      <w:r>
+        <w:t>, die 1,387-mm-Spalte liegt in</w:t>
+      </w:r>
+    </w:p>
+    <w:p>
+      <w:r>
+        <w:t>vier Zellen, Streifenkanten auf Gitterlinien (</w:t>
+      </w:r>
+      <w:r>
+        <w:rPr>
+          <w:rFonts w:ascii="Consolas" w:hAnsi="Consolas"/>
+          <w:sz w:val="18"/>
+        </w:rPr>
+        <w:t>edges2grid = "xy"</w:t>
+      </w:r>
+      <w:r>
+        <w:t>).</w:t>
       </w:r>
     </w:p>
     <w:p>
@@ -1339,12 +3133,487 @@
         <w:pStyle w:val="Heading3"/>
       </w:pPr>
       <w:r>
+        <w:t>5.0 Simulations-Parameter (eigenes Fenster)</w:t>
+      </w:r>
+    </w:p>
+    <w:p>
+      <w:r>
+        <w:rPr>
+          <w:b/>
+        </w:rPr>
+        <w:t>Menü → Simulation → Simulation Parameters…</w:t>
+      </w:r>
+      <w:r>
+        <w:t xml:space="preserve"> (oder </w:t>
+      </w:r>
+      <w:r>
+        <w:rPr>
+          <w:b/>
+        </w:rPr>
+        <w:t>Strg+Umschalt+P</w:t>
+      </w:r>
+      <w:r>
+        <w:t>) öffnet</w:t>
+      </w:r>
+    </w:p>
+    <w:p>
+      <w:r>
+        <w:t xml:space="preserve">ein eigenes, verschiebbares Fenster mit </w:t>
+      </w:r>
+      <w:r>
+        <w:rPr>
+          <w:b/>
+        </w:rPr>
+        <w:t>allen</w:t>
+      </w:r>
+      <w:r>
+        <w:t xml:space="preserve"> Simulationsparametern —</w:t>
+      </w:r>
+    </w:p>
+    <w:p>
+      <w:r>
+        <w:t>zwei Tabs:</w:t>
+      </w:r>
+    </w:p>
+    <w:tbl>
+      <w:tblPr>
+        <w:tblStyle w:val="TableGrid"/>
+        <w:tblW w:type="auto" w:w="0"/>
+        <w:tblLook w:firstColumn="1" w:firstRow="1" w:lastColumn="0" w:lastRow="0" w:noHBand="0" w:noVBand="1" w:val="04A0"/>
+      </w:tblPr>
+      <w:tblGrid>
+        <w:gridCol w:w="5040"/>
+        <w:gridCol w:w="5040"/>
+      </w:tblGrid>
+      <w:tr>
+        <w:tc>
+          <w:tcPr>
+            <w:tcW w:type="dxa" w:w="5040"/>
+          </w:tcPr>
+          <w:p>
+            <w:r/>
+            <w:r>
+              <w:rPr>
+                <w:b/>
+              </w:rPr>
+              <w:t>-----</w:t>
+            </w:r>
+          </w:p>
+        </w:tc>
+        <w:tc>
+          <w:tcPr>
+            <w:tcW w:type="dxa" w:w="5040"/>
+          </w:tcPr>
+          <w:p>
+            <w:r/>
+            <w:r>
+              <w:rPr>
+                <w:b/>
+              </w:rPr>
+              <w:t>--------</w:t>
+            </w:r>
+          </w:p>
+        </w:tc>
+      </w:tr>
+      <w:tr>
+        <w:tc>
+          <w:tcPr>
+            <w:tcW w:type="dxa" w:w="5040"/>
+          </w:tcPr>
+          <w:p>
+            <w:r/>
+            <w:r>
+              <w:t>Simulation-Parameter</w:t>
+            </w:r>
+          </w:p>
+        </w:tc>
+        <w:tc>
+          <w:tcPr>
+            <w:tcW w:type="dxa" w:w="5040"/>
+          </w:tcPr>
+          <w:p>
+            <w:r/>
+            <w:r>
+              <w:t>Computed (read-only), Excitation &amp; convergence (End criteria, NrTS), Boundary conditions ×6 + PML, Air margin, Mesh-Overrides, Patch-Geometrie</w:t>
+            </w:r>
+          </w:p>
+        </w:tc>
+      </w:tr>
+      <w:tr>
+        <w:tc>
+          <w:tcPr>
+            <w:tcW w:type="dxa" w:w="5040"/>
+          </w:tcPr>
+          <w:p>
+            <w:r/>
+            <w:r>
+              <w:t>NF2FF-Parameter</w:t>
+            </w:r>
+          </w:p>
+        </w:tc>
+        <w:tc>
+          <w:tcPr>
+            <w:tcW w:type="dxa" w:w="5040"/>
+          </w:tcPr>
+          <w:p>
+            <w:r/>
+            <w:r>
+              <w:t>Enable far-field (NF2FF), Evaluation frequencies (Mode: *Auto (S11 minimum)* / *N points (mesh range)* / *Frequency list*), θ/φ-Steps, Fit/Edit NF2FF-Box</w:t>
+            </w:r>
+          </w:p>
+        </w:tc>
+      </w:tr>
+    </w:tbl>
+    <w:p/>
+    <w:p>
+      <w:r>
+        <w:rPr>
+          <w:b/>
+        </w:rPr>
+        <w:t>Evaluation frequencies</w:t>
+      </w:r>
+      <w:r>
+        <w:t xml:space="preserve"> (NF2FF-Tab) legen fest, an wie vielen Frequenzen</w:t>
+      </w:r>
+    </w:p>
+    <w:p>
+      <w:r>
+        <w:t>das Fernfeld nachgerechnet wird:</w:t>
+      </w:r>
+    </w:p>
+    <w:tbl>
+      <w:tblPr>
+        <w:tblStyle w:val="TableGrid"/>
+        <w:tblW w:type="auto" w:w="0"/>
+        <w:tblLook w:firstColumn="1" w:firstRow="1" w:lastColumn="0" w:lastRow="0" w:noHBand="0" w:noVBand="1" w:val="04A0"/>
+      </w:tblPr>
+      <w:tblGrid>
+        <w:gridCol w:w="5040"/>
+        <w:gridCol w:w="5040"/>
+      </w:tblGrid>
+      <w:tr>
+        <w:tc>
+          <w:tcPr>
+            <w:tcW w:type="dxa" w:w="5040"/>
+          </w:tcPr>
+          <w:p>
+            <w:r/>
+            <w:r>
+              <w:rPr>
+                <w:b/>
+              </w:rPr>
+              <w:t>------</w:t>
+            </w:r>
+          </w:p>
+        </w:tc>
+        <w:tc>
+          <w:tcPr>
+            <w:tcW w:type="dxa" w:w="5040"/>
+          </w:tcPr>
+          <w:p>
+            <w:r/>
+            <w:r>
+              <w:rPr>
+                <w:b/>
+              </w:rPr>
+              <w:t>---------</w:t>
+            </w:r>
+          </w:p>
+        </w:tc>
+      </w:tr>
+      <w:tr>
+        <w:tc>
+          <w:tcPr>
+            <w:tcW w:type="dxa" w:w="5040"/>
+          </w:tcPr>
+          <w:p>
+            <w:r/>
+            <w:r>
+              <w:t>Auto (S11 minimum)</w:t>
+            </w:r>
+          </w:p>
+        </w:tc>
+        <w:tc>
+          <w:tcPr>
+            <w:tcW w:type="dxa" w:w="5040"/>
+          </w:tcPr>
+          <w:p>
+            <w:r/>
+            <w:r>
+              <w:t>eine Frequenz am S11-Tal (bzw. Ziel-Frequenz)</w:t>
+            </w:r>
+          </w:p>
+        </w:tc>
+      </w:tr>
+      <w:tr>
+        <w:tc>
+          <w:tcPr>
+            <w:tcW w:type="dxa" w:w="5040"/>
+          </w:tcPr>
+          <w:p>
+            <w:r/>
+            <w:r>
+              <w:t>N points (mesh range)</w:t>
+            </w:r>
+          </w:p>
+        </w:tc>
+        <w:tc>
+          <w:tcPr>
+            <w:tcW w:type="dxa" w:w="5040"/>
+          </w:tcPr>
+          <w:p>
+            <w:r/>
+            <w:r>
+              <w:t>N Punkte gleichmäßig über den Mesh-Frequenzbereich (start/stop vom Mesh-Tab) — z. B. 11 Punkte von 2,0…2,8 GHz → Kurve *Gain vs Frequency* im Antenna-Tab</w:t>
+            </w:r>
+          </w:p>
+        </w:tc>
+      </w:tr>
+      <w:tr>
+        <w:tc>
+          <w:tcPr>
+            <w:tcW w:type="dxa" w:w="5040"/>
+          </w:tcPr>
+          <w:p>
+            <w:r/>
+            <w:r>
+              <w:t>Frequency list</w:t>
+            </w:r>
+          </w:p>
+        </w:tc>
+        <w:tc>
+          <w:tcPr>
+            <w:tcW w:type="dxa" w:w="5040"/>
+          </w:tcPr>
+          <w:p>
+            <w:r/>
+            <w:r>
+              <w:t>explizite Liste, jeder Eintrag mit Einheit Hz / kHz / MHz / GHz ( nackte Zahl = Hz), z. B. 2.4 GHz, 2.45 GHz, 2500 MHz</w:t>
+            </w:r>
+          </w:p>
+        </w:tc>
+      </w:tr>
+    </w:tbl>
+    <w:p/>
+    <w:tbl>
+      <w:tblPr>
+        <w:tblStyle w:val="TableGrid"/>
+        <w:tblW w:type="auto" w:w="0"/>
+        <w:tblLook w:firstColumn="1" w:firstRow="1" w:lastColumn="0" w:lastRow="0" w:noHBand="0" w:noVBand="1" w:val="04A0"/>
+      </w:tblPr>
+      <w:tblGrid>
+        <w:gridCol w:w="5040"/>
+        <w:gridCol w:w="5040"/>
+      </w:tblGrid>
+      <w:tr>
+        <w:tc>
+          <w:tcPr>
+            <w:tcW w:type="dxa" w:w="5040"/>
+          </w:tcPr>
+          <w:p>
+            <w:r/>
+            <w:r>
+              <w:rPr>
+                <w:b/>
+              </w:rPr>
+              <w:t>-------</w:t>
+            </w:r>
+          </w:p>
+        </w:tc>
+        <w:tc>
+          <w:tcPr>
+            <w:tcW w:type="dxa" w:w="5040"/>
+          </w:tcPr>
+          <w:p>
+            <w:r/>
+            <w:r>
+              <w:rPr>
+                <w:b/>
+              </w:rPr>
+              <w:t>---------</w:t>
+            </w:r>
+          </w:p>
+        </w:tc>
+      </w:tr>
+      <w:tr>
+        <w:tc>
+          <w:tcPr>
+            <w:tcW w:type="dxa" w:w="5040"/>
+          </w:tcPr>
+          <w:p>
+            <w:r/>
+            <w:r>
+              <w:t>Apply</w:t>
+            </w:r>
+          </w:p>
+        </w:tc>
+        <w:tc>
+          <w:tcPr>
+            <w:tcW w:type="dxa" w:w="5040"/>
+          </w:tcPr>
+          <w:p>
+            <w:r/>
+            <w:r>
+              <w:t>Schreibt die Werte ins Projekt, spiegelt sie in das (versteckte) Sim-Params-Panel (Speichern/Build nutzen es) und aktualisiert work/&lt;Projekt&gt;/project_run.py, falls es schon existiert (ein offenes Script-Editor-Fenster lädt die Datei neu, solange dort keine ungesicherten Änderungen sind)</w:t>
+            </w:r>
+          </w:p>
+        </w:tc>
+      </w:tr>
+      <w:tr>
+        <w:tc>
+          <w:tcPr>
+            <w:tcW w:type="dxa" w:w="5040"/>
+          </w:tcPr>
+          <w:p>
+            <w:r/>
+            <w:r>
+              <w:t>Close</w:t>
+            </w:r>
+          </w:p>
+        </w:tc>
+        <w:tc>
+          <w:tcPr>
+            <w:tcW w:type="dxa" w:w="5040"/>
+          </w:tcPr>
+          <w:p>
+            <w:r/>
+            <w:r>
+              <w:t>Verwirft nicht angewandte Änderungen</w:t>
+            </w:r>
+          </w:p>
+        </w:tc>
+      </w:tr>
+    </w:tbl>
+    <w:p/>
+    <w:p>
+      <w:r>
+        <w:t xml:space="preserve">Das Fenster ist </w:t>
+      </w:r>
+      <w:r>
+        <w:rPr>
+          <w:b/>
+        </w:rPr>
+        <w:t>modeless</w:t>
+      </w:r>
+      <w:r>
+        <w:t xml:space="preserve"> — ein zweiter Menüklick bringt dasselbe Fenster</w:t>
+      </w:r>
+    </w:p>
+    <w:p>
+      <w:r>
+        <w:t>nach vorn und synchronisiert es mit dem aktuellen Projekt. Änderungen wirken</w:t>
+      </w:r>
+    </w:p>
+    <w:p>
+      <w:r>
+        <w:t xml:space="preserve">erst nach </w:t>
+      </w:r>
+      <w:r>
+        <w:rPr>
+          <w:b/>
+        </w:rPr>
+        <w:t>Apply</w:t>
+      </w:r>
+      <w:r>
+        <w:t xml:space="preserve">; danach </w:t>
+      </w:r>
+      <w:r>
+        <w:rPr>
+          <w:b/>
+        </w:rPr>
+        <w:t>Build Mesh</w:t>
+      </w:r>
+      <w:r>
+        <w:t>, damit das Netz sie übernimmt.</w:t>
+      </w:r>
+    </w:p>
+    <w:p>
+      <w:r>
+        <w:rPr>
+          <w:b/>
+        </w:rPr>
+        <w:t>Menü → Mesh → Mesh Parameters…</w:t>
+      </w:r>
+      <w:r>
+        <w:t xml:space="preserve"> (oder </w:t>
+      </w:r>
+      <w:r>
+        <w:rPr>
+          <w:b/>
+        </w:rPr>
+        <w:t>Strg+Umschalt+M</w:t>
+      </w:r>
+      <w:r>
+        <w:t>) öffnet ein</w:t>
+      </w:r>
+    </w:p>
+    <w:p>
+      <w:r>
+        <w:t xml:space="preserve">eigenes, verschiebbares Fenster mit </w:t>
+      </w:r>
+      <w:r>
+        <w:rPr>
+          <w:b/>
+        </w:rPr>
+        <w:t>allen</w:t>
+      </w:r>
+      <w:r>
+        <w:t xml:space="preserve"> Mesh-Parametern (preset,</w:t>
+      </w:r>
+    </w:p>
+    <w:p>
+      <w:r>
+        <w:t xml:space="preserve">Zeicheneinheit, f0/fc, start/stop, Air margin). </w:t>
+      </w:r>
+      <w:r>
+        <w:rPr>
+          <w:b/>
+        </w:rPr>
+        <w:t>Apply</w:t>
+      </w:r>
+      <w:r>
+        <w:t xml:space="preserve"> schreibt sie ins</w:t>
+      </w:r>
+    </w:p>
+    <w:p>
+      <w:r>
+        <w:t xml:space="preserve">Projekt und spiegelt sie in die Mesh-Form, </w:t>
+      </w:r>
+      <w:r>
+        <w:rPr>
+          <w:b/>
+        </w:rPr>
+        <w:t>Close</w:t>
+      </w:r>
+      <w:r>
+        <w:t xml:space="preserve"> verwirft nicht</w:t>
+      </w:r>
+    </w:p>
+    <w:p>
+      <w:r>
+        <w:t xml:space="preserve">angewandte Änderungen. Das Fenster ist ebenfalls </w:t>
+      </w:r>
+      <w:r>
+        <w:rPr>
+          <w:b/>
+        </w:rPr>
+        <w:t>modeless</w:t>
+      </w:r>
+      <w:r>
+        <w:t>.</w:t>
+      </w:r>
+    </w:p>
+    <w:p>
+      <w:pPr>
+        <w:pStyle w:val="Heading3"/>
+      </w:pPr>
+      <w:r>
         <w:t>5.1 Mesh / Frequenzen</w:t>
       </w:r>
     </w:p>
     <w:p>
       <w:r>
-        <w:t>Mesh-Tab:</w:t>
+        <w:t>Mesh-Parameter (siehe §5.0):</w:t>
       </w:r>
     </w:p>
     <w:tbl>
@@ -1572,7 +3841,7 @@
           <w:p>
             <w:r/>
             <w:r>
-              <w:t>150000+</w:t>
+              <w:t>25000 (Preset)</w:t>
             </w:r>
           </w:p>
         </w:tc>
@@ -1580,6 +3849,196 @@
     </w:tbl>
     <w:p/>
     <w:p>
+      <w:r>
+        <w:rPr>
+          <w:b/>
+        </w:rPr>
+        <w:t>Koordinaten-Ausrichtung (Standard: an).</w:t>
+      </w:r>
+      <w:r>
+        <w:t xml:space="preserve"> In </w:t>
+      </w:r>
+      <w:r>
+        <w:rPr>
+          <w:i/>
+        </w:rPr>
+        <w:t>Mesh Parameters</w:t>
+      </w:r>
+      <w:r>
+        <w:t xml:space="preserve"> steht</w:t>
+      </w:r>
+    </w:p>
+    <w:p>
+      <w:r>
+        <w:t xml:space="preserve">„Align coordinates (float32 grid)". Damit liegen </w:t>
+      </w:r>
+      <w:r>
+        <w:rPr>
+          <w:b/>
+        </w:rPr>
+        <w:t>alle</w:t>
+      </w:r>
+      <w:r>
+        <w:t xml:space="preserve"> Geometriekoordinaten</w:t>
+      </w:r>
+    </w:p>
+    <w:p>
+      <w:r>
+        <w:t>auf demselben float32-Raster, auf dem CSXCAD Boxen/Ports/Dumps speichert — auch</w:t>
+      </w:r>
+    </w:p>
+    <w:p>
+      <w:r>
+        <w:t>die Dreiecksnetze aus STEP/STL/FCStd. Ein Vertex und eine Boxfläche, die gleich</w:t>
+      </w:r>
+    </w:p>
+    <w:p>
+      <w:r>
+        <w:t>sein sollen, sind dann bit-identisch (kein zweiter Gitterpunkt, keine</w:t>
+      </w:r>
+    </w:p>
+    <w:p>
+      <w:r>
+        <w:t>Sliver-Zelle, die den Zeitschritt kollabieren lässt). Ausschalten stellt das</w:t>
+      </w:r>
+    </w:p>
+    <w:p>
+      <w:r>
+        <w:t>alte Verhalten wieder her (Dreiecksnetze werden dezimal auf 0,1 µm gerundet);</w:t>
+      </w:r>
+    </w:p>
+    <w:p>
+      <w:r>
+        <w:t xml:space="preserve">das ist nur für A/B-Vergleiche sinnvoll. Bereits gespeicherte </w:t>
+      </w:r>
+      <w:r>
+        <w:rPr>
+          <w:rFonts w:ascii="Consolas" w:hAnsi="Consolas"/>
+          <w:sz w:val="18"/>
+        </w:rPr>
+        <w:t>.npy</w:t>
+      </w:r>
+      <w:r>
+        <w:t>-Netze</w:t>
+      </w:r>
+    </w:p>
+    <w:p>
+      <w:r>
+        <w:t>behalten ihre alte Rundung, bis sie neu importiert werden.</w:t>
+      </w:r>
+    </w:p>
+    <w:p>
+      <w:r>
+        <w:rPr>
+          <w:b/>
+        </w:rPr>
+        <w:t>Zuordnung zu feiner Zellen (P2, Standard: an).</w:t>
+      </w:r>
+      <w:r>
+        <w:t xml:space="preserve"> Die Checkbox „Attribute fine</w:t>
+      </w:r>
+    </w:p>
+    <w:p>
+      <w:r>
+        <w:t>cells to their source" schreibt an jede vom Mesh-Bericht beanstandete Zelle die</w:t>
+      </w:r>
+    </w:p>
+    <w:p>
+      <w:r>
+        <w:t xml:space="preserve">Geometrie, die sie erzwingt (z. B. </w:t>
+      </w:r>
+      <w:r>
+        <w:rPr>
+          <w:rFonts w:ascii="Consolas" w:hAnsi="Consolas"/>
+          <w:sz w:val="18"/>
+        </w:rPr>
+        <w:t>box:feed + manual</w:t>
+      </w:r>
+      <w:r>
+        <w:t>) — sichtbar in den Marken</w:t>
+      </w:r>
+    </w:p>
+    <w:p>
+      <w:r>
+        <w:t>des Mesh-Viewers und im Bericht unter „Fine-cell sources". Zellen ohne</w:t>
+      </w:r>
+    </w:p>
+    <w:p>
+      <w:r>
+        <w:t>Autoren-Quelle stammen aus easyMesh selbst (Kreis-/Bogenerkennung, Grading,</w:t>
+      </w:r>
+    </w:p>
+    <w:p>
+      <w:r>
+        <w:t>PML-Übergang).</w:t>
+      </w:r>
+    </w:p>
+    <w:p>
+      <w:r>
+        <w:rPr>
+          <w:b/>
+        </w:rPr>
+        <w:t>Kritische Zellen im Mesh-Viewer (Standard: aus).</w:t>
+      </w:r>
+      <w:r>
+        <w:t xml:space="preserve"> Rechtsklick →</w:t>
+      </w:r>
+    </w:p>
+    <w:p>
+      <w:r>
+        <w:t>„Mark critical cells (N)" blendet die Zellen ein, die Laufzeit kosten: die</w:t>
+      </w:r>
+    </w:p>
+    <w:p>
+      <w:r>
+        <w:t>kleinsten Zellen jeder Achse (sie setzen den Zeitschritt), Zellen unter der</w:t>
+      </w:r>
+    </w:p>
+    <w:p>
+      <w:r>
+        <w:t>geforderten Mindestgröße und — nach einem Lauf — die Zelle, die der Solver als</w:t>
+      </w:r>
+    </w:p>
+    <w:p>
+      <w:r>
+        <w:t>kleinsten Zeitschritt meldet. Sie erscheinen als gestrichelte Umrisse in den</w:t>
+      </w:r>
+    </w:p>
+    <w:p>
+      <w:r>
+        <w:t xml:space="preserve">Schnitten (das Netz bleibt sichtbar) und als Bänder in den </w:t>
+      </w:r>
+      <w:r>
+        <w:rPr>
+          <w:i/>
+        </w:rPr>
+        <w:t>Cell sizes</w:t>
+      </w:r>
+      <w:r>
+        <w:t>-Plots;</w:t>
+      </w:r>
+    </w:p>
+    <w:p>
+      <w:r>
+        <w:t>zusammenhängende Zellen werden zu einer Region zusammengefasst. Grading-Sprünge</w:t>
+      </w:r>
+    </w:p>
+    <w:p>
+      <w:r>
+        <w:t>und zu große Zellen stehen weiterhin nur im Mesh-Bericht. Die Marken werden</w:t>
+      </w:r>
+    </w:p>
+    <w:p>
+      <w:r>
+        <w:t>immer berechnet, aber erst auf Wunsch gezeichnet; die Zahl im Menüeintrag sagt</w:t>
+      </w:r>
+    </w:p>
+    <w:p>
+      <w:r>
+        <w:t>vorher, ob es etwas zu sehen gibt.</w:t>
+      </w:r>
+    </w:p>
+    <w:p>
       <w:pPr>
         <w:pStyle w:val="Heading3"/>
       </w:pPr>
@@ -1822,6 +4281,38 @@
       </w:r>
     </w:p>
     <w:p>
+      <w:r>
+        <w:rPr>
+          <w:b/>
+        </w:rPr>
+        <w:t>Alternativ (FreeCAD):</w:t>
+      </w:r>
+      <w:r>
+        <w:t xml:space="preserve"> Ports als </w:t>
+      </w:r>
+      <w:r>
+        <w:rPr>
+          <w:rFonts w:ascii="Consolas" w:hAnsi="Consolas"/>
+          <w:sz w:val="18"/>
+        </w:rPr>
+        <w:t>PORT_*</w:t>
+      </w:r>
+      <w:r>
+        <w:t>-Punkte im FCStd markieren — dann erscheinen sie beim Import automatisch.</w:t>
+      </w:r>
+    </w:p>
+    <w:p>
+      <w:r>
+        <w:t xml:space="preserve">→ </w:t>
+      </w:r>
+      <w:r>
+        <w:rPr>
+          <w:b/>
+        </w:rPr>
+        <w:t>[docs/FREECAD_PORTS_DE.md](FREECAD_PORTS_DE.md)</w:t>
+      </w:r>
+    </w:p>
+    <w:p>
       <w:pPr>
         <w:pStyle w:val="Heading3"/>
       </w:pPr>
@@ -1898,6 +4389,91 @@
     </w:p>
     <w:p>
       <w:pPr>
+        <w:pStyle w:val="ListNumber"/>
+      </w:pPr>
+      <w:r>
+        <w:rPr>
+          <w:b/>
+        </w:rPr>
+        <w:t>Evaluation frequencies</w:t>
+      </w:r>
+      <w:r>
+        <w:t xml:space="preserve"> wählen (Sim Params → NF2FF-Tab, siehe §5.0):</w:t>
+      </w:r>
+    </w:p>
+    <w:p>
+      <w:r>
+        <w:rPr>
+          <w:i/>
+        </w:rPr>
+        <w:t>Auto</w:t>
+      </w:r>
+      <w:r>
+        <w:t xml:space="preserve"> (eine Frequenz am S11-Minimum), </w:t>
+      </w:r>
+      <w:r>
+        <w:rPr>
+          <w:i/>
+        </w:rPr>
+        <w:t>N points</w:t>
+      </w:r>
+      <w:r>
+        <w:t xml:space="preserve"> (Kurve Gain vs Frequency)</w:t>
+      </w:r>
+    </w:p>
+    <w:p>
+      <w:r>
+        <w:t xml:space="preserve">oder eine explizite Liste mit Einheiten (z. B. </w:t>
+      </w:r>
+      <w:r>
+        <w:rPr>
+          <w:rFonts w:ascii="Consolas" w:hAnsi="Consolas"/>
+          <w:sz w:val="18"/>
+        </w:rPr>
+        <w:t>2.4 GHz, 2.45 GHz</w:t>
+      </w:r>
+      <w:r>
+        <w:t>).</w:t>
+      </w:r>
+    </w:p>
+    <w:p>
+      <w:pPr>
+        <w:pStyle w:val="ListNumber"/>
+      </w:pPr>
+      <w:r>
+        <w:t xml:space="preserve">Der </w:t>
+      </w:r>
+      <w:r>
+        <w:rPr>
+          <w:b/>
+        </w:rPr>
+        <w:t>Mesh Viewer</w:t>
+      </w:r>
+      <w:r>
+        <w:t xml:space="preserve"> zeigt die neue Box sofort an (violette strich-punkt Linie) —</w:t>
+      </w:r>
+    </w:p>
+    <w:p>
+      <w:r>
+        <w:t>vorausgesetzt, das Mesh wurde bereits gebaut; die schwarze gestrichelte Linie ist</w:t>
+      </w:r>
+    </w:p>
+    <w:p>
+      <w:r>
+        <w:t xml:space="preserve">die Simulationsdomain und ändert sich erst beim nächsten </w:t>
+      </w:r>
+      <w:r>
+        <w:rPr>
+          <w:b/>
+        </w:rPr>
+        <w:t>Build Mesh</w:t>
+      </w:r>
+      <w:r>
+        <w:t>.</w:t>
+      </w:r>
+    </w:p>
+    <w:p>
+      <w:pPr>
         <w:pStyle w:val="Heading3"/>
       </w:pPr>
       <w:r>
@@ -1923,6 +4499,299 @@
       </w:r>
     </w:p>
     <w:p>
+      <w:pPr>
+        <w:pStyle w:val="Heading3"/>
+      </w:pPr>
+      <w:r>
+        <w:t>5.6 Domain-Größe (schwarzer Rahmen im Mesh Viewer)</w:t>
+      </w:r>
+    </w:p>
+    <w:p>
+      <w:r>
+        <w:t>Die Domain lässt sich nicht direkt bearbeiten — sie ergibt sich aus **Geometrie +</w:t>
+      </w:r>
+    </w:p>
+    <w:p>
+      <w:r>
+        <w:t>Air-Margin + Gitterrundung**. Hebel:</w:t>
+      </w:r>
+    </w:p>
+    <w:tbl>
+      <w:tblPr>
+        <w:tblStyle w:val="TableGrid"/>
+        <w:tblW w:type="auto" w:w="0"/>
+        <w:tblLook w:firstColumn="1" w:firstRow="1" w:lastColumn="0" w:lastRow="0" w:noHBand="0" w:noVBand="1" w:val="04A0"/>
+      </w:tblPr>
+      <w:tblGrid>
+        <w:gridCol w:w="5040"/>
+        <w:gridCol w:w="5040"/>
+      </w:tblGrid>
+      <w:tr>
+        <w:tc>
+          <w:tcPr>
+            <w:tcW w:type="dxa" w:w="5040"/>
+          </w:tcPr>
+          <w:p>
+            <w:r/>
+            <w:r>
+              <w:rPr>
+                <w:b/>
+              </w:rPr>
+              <w:t>-------</w:t>
+            </w:r>
+          </w:p>
+        </w:tc>
+        <w:tc>
+          <w:tcPr>
+            <w:tcW w:type="dxa" w:w="5040"/>
+          </w:tcPr>
+          <w:p>
+            <w:r/>
+            <w:r>
+              <w:rPr>
+                <w:b/>
+              </w:rPr>
+              <w:t>---------</w:t>
+            </w:r>
+          </w:p>
+        </w:tc>
+      </w:tr>
+      <w:tr>
+        <w:tc>
+          <w:tcPr>
+            <w:tcW w:type="dxa" w:w="5040"/>
+          </w:tcPr>
+          <w:p>
+            <w:r/>
+            <w:r>
+              <w:t>Air margin auto (Sim Params → Boundary conditions)</w:t>
+            </w:r>
+          </w:p>
+        </w:tc>
+        <w:tc>
+          <w:tcPr>
+            <w:tcW w:type="dxa" w:w="5040"/>
+          </w:tcPr>
+          <w:p>
+            <w:r/>
+            <w:r>
+              <w:t>λ/4 bei Stop-Frequenz, immer εr=1 (bei 2,7 GHz = 27,76 mm pro Fläche). Wer die Stop-Frequenz ändert, ändert damit ebenfalls das Margin</w:t>
+            </w:r>
+          </w:p>
+        </w:tc>
+      </w:tr>
+      <w:tr>
+        <w:tc>
+          <w:tcPr>
+            <w:tcW w:type="dxa" w:w="5040"/>
+          </w:tcPr>
+          <w:p>
+            <w:r/>
+            <w:r>
+              <w:t>Air margin (all faces)</w:t>
+            </w:r>
+          </w:p>
+        </w:tc>
+        <w:tc>
+          <w:tcPr>
+            <w:tcW w:type="dxa" w:w="5040"/>
+          </w:tcPr>
+          <w:p>
+            <w:r/>
+            <w:r>
+              <w:t>Auto aus → fester Wert in mm für alle 6 Flächen. In der Projekt-JSON als 6er-Liste boundary.air_margin = [xmin,xmax,ymin,ymax,zmin,zmax] pro Fläche einstellbar (die GUI schreibt allen denselben Wert)</w:t>
+            </w:r>
+          </w:p>
+        </w:tc>
+      </w:tr>
+      <w:tr>
+        <w:tc>
+          <w:tcPr>
+            <w:tcW w:type="dxa" w:w="5040"/>
+          </w:tcPr>
+          <w:p>
+            <w:r/>
+            <w:r>
+              <w:t>Geometrie</w:t>
+            </w:r>
+          </w:p>
+        </w:tc>
+        <w:tc>
+          <w:tcPr>
+            <w:tcW w:type="dxa" w:w="5040"/>
+          </w:tcPr>
+          <w:p>
+            <w:r/>
+            <w:r>
+              <w:t>Domain = Geometrie-BBox + Margin (easyMesh boundary_distance)</w:t>
+            </w:r>
+          </w:p>
+        </w:tc>
+      </w:tr>
+      <w:tr>
+        <w:tc>
+          <w:tcPr>
+            <w:tcW w:type="dxa" w:w="5040"/>
+          </w:tcPr>
+          <w:p>
+            <w:r/>
+            <w:r>
+              <w:t>PML size</w:t>
+            </w:r>
+          </w:p>
+        </w:tc>
+        <w:tc>
+          <w:tcPr>
+            <w:tcW w:type="dxa" w:w="5040"/>
+          </w:tcPr>
+          <w:p>
+            <w:r/>
+            <w:r>
+              <w:t>pro PML-Fläche hängt easyMesh PML_size + 1 Zellen außerhalb an → Domain größer. Wirkung nur bei Boundary = PML; bei MUR ohne Effekt</w:t>
+            </w:r>
+          </w:p>
+        </w:tc>
+      </w:tr>
+      <w:tr>
+        <w:tc>
+          <w:tcPr>
+            <w:tcW w:type="dxa" w:w="5040"/>
+          </w:tcPr>
+          <w:p>
+            <w:r/>
+            <w:r>
+              <w:t>Mesh-Preset / min cell size</w:t>
+            </w:r>
+          </w:p>
+        </w:tc>
+        <w:tc>
+          <w:tcPr>
+            <w:tcW w:type="dxa" w:w="5040"/>
+          </w:tcPr>
+          <w:p>
+            <w:r/>
+            <w:r>
+              <w:t>Luftzellen wachsen bis λ/10…λ/40 je Preset (max_cellsize_air) → die äußere Gitterlinie wird darauf gerundet: Abweichung um wenige mm, pro Seite leicht unterschiedlich (das ist die kleine Asymmetrie der schwarzen Linie)</w:t>
+            </w:r>
+          </w:p>
+        </w:tc>
+      </w:tr>
+    </w:tbl>
+    <w:p/>
+    <w:p>
+      <w:r>
+        <w:rPr>
+          <w:b/>
+        </w:rPr>
+        <w:t>Ablauf:</w:t>
+      </w:r>
+      <w:r>
+        <w:t xml:space="preserve"> Werte ändern → </w:t>
+      </w:r>
+      <w:r>
+        <w:rPr>
+          <w:b/>
+        </w:rPr>
+        <w:t>Build Mesh</w:t>
+      </w:r>
+      <w:r>
+        <w:t xml:space="preserve"> (schwarze Linie aktualisiert sich) →</w:t>
+      </w:r>
+    </w:p>
+    <w:p>
+      <w:r>
+        <w:rPr>
+          <w:b/>
+        </w:rPr>
+        <w:t>Fit NF2FF to Geometry</w:t>
+      </w:r>
+      <w:r>
+        <w:t>, damit die violette Box innerhalb bleibt. Das Ergebnis</w:t>
+      </w:r>
+    </w:p>
+    <w:p>
+      <w:r>
+        <w:t xml:space="preserve">steht im Info-Panel des Viewers als </w:t>
+      </w:r>
+      <w:r>
+        <w:rPr>
+          <w:i/>
+        </w:rPr>
+        <w:t>Domain size</w:t>
+      </w:r>
+      <w:r>
+        <w:t>.</w:t>
+      </w:r>
+    </w:p>
+    <w:p>
+      <w:r>
+        <w:rPr>
+          <w:b/>
+        </w:rPr>
+        <w:t>Grenzen:</w:t>
+      </w:r>
+      <w:r>
+        <w:t xml:space="preserve"> zu klein → Warnung </w:t>
+      </w:r>
+      <w:r>
+        <w:rPr>
+          <w:rFonts w:ascii="Consolas" w:hAnsi="Consolas"/>
+          <w:sz w:val="18"/>
+        </w:rPr>
+        <w:t>outside the field domain</w:t>
+      </w:r>
+      <w:r>
+        <w:t>, NF2FF/Dumps werden</w:t>
+      </w:r>
+    </w:p>
+    <w:p>
+      <w:r>
+        <w:t>geklemmt oder deaktiviert; zu groß → deutlich mehr Zellen (RAM/Laufzeit).</w:t>
+      </w:r>
+    </w:p>
+    <w:p>
+      <w:r>
+        <w:t>Geometrie, die über die schwarze Linie hinausragt, meldet der Validator als</w:t>
+      </w:r>
+    </w:p>
+    <w:p>
+      <w:r>
+        <w:rPr>
+          <w:rFonts w:ascii="Consolas" w:hAnsi="Consolas"/>
+          <w:sz w:val="18"/>
+        </w:rPr>
+        <w:t>primitive_outside_domain</w:t>
+      </w:r>
+      <w:r>
+        <w:t xml:space="preserve"> (</w:t>
+      </w:r>
+      <w:r>
+        <w:rPr>
+          <w:b/>
+        </w:rPr>
+        <w:t>error</w:t>
+      </w:r>
+      <w:r>
+        <w:t>, blockiert den Lauf; Dumps/Probes nur als</w:t>
+      </w:r>
+    </w:p>
+    <w:p>
+      <w:r>
+        <w:t>Warning) — der Mesh Viewer umrahmt solche Primitive rot und schreibt</w:t>
+      </w:r>
+    </w:p>
+    <w:p>
+      <w:r>
+        <w:rPr>
+          <w:i/>
+        </w:rPr>
+        <w:t>OUTSIDE DOMAIN</w:t>
+      </w:r>
+      <w:r>
+        <w:t xml:space="preserve"> in die Übersicht.</w:t>
+      </w:r>
+    </w:p>
+    <w:p>
       <w:r>
         <w:t>────────────────────────────────────────────────────────────</w:t>
       </w:r>
@@ -2014,6 +4883,113 @@
         <w:pStyle w:val="ListNumber"/>
       </w:pPr>
       <w:r>
+        <w:rPr>
+          <w:b/>
+        </w:rPr>
+        <w:t>Script…</w:t>
+      </w:r>
+      <w:r>
+        <w:t xml:space="preserve"> (Simulation-Menü) — </w:t>
+      </w:r>
+      <w:r>
+        <w:rPr>
+          <w:rFonts w:ascii="Consolas" w:hAnsi="Consolas"/>
+          <w:sz w:val="18"/>
+        </w:rPr>
+        <w:t>project_run.py</w:t>
+      </w:r>
+      <w:r>
+        <w:t xml:space="preserve"> ansehen und bearbeiten</w:t>
+      </w:r>
+    </w:p>
+    <w:p>
+      <w:pPr>
+        <w:pStyle w:val="ListBullet"/>
+      </w:pPr>
+      <w:r>
+        <w:t>Das Skript ist das, was openEMS wirklich ausführt (Pfade, Mesh, Ports, Export)</w:t>
+      </w:r>
+    </w:p>
+    <w:p>
+      <w:pPr>
+        <w:pStyle w:val="ListBullet"/>
+      </w:pPr>
+      <w:r>
+        <w:rPr>
+          <w:b/>
+        </w:rPr>
+        <w:t>Save</w:t>
+      </w:r>
+      <w:r>
+        <w:t xml:space="preserve"> / </w:t>
+      </w:r>
+      <w:r>
+        <w:rPr>
+          <w:b/>
+        </w:rPr>
+        <w:t>Revert</w:t>
+      </w:r>
+      <w:r>
+        <w:t xml:space="preserve"> / </w:t>
+      </w:r>
+      <w:r>
+        <w:rPr>
+          <w:b/>
+        </w:rPr>
+        <w:t>Regenerate from project</w:t>
+      </w:r>
+    </w:p>
+    <w:p>
+      <w:pPr>
+        <w:pStyle w:val="ListBullet"/>
+      </w:pPr>
+      <w:r>
+        <w:rPr>
+          <w:b/>
+        </w:rPr>
+        <w:t>Run Simulation</w:t>
+      </w:r>
+      <w:r>
+        <w:t xml:space="preserve"> erzeugt das Skript neu; eigene Änderungen werden vorher nach</w:t>
+      </w:r>
+    </w:p>
+    <w:p>
+      <w:r>
+        <w:rPr>
+          <w:rFonts w:ascii="Consolas" w:hAnsi="Consolas"/>
+          <w:sz w:val="18"/>
+        </w:rPr>
+        <w:t>project_run_edited.py</w:t>
+      </w:r>
+      <w:r>
+        <w:t xml:space="preserve"> gesichert — die GUI fragt, ob neu erzeugt oder dein</w:t>
+      </w:r>
+    </w:p>
+    <w:p>
+      <w:r>
+        <w:t>bearbeitetes Skript so wie es ist ausgeführt werden soll</w:t>
+      </w:r>
+    </w:p>
+    <w:p>
+      <w:pPr>
+        <w:pStyle w:val="ListBullet"/>
+      </w:pPr>
+      <w:r>
+        <w:t xml:space="preserve">Manuell: </w:t>
+      </w:r>
+      <w:r>
+        <w:rPr>
+          <w:rFonts w:ascii="Consolas" w:hAnsi="Consolas"/>
+          <w:sz w:val="18"/>
+        </w:rPr>
+        <w:t>&lt;python&gt; work\&lt;Projektname&gt;\project_run.py</w:t>
+      </w:r>
+    </w:p>
+    <w:p>
+      <w:pPr>
+        <w:pStyle w:val="ListNumber"/>
+      </w:pPr>
+      <w:r>
         <w:t xml:space="preserve">Ergebnis-Dateien unter </w:t>
       </w:r>
       <w:r>
@@ -2024,7 +5000,7 @@
         <w:t>work\&lt;Projektname&gt;\</w:t>
       </w:r>
       <w:r>
-        <w:t xml:space="preserve"> (u. a. </w:t>
+        <w:t xml:space="preserve"> (u. a. </w:t>
       </w:r>
       <w:r>
         <w:rPr>
@@ -2038,6 +5014,234 @@
       </w:r>
     </w:p>
     <w:p>
+      <w:pPr>
+        <w:pStyle w:val="Heading3"/>
+      </w:pPr>
+      <w:r>
+        <w:t>6.1 Mesh- und Simulationsdiagnose</w:t>
+      </w:r>
+    </w:p>
+    <w:p>
+      <w:r>
+        <w:t>Zwei Berichte beantworten die Frage „ist dieser Lauf belastbar?" – noch bevor</w:t>
+      </w:r>
+    </w:p>
+    <w:p>
+      <w:r>
+        <w:t>bzw. nachdem der Solver gelaufen ist:</w:t>
+      </w:r>
+    </w:p>
+    <w:p>
+      <w:pPr>
+        <w:pStyle w:val="ListBullet"/>
+      </w:pPr>
+      <w:r>
+        <w:rPr>
+          <w:b/>
+        </w:rPr>
+        <w:t>Mesh ➤ Mesh Timing / Feasibility…</w:t>
+      </w:r>
+      <w:r>
+        <w:t xml:space="preserve"> (Inhalt steht direkt nach </w:t>
+      </w:r>
+      <w:r>
+        <w:rPr>
+          <w:i/>
+        </w:rPr>
+        <w:t>Build Mesh</w:t>
+      </w:r>
+    </w:p>
+    <w:p>
+      <w:r>
+        <w:t xml:space="preserve">auch im Tab </w:t>
+      </w:r>
+      <w:r>
+        <w:rPr>
+          <w:b/>
+        </w:rPr>
+        <w:t>Mesh Report</w:t>
+      </w:r>
+      <w:r>
+        <w:t xml:space="preserve"> und als eine Zeile im Log): kleinste Zelle je</w:t>
+      </w:r>
+    </w:p>
+    <w:p>
+      <w:r>
+        <w:t xml:space="preserve">Achse und das daraus folgende </w:t>
+      </w:r>
+      <w:r>
+        <w:rPr>
+          <w:rFonts w:ascii="Consolas" w:hAnsi="Consolas"/>
+          <w:sz w:val="18"/>
+        </w:rPr>
+        <w:t>dt</w:t>
+      </w:r>
+      <w:r>
+        <w:t xml:space="preserve"> (Courant-Grenze im Vakuum plus untere</w:t>
+      </w:r>
+    </w:p>
+    <w:p>
+      <w:r>
+        <w:t>Schranke durch das dichteste Dielektrikum), Zellen pro Wellenlänge bei</w:t>
+      </w:r>
+    </w:p>
+    <w:p>
+      <w:r>
+        <w:rPr>
+          <w:rFonts w:ascii="Consolas" w:hAnsi="Consolas"/>
+          <w:sz w:val="18"/>
+        </w:rPr>
+        <w:t>f_max</w:t>
+      </w:r>
+      <w:r>
+        <w:t>, der Laufzeit-Faktor einer überfeinerten Zelle gegenüber einer</w:t>
+      </w:r>
+    </w:p>
+    <w:p>
+      <w:r>
+        <w:t>typischen Zelle, die Timesteps für einen Durchlauf durch das Gebiet und die</w:t>
+      </w:r>
+    </w:p>
+    <w:p>
+      <w:r>
+        <w:t xml:space="preserve">Frequenzauflösung </w:t>
+      </w:r>
+      <w:r>
+        <w:rPr>
+          <w:rFonts w:ascii="Consolas" w:hAnsi="Consolas"/>
+          <w:sz w:val="18"/>
+        </w:rPr>
+        <w:t>1/(max_timesteps·dt)</w:t>
+      </w:r>
+      <w:r>
+        <w:t xml:space="preserve"> im Verhältnis zum eingestellten</w:t>
+      </w:r>
+    </w:p>
+    <w:p>
+      <w:r>
+        <w:t>Sweep-Raster. Jede Warnung nennt die konkrete Abhilfe (z. B. „max_timesteps</w:t>
+      </w:r>
+    </w:p>
+    <w:p>
+      <w:r>
+        <w:t>auf ≥ 389 000 erhöhen" oder welche Zelle zu grob ist).</w:t>
+      </w:r>
+    </w:p>
+    <w:p>
+      <w:pPr>
+        <w:pStyle w:val="ListBullet"/>
+      </w:pPr>
+      <w:r>
+        <w:rPr>
+          <w:b/>
+        </w:rPr>
+        <w:t>Simulation ➤ Simulation Status…</w:t>
+      </w:r>
+      <w:r>
+        <w:t xml:space="preserve"> (nach jedem Lauf, erfolgreich oder nicht;</w:t>
+      </w:r>
+    </w:p>
+    <w:p>
+      <w:r>
+        <w:t>derselbe Block wird an das Ende des Logs angehängt): Fehler und Warnungen aus</w:t>
+      </w:r>
+    </w:p>
+    <w:p>
+      <w:r>
+        <w:t>dem Solver-Log – einschließlich der Mesh-Validierung von vor dem Lauf –,</w:t>
+      </w:r>
+    </w:p>
+    <w:p>
+      <w:r>
+        <w:t>Konvergenz (Endkriterium erreicht oder max. Timesteps), die exakten</w:t>
+      </w:r>
+    </w:p>
+    <w:p>
+      <w:r>
+        <w:t>Engine-Werte (</w:t>
+      </w:r>
+      <w:r>
+        <w:rPr>
+          <w:rFonts w:ascii="Consolas" w:hAnsi="Consolas"/>
+          <w:sz w:val="18"/>
+        </w:rPr>
+        <w:t>dt</w:t>
+      </w:r>
+      <w:r>
+        <w:t>, Nyquist-Rate, Anregungslänge, Operator-/Feldgröße,</w:t>
+      </w:r>
+    </w:p>
+    <w:p>
+      <w:r>
+        <w:t>Schritte/Energie/Geschwindigkeit), der Abgleich der Mesh-Schätzung gegen den</w:t>
+      </w:r>
+    </w:p>
+    <w:p>
+      <w:r>
+        <w:t>Engine-Wert, die tatsächliche Auflösung des DFT-Fensters und die Passivität</w:t>
+      </w:r>
+    </w:p>
+    <w:p>
+      <w:r>
+        <w:t>der S-Parameter (</w:t>
+      </w:r>
+      <w:r>
+        <w:rPr>
+          <w:rFonts w:ascii="Consolas" w:hAnsi="Consolas"/>
+          <w:sz w:val="18"/>
+        </w:rPr>
+        <w:t>|S11|²+|S21|² ≤ 1</w:t>
+      </w:r>
+      <w:r>
+        <w:t>) über der Frequenz – getrennt nach</w:t>
+      </w:r>
+    </w:p>
+    <w:p>
+      <w:r>
+        <w:t>Kernband und Sweep-Rand (eine Überschreitung nur am Rand ist ein</w:t>
+      </w:r>
+    </w:p>
+    <w:p>
+      <w:r>
+        <w:t>DFT-Fensterartefakt und harmlos). Am Ende steht ein Fazit</w:t>
+      </w:r>
+    </w:p>
+    <w:p>
+      <w:r>
+        <w:t>(</w:t>
+      </w:r>
+      <w:r>
+        <w:rPr>
+          <w:rFonts w:ascii="Consolas" w:hAnsi="Consolas"/>
+          <w:sz w:val="18"/>
+        </w:rPr>
+        <w:t>OK</w:t>
+      </w:r>
+      <w:r>
+        <w:t xml:space="preserve"> / </w:t>
+      </w:r>
+      <w:r>
+        <w:rPr>
+          <w:rFonts w:ascii="Consolas" w:hAnsi="Consolas"/>
+          <w:sz w:val="18"/>
+        </w:rPr>
+        <w:t>WARNING</w:t>
+      </w:r>
+      <w:r>
+        <w:t xml:space="preserve"> / </w:t>
+      </w:r>
+      <w:r>
+        <w:rPr>
+          <w:rFonts w:ascii="Consolas" w:hAnsi="Consolas"/>
+          <w:sz w:val="18"/>
+        </w:rPr>
+        <w:t>ERROR</w:t>
+      </w:r>
+      <w:r>
+        <w:t>) mit „Trust: reliable / use with care / unusable".</w:t>
+      </w:r>
+    </w:p>
+    <w:p>
       <w:r>
         <w:t>────────────────────────────────────────────────────────────</w:t>
       </w:r>
@@ -2104,7 +5308,234 @@
         <w:pStyle w:val="ListNumber"/>
       </w:pPr>
       <w:r>
-        <w:t>Field-Dumps / NF2FF: je nach Projekt in den Tabs / Logs</w:t>
+        <w:rPr>
+          <w:b/>
+        </w:rPr>
+        <w:t>Antenna</w:t>
+      </w:r>
+      <w:r>
+        <w:t xml:space="preserve">-Tab / </w:t>
+      </w:r>
+      <w:r>
+        <w:rPr>
+          <w:b/>
+        </w:rPr>
+        <w:t>Simulation → Antenna Pattern Viewer</w:t>
+      </w:r>
+      <w:r>
+        <w:t xml:space="preserve"> — NF2FF-Fernfeld:</w:t>
+      </w:r>
+    </w:p>
+    <w:p>
+      <w:r>
+        <w:t>3D-Polar des Gewinns, 2D-Polarschnitte (E/H-Ebene), Direktivität/Gain/η</w:t>
+      </w:r>
+    </w:p>
+    <w:p>
+      <w:r>
+        <w:t xml:space="preserve">über Frequenz; </w:t>
+      </w:r>
+      <w:r>
+        <w:rPr>
+          <w:b/>
+        </w:rPr>
+        <w:t>Pop-out Antenna Graph</w:t>
+      </w:r>
+      <w:r>
+        <w:t xml:space="preserve"> = Extra-Fenster; Feld-Dumps</w:t>
+      </w:r>
+    </w:p>
+    <w:p>
+      <w:r>
+        <w:t xml:space="preserve">weiterhin unter </w:t>
+      </w:r>
+      <w:r>
+        <w:rPr>
+          <w:rFonts w:ascii="Consolas" w:hAnsi="Consolas"/>
+          <w:sz w:val="18"/>
+        </w:rPr>
+        <w:t>work/&lt;projekt&gt;/fields/</w:t>
+      </w:r>
+      <w:r>
+        <w:t xml:space="preserve"> (S-Parameter in</w:t>
+      </w:r>
+    </w:p>
+    <w:p>
+      <w:r>
+        <w:rPr>
+          <w:rFonts w:ascii="Consolas" w:hAnsi="Consolas"/>
+          <w:sz w:val="18"/>
+        </w:rPr>
+        <w:t>work/&lt;projekt&gt;/sparams/</w:t>
+      </w:r>
+      <w:r>
+        <w:t xml:space="preserve">, NF2FF in </w:t>
+      </w:r>
+      <w:r>
+        <w:rPr>
+          <w:rFonts w:ascii="Consolas" w:hAnsi="Consolas"/>
+          <w:sz w:val="18"/>
+        </w:rPr>
+        <w:t>work/&lt;projekt&gt;/nf2ff/</w:t>
+      </w:r>
+      <w:r>
+        <w:t>)</w:t>
+      </w:r>
+    </w:p>
+    <w:p>
+      <w:pPr>
+        <w:pStyle w:val="ListNumber"/>
+      </w:pPr>
+      <w:r>
+        <w:rPr>
+          <w:b/>
+        </w:rPr>
+        <w:t>2-Port (S2P)</w:t>
+      </w:r>
+      <w:r>
+        <w:t xml:space="preserve"> — ein FDTD-Lauf misst </w:t>
+      </w:r>
+      <w:r>
+        <w:rPr>
+          <w:b/>
+        </w:rPr>
+        <w:t>eine</w:t>
+      </w:r>
+      <w:r>
+        <w:t xml:space="preserve"> Spalte der S-Matrix (für 2 Ports:</w:t>
+      </w:r>
+    </w:p>
+    <w:p>
+      <w:r>
+        <w:t>S11 + S21). Weitere Spalten brauchen weitere Läufe mit anderem erregtem Port</w:t>
+      </w:r>
+    </w:p>
+    <w:p>
+      <w:r>
+        <w:t>(</w:t>
+      </w:r>
+      <w:r>
+        <w:rPr>
+          <w:rFonts w:ascii="Consolas" w:hAnsi="Consolas"/>
+          <w:sz w:val="18"/>
+        </w:rPr>
+        <w:t>excite_port</w:t>
+      </w:r>
+      <w:r>
+        <w:t xml:space="preserve"> umschalten); die JSON-Ergebnisse werden danach zusammengeführt —</w:t>
+      </w:r>
+    </w:p>
+    <w:p>
+      <w:r>
+        <w:t xml:space="preserve">Beispiel: </w:t>
+      </w:r>
+      <w:r>
+        <w:rPr>
+          <w:rFonts w:ascii="Consolas" w:hAnsi="Consolas"/>
+          <w:sz w:val="18"/>
+        </w:rPr>
+        <w:t>examples\run_pcb_filter_example.py</w:t>
+      </w:r>
+      <w:r>
+        <w:t>.</w:t>
+      </w:r>
+    </w:p>
+    <w:p>
+      <w:r>
+        <w:t xml:space="preserve">Nicht gemessene Einträge bleiben leer (NaN) in </w:t>
+      </w:r>
+      <w:r>
+        <w:rPr>
+          <w:rFonts w:ascii="Consolas" w:hAnsi="Consolas"/>
+          <w:sz w:val="18"/>
+        </w:rPr>
+        <w:t>sparams.json</w:t>
+      </w:r>
+      <w:r>
+        <w:t>, die Touchstone-Datei</w:t>
+      </w:r>
+    </w:p>
+    <w:p>
+      <w:r>
+        <w:t>(</w:t>
+      </w:r>
+      <w:r>
+        <w:rPr>
+          <w:rFonts w:ascii="Consolas" w:hAnsi="Consolas"/>
+          <w:sz w:val="18"/>
+        </w:rPr>
+        <w:t>.s2p</w:t>
+      </w:r>
+      <w:r>
+        <w:t>) entsteht erst, wenn die Matrix vollständig ist.</w:t>
+      </w:r>
+    </w:p>
+    <w:p>
+      <w:pPr>
+        <w:pStyle w:val="ListNumber"/>
+      </w:pPr>
+      <w:r>
+        <w:rPr>
+          <w:b/>
+        </w:rPr>
+        <w:t>Field Viewer</w:t>
+      </w:r>
+      <w:r>
+        <w:t xml:space="preserve"> — 3D-Ansicht der Felddumps (F1 für die Hilfe). Die</w:t>
+      </w:r>
+    </w:p>
+    <w:p>
+      <w:r>
+        <w:t xml:space="preserve">Vektor-Pfeile („Vectors") </w:t>
+      </w:r>
+      <w:r>
+        <w:rPr>
+          <w:b/>
+        </w:rPr>
+        <w:t>ersetzen</w:t>
+      </w:r>
+      <w:r>
+        <w:t xml:space="preserve"> die farbige Felddarstellung</w:t>
+      </w:r>
+    </w:p>
+    <w:p>
+      <w:r>
+        <w:t>(ParaView-Stil), damit keine opake Schnitt-/Oberflächenebene die Pfeile</w:t>
+      </w:r>
+    </w:p>
+    <w:p>
+      <w:r>
+        <w:t>verdeckt; mit „field underneath" läßt sich die Überlagerung wieder</w:t>
+      </w:r>
+    </w:p>
+    <w:p>
+      <w:r>
+        <w:t>einschalten. Beim manuellen Durchschalten einer Serie meldet die</w:t>
+      </w:r>
+    </w:p>
+    <w:p>
+      <w:r>
+        <w:t>Schritt-Anzeige, wie viele Pfeile sich gegenüber dem vorigen Schritt gedreht</w:t>
+      </w:r>
+    </w:p>
+    <w:p>
+      <w:r>
+        <w:t>haben — damit ist sofort sichtbar, ob die Pfeile dem Feld wirklich folgen.</w:t>
+      </w:r>
+    </w:p>
+    <w:p>
+      <w:r>
+        <w:t>Bei ausgeschaltetem „same length" zeigt die Pfeillänge die Amplitude; die</w:t>
+      </w:r>
+    </w:p>
+    <w:p>
+      <w:r>
+        <w:t>Referenz wird einmal über die ganze Serie gemessen, die Längen sind also</w:t>
+      </w:r>
+    </w:p>
+    <w:p>
+      <w:r>
+        <w:t>von Bild zu Bild vergleichbar.</w:t>
       </w:r>
     </w:p>
     <w:p>
@@ -2133,7 +5564,7 @@
         <w:pStyle w:val="ListBullet"/>
       </w:pPr>
       <w:r>
-        <w:t>[ ] Export: `.step`</w:t>
+        <w:t>[ ] Ports in FreeCAD: `PORT_in1_start` / `PORT_in1_stop` (optional, empfohlen)</w:t>
       </w:r>
     </w:p>
     <w:p>
@@ -2141,7 +5572,7 @@
         <w:pStyle w:val="ListBullet"/>
       </w:pPr>
       <w:r>
-        <w:t>[ ] GUI: New Project</w:t>
+        <w:t>[ ] Export: `.step` (oder `.fcstd` mit Ports)</w:t>
       </w:r>
     </w:p>
     <w:p>
@@ -2149,7 +5580,7 @@
         <w:pStyle w:val="ListBullet"/>
       </w:pPr>
       <w:r>
-        <w:t>[ ] Mesh: 2,2–2,7 GHz, target 2,45e9, unit mm</w:t>
+        <w:t>[ ] GUI: New Project</w:t>
       </w:r>
     </w:p>
     <w:p>
@@ -2157,7 +5588,7 @@
         <w:pStyle w:val="ListBullet"/>
       </w:pPr>
       <w:r>
-        <w:t>[ ] Import Geometry… → STEP</w:t>
+        <w:t>[ ] Mesh: 2,2–2,7 GHz, target 2,45e9, unit mm</w:t>
       </w:r>
     </w:p>
     <w:p>
@@ -2165,7 +5596,7 @@
         <w:pStyle w:val="ListBullet"/>
       </w:pPr>
       <w:r>
-        <w:t>[ ] Add Assignment… Substrat (dielectric) + copper</w:t>
+        <w:t>[ ] Import Geometry… → STEP / FCStd</w:t>
       </w:r>
     </w:p>
     <w:p>
@@ -2173,7 +5604,15 @@
         <w:pStyle w:val="ListBullet"/>
       </w:pPr>
       <w:r>
-        <w:t>[ ] Add Port… lumped 50 Ω am Feed</w:t>
+        <w:t>[ ] Add Assignment… Substrat (dielectric) + copper</w:t>
+      </w:r>
+    </w:p>
+    <w:p>
+      <w:pPr>
+        <w:pStyle w:val="ListBullet"/>
+      </w:pPr>
+      <w:r>
+        <w:t>[ ] Add Port… lumped 50 Ω am Feed (oder FreeCAD-Ports prüfen)</w:t>
       </w:r>
     </w:p>
     <w:p>
@@ -2429,6 +5868,174 @@
           </w:p>
         </w:tc>
       </w:tr>
+      <w:tr>
+        <w:tc>
+          <w:tcPr>
+            <w:tcW w:type="dxa" w:w="5040"/>
+          </w:tcPr>
+          <w:p>
+            <w:r/>
+            <w:r>
+              <w:t>[ERROR] port_alignment … is not on a mesh line</w:t>
+            </w:r>
+          </w:p>
+        </w:tc>
+        <w:tc>
+          <w:tcPr>
+            <w:tcW w:type="dxa" w:w="5040"/>
+          </w:tcPr>
+          <w:p>
+            <w:r/>
+            <w:r>
+              <w:t>Port-Koordinate lag auf keiner Gitterlinie (z. B. Klick im Port-Modus). Die GUI setzt die Port-Koordinaten inzwischen selbst als Gitterlinie (nahe Zwischenlinien werden verschoben, „port alignment: …" im Mesh-Log); nur direkt an einer Metallkante bleibt ein Versatz &lt; 15 % einer Zelle (Warnung port_snapped). Nach dem Update Build Mesh erneut ausführen.</w:t>
+            </w:r>
+          </w:p>
+        </w:tc>
+      </w:tr>
+      <w:tr>
+        <w:tc>
+          <w:tcPr>
+            <w:tcW w:type="dxa" w:w="5040"/>
+          </w:tcPr>
+          <w:p>
+            <w:r/>
+            <w:r>
+              <w:t>AssertionError in openEMS.Run</w:t>
+            </w:r>
+          </w:p>
+        </w:tc>
+        <w:tc>
+          <w:tcPr>
+            <w:tcW w:type="dxa" w:w="5040"/>
+          </w:tcPr>
+          <w:p>
+            <w:r/>
+            <w:r>
+              <w:t>project_run.py hat relative Pfade (WORK_DIR=…) → Skript neu erzeugen (Pfade werden absolut gespeichert)</w:t>
+            </w:r>
+          </w:p>
+        </w:tc>
+      </w:tr>
+      <w:tr>
+        <w:tc>
+          <w:tcPr>
+            <w:tcW w:type="dxa" w:w="5040"/>
+          </w:tcPr>
+          <w:p>
+            <w:r/>
+            <w:r>
+              <w:t>Warnung outside the field domain</w:t>
+            </w:r>
+          </w:p>
+        </w:tc>
+        <w:tc>
+          <w:tcPr>
+            <w:tcW w:type="dxa" w:w="5040"/>
+          </w:tcPr>
+          <w:p>
+            <w:r/>
+            <w:r>
+              <w:t>Dump/NF2FF-Box zu klein → Fit NF2FF to Geometry; das Skript warnt und klemmt die Box in den FDTD-Bereich</w:t>
+            </w:r>
+          </w:p>
+        </w:tc>
+      </w:tr>
+      <w:tr>
+        <w:tc>
+          <w:tcPr>
+            <w:tcW w:type="dxa" w:w="5040"/>
+          </w:tcPr>
+          <w:p>
+            <w:r/>
+            <w:r>
+              <w:t>Domain (schwarzer Rahmen) zu groß/klein</w:t>
+            </w:r>
+          </w:p>
+        </w:tc>
+        <w:tc>
+          <w:tcPr>
+            <w:tcW w:type="dxa" w:w="5040"/>
+          </w:tcPr>
+          <w:p>
+            <w:r/>
+            <w:r>
+              <w:t>Air margin in Sim Params → Boundary conditions (auto = λ/4 bei Stop-Frequenz, sonst mm-Wert für alle Flächen) → danach Build Mesh + Fit NF2FF (siehe 5.6)</w:t>
+            </w:r>
+          </w:p>
+        </w:tc>
+      </w:tr>
+      <w:tr>
+        <w:tc>
+          <w:tcPr>
+            <w:tcW w:type="dxa" w:w="5040"/>
+          </w:tcPr>
+          <w:p>
+            <w:r/>
+            <w:r>
+              <w:t>S11 flach bei ≈ 0 dB, Prad ≈ 0</w:t>
+            </w:r>
+          </w:p>
+        </w:tc>
+        <w:tc>
+          <w:tcPr>
+            <w:tcW w:type="dxa" w:w="5040"/>
+          </w:tcPr>
+          <w:p>
+            <w:r/>
+            <w:r>
+              <w:t>Port kurzgeschlossen — bei der Yagi der Boom: Preset setzt gfrp (Dielektrikum, Assignment boom), nicht copper</w:t>
+            </w:r>
+          </w:p>
+        </w:tc>
+      </w:tr>
+      <w:tr>
+        <w:tc>
+          <w:tcPr>
+            <w:tcW w:type="dxa" w:w="5040"/>
+          </w:tcPr>
+          <w:p>
+            <w:r/>
+            <w:r>
+              <w:t>Eigenes Skript nach dem Run „weg"</w:t>
+            </w:r>
+          </w:p>
+        </w:tc>
+        <w:tc>
+          <w:tcPr>
+            <w:tcW w:type="dxa" w:w="5040"/>
+          </w:tcPr>
+          <w:p>
+            <w:r/>
+            <w:r>
+              <w:t>project_run.py wird bei jedem Run neu erzeugt — deine Fassung liegt in project_run_edited.py; die GUI fragt vorher (neu erzeugen oder Skript so ausführen)</w:t>
+            </w:r>
+          </w:p>
+        </w:tc>
+      </w:tr>
+      <w:tr>
+        <w:tc>
+          <w:tcPr>
+            <w:tcW w:type="dxa" w:w="5040"/>
+          </w:tcPr>
+          <w:p>
+            <w:r/>
+            <w:r>
+              <w:t>Bei 2-Port fehlen S12/S22</w:t>
+            </w:r>
+          </w:p>
+        </w:tc>
+        <w:tc>
+          <w:tcPr>
+            <w:tcW w:type="dxa" w:w="5040"/>
+          </w:tcPr>
+          <w:p>
+            <w:r/>
+            <w:r>
+              <w:t>ein Lauf = eine Spalte → zweiter Lauf mit anderem excite_port, danach zusammenführen (examples\run_pcb_filter_example.py)</w:t>
+            </w:r>
+          </w:p>
+        </w:tc>
+      </w:tr>
     </w:tbl>
     <w:p/>
     <w:p>
@@ -2574,6 +6181,186 @@
       </w:r>
       <w:r>
         <w:t xml:space="preserve"> erneut ausführen.</w:t>
+      </w:r>
+    </w:p>
+    <w:p>
+      <w:pPr>
+        <w:pStyle w:val="ListBullet"/>
+      </w:pPr>
+      <w:r>
+        <w:rPr>
+          <w:b/>
+        </w:rPr>
+        <w:t>Skript-Änderungen über „Script…"</w:t>
+      </w:r>
+      <w:r>
+        <w:t xml:space="preserve"> machen — dann sichert der nächste Run deine</w:t>
+      </w:r>
+    </w:p>
+    <w:p>
+      <w:r>
+        <w:t xml:space="preserve">Fassung automatisch nach </w:t>
+      </w:r>
+      <w:r>
+        <w:rPr>
+          <w:rFonts w:ascii="Consolas" w:hAnsi="Consolas"/>
+          <w:sz w:val="18"/>
+        </w:rPr>
+        <w:t>project_run_edited.py</w:t>
+      </w:r>
+      <w:r>
+        <w:t xml:space="preserve"> und fragt, ob neu erzeugt oder so</w:t>
+      </w:r>
+    </w:p>
+    <w:p>
+      <w:r>
+        <w:t>ausgeführt werden soll.</w:t>
+      </w:r>
+    </w:p>
+    <w:p>
+      <w:pPr>
+        <w:pStyle w:val="ListBullet"/>
+      </w:pPr>
+      <w:r>
+        <w:rPr>
+          <w:b/>
+        </w:rPr>
+        <w:t>2-Port-Beispiel (Filter):</w:t>
+      </w:r>
+      <w:r>
+        <w:t xml:space="preserve"> </w:t>
+      </w:r>
+      <w:r>
+        <w:rPr>
+          <w:rFonts w:ascii="Consolas" w:hAnsi="Consolas"/>
+          <w:sz w:val="18"/>
+        </w:rPr>
+        <w:t>Preset: PCB Filter…</w:t>
+      </w:r>
+      <w:r>
+        <w:t xml:space="preserve"> in der GUI oder</w:t>
+      </w:r>
+    </w:p>
+    <w:p>
+      <w:r>
+        <w:rPr>
+          <w:rFonts w:ascii="Consolas" w:hAnsi="Consolas"/>
+          <w:sz w:val="18"/>
+        </w:rPr>
+        <w:t>examples\run_pcb_filter_example.py</w:t>
+      </w:r>
+      <w:r>
+        <w:t xml:space="preserve"> — beide S-Matrix-Spalten, fertiges </w:t>
+      </w:r>
+      <w:r>
+        <w:rPr>
+          <w:rFonts w:ascii="Consolas" w:hAnsi="Consolas"/>
+          <w:sz w:val="18"/>
+        </w:rPr>
+        <w:t>sparams.s2p</w:t>
+      </w:r>
+      <w:r>
+        <w:t>.</w:t>
+      </w:r>
+    </w:p>
+    <w:p>
+      <w:pPr>
+        <w:pStyle w:val="ListBullet"/>
+      </w:pPr>
+      <w:r>
+        <w:rPr>
+          <w:b/>
+        </w:rPr>
+        <w:t>2-Port-Beispiel (Bandpass 5,6 GHz):</w:t>
+      </w:r>
+      <w:r>
+        <w:t xml:space="preserve"> </w:t>
+      </w:r>
+      <w:r>
+        <w:rPr>
+          <w:rFonts w:ascii="Consolas" w:hAnsi="Consolas"/>
+          <w:sz w:val="18"/>
+        </w:rPr>
+        <w:t>Preset: PCB Bandpass (5.6 GHz)…</w:t>
+      </w:r>
+      <w:r>
+        <w:t xml:space="preserve"> oder</w:t>
+      </w:r>
+    </w:p>
+    <w:p>
+      <w:r>
+        <w:rPr>
+          <w:rFonts w:ascii="Consolas" w:hAnsi="Consolas"/>
+          <w:sz w:val="18"/>
+        </w:rPr>
+        <w:t>examples\run_pcb_bandpass_example.py</w:t>
+      </w:r>
+      <w:r>
+        <w:t xml:space="preserve"> — 5 offene λ/2-Stubs auf Teflon,</w:t>
+      </w:r>
+    </w:p>
+    <w:p>
+      <w:r>
+        <w:t xml:space="preserve">|S11| &lt; −10 dB von 4,90–6,45 GHz, fertiges </w:t>
+      </w:r>
+      <w:r>
+        <w:rPr>
+          <w:rFonts w:ascii="Consolas" w:hAnsi="Consolas"/>
+          <w:sz w:val="18"/>
+        </w:rPr>
+        <w:t>sparams.s2p</w:t>
+      </w:r>
+      <w:r>
+        <w:t>.</w:t>
+      </w:r>
+    </w:p>
+    <w:p>
+      <w:pPr>
+        <w:pStyle w:val="ListBullet"/>
+      </w:pPr>
+      <w:r>
+        <w:rPr>
+          <w:b/>
+        </w:rPr>
+        <w:t>2-Port-Beispiel (Hairpin-Bandpass 2,4 GHz):</w:t>
+      </w:r>
+      <w:r>
+        <w:t xml:space="preserve"> `Preset: PCB Hairpin Bandpass</w:t>
+      </w:r>
+    </w:p>
+    <w:p>
+      <w:r>
+        <w:t>(2.4 GHz)…</w:t>
+      </w:r>
+      <w:r>
+        <w:rPr>
+          <w:rFonts w:ascii="Consolas" w:hAnsi="Consolas"/>
+          <w:sz w:val="18"/>
+        </w:rPr>
+        <w:t xml:space="preserve"> oder </w:t>
+      </w:r>
+      <w:r>
+        <w:t>examples\run_pcb_hairpin_example.py` — 5 gefaltete</w:t>
+      </w:r>
+    </w:p>
+    <w:p>
+      <w:r>
+        <w:t>λ/2-Resonatoren auf RT/duroid 6010 (εr 10,2, 1,27 mm), kompakt (~25 mm lang),</w:t>
+      </w:r>
+    </w:p>
+    <w:p>
+      <w:r>
+        <w:t xml:space="preserve">ohne Vias, fertiges </w:t>
+      </w:r>
+      <w:r>
+        <w:rPr>
+          <w:rFonts w:ascii="Consolas" w:hAnsi="Consolas"/>
+          <w:sz w:val="18"/>
+        </w:rPr>
+        <w:t>sparams.s2p</w:t>
+      </w:r>
+      <w:r>
+        <w:t>.</w:t>
       </w:r>
     </w:p>
     <w:p>
@@ -2781,6 +6568,78 @@
           <w:p>
             <w:r/>
             <w:r>
+              <w:t>Port-Marker Demo</w:t>
+            </w:r>
+          </w:p>
+        </w:tc>
+        <w:tc>
+          <w:tcPr>
+            <w:tcW w:type="dxa" w:w="5040"/>
+          </w:tcPr>
+          <w:p>
+            <w:r/>
+            <w:r>
+              <w:t>examples\freecad_add_port_marks.py</w:t>
+            </w:r>
+          </w:p>
+        </w:tc>
+      </w:tr>
+      <w:tr>
+        <w:tc>
+          <w:tcPr>
+            <w:tcW w:type="dxa" w:w="5040"/>
+          </w:tcPr>
+          <w:p>
+            <w:r/>
+            <w:r>
+              <w:t>Dipol + Ports</w:t>
+            </w:r>
+          </w:p>
+        </w:tc>
+        <w:tc>
+          <w:tcPr>
+            <w:tcW w:type="dxa" w:w="5040"/>
+          </w:tcPr>
+          <w:p>
+            <w:r/>
+            <w:r>
+              <w:t>examples\freecad_dipole_ports.py, examples\run_dipole_ports_example.py</w:t>
+            </w:r>
+          </w:p>
+        </w:tc>
+      </w:tr>
+      <w:tr>
+        <w:tc>
+          <w:tcPr>
+            <w:tcW w:type="dxa" w:w="5040"/>
+          </w:tcPr>
+          <w:p>
+            <w:r/>
+            <w:r>
+              <w:t>FreeCAD-Port-Anleitung</w:t>
+            </w:r>
+          </w:p>
+        </w:tc>
+        <w:tc>
+          <w:tcPr>
+            <w:tcW w:type="dxa" w:w="5040"/>
+          </w:tcPr>
+          <w:p>
+            <w:r/>
+            <w:r>
+              <w:t>docs\FREECAD_PORTS_DE.md</w:t>
+            </w:r>
+          </w:p>
+        </w:tc>
+      </w:tr>
+      <w:tr>
+        <w:tc>
+          <w:tcPr>
+            <w:tcW w:type="dxa" w:w="5040"/>
+          </w:tcPr>
+          <w:p>
+            <w:r/>
+            <w:r>
               <w:t>Yagi-Beispiel</w:t>
             </w:r>
           </w:p>
@@ -2816,7 +6675,7 @@
           <w:p>
             <w:r/>
             <w:r>
-              <w:t>tests\freecad_gui_smoke.py, tests\freecad_mesh_smoke.py</w:t>
+              <w:t>tests\freecad_gui_smoke.py, tests\freecad_mesh_smoke.py, tests\port_marks_smoke.py, tests\dipole_ports_smoke.py</w:t>
             </w:r>
           </w:p>
         </w:tc>

</xml_diff>

<commit_message>
docs(diagnostics): change 8 - V1-V4 repair the runtime-only cells
- docs/DIAGNOSTICS_CHANGES_EN.md / _DE.md: 'Change 8' with the protection
  rule, the easyMesh decoupling, the stored fields, the measured table
  (Filter V1 x1.465 / V2 x1.447, dipole V2 x10.207) and the limits; the
  'Not changed' and 'Verification' sections now state that the default mesh
  path is untouched and list the new smoke.
- docs/ANLEITUNG_DE.md / _EN.md: the critical-cell section now explains the
  per-mark actions and the enforcement switch; DE DOCX rebuilt.
- CHANGELOG [Unreleased]: repair core, enforcement switch, viewer actions,
  V4 honesty.
- README: the diagnostics index mentions the repair.
</commit_message>
<xml_diff>
--- a/docs/ANLEITUNG_DE.docx
+++ b/docs/ANLEITUNG_DE.docx
@@ -4036,6 +4036,160 @@
     <w:p>
       <w:r>
         <w:t>vorher, ob es etwas zu sehen gibt.</w:t>
+      </w:r>
+    </w:p>
+    <w:p>
+      <w:r>
+        <w:rPr>
+          <w:b/>
+        </w:rPr>
+        <w:t>Zellen reparieren (opt-in, Vorschau zuerst).</w:t>
+      </w:r>
+      <w:r>
+        <w:t xml:space="preserve"> Rechtsklick auf eine Marke →</w:t>
+      </w:r>
+    </w:p>
+    <w:p>
+      <w:r>
+        <w:t xml:space="preserve">„Critical cells (N open)" bietet: </w:t>
+      </w:r>
+      <w:r>
+        <w:rPr>
+          <w:i/>
+        </w:rPr>
+        <w:t>Repair this x/y/z region…</w:t>
+      </w:r>
+      <w:r>
+        <w:t xml:space="preserve"> (Vorschau mit</w:t>
+      </w:r>
+    </w:p>
+    <w:p>
+      <w:r>
+        <w:t>entfernten Linien, neuer kleinster Zelle und dt vorher/nachher; OK speichert die</w:t>
+      </w:r>
+    </w:p>
+    <w:p>
+      <w:r>
+        <w:t xml:space="preserve">Regel im Projekt), </w:t>
+      </w:r>
+      <w:r>
+        <w:rPr>
+          <w:i/>
+        </w:rPr>
+        <w:t>Remove the offending line…</w:t>
+      </w:r>
+      <w:r>
+        <w:t xml:space="preserve"> (eine Auto-Linie löschen),</w:t>
+      </w:r>
+    </w:p>
+    <w:p>
+      <w:r>
+        <w:rPr>
+          <w:i/>
+        </w:rPr>
+        <w:t>Snap onto the neighbour line…</w:t>
+      </w:r>
+      <w:r>
+        <w:t xml:space="preserve"> (nur bei Duplikat-Slivers), *Accept region (do</w:t>
+      </w:r>
+    </w:p>
+    <w:p>
+      <w:r>
+        <w:t>not repair)</w:t>
+      </w:r>
+      <w:r>
+        <w:rPr>
+          <w:i/>
+        </w:rPr>
+        <w:t xml:space="preserve"> (grau, zählt nicht mehr als offener Befund) und </w:t>
+      </w:r>
+      <w:r>
+        <w:t>Explain…* (Ursache,</w:t>
+      </w:r>
+    </w:p>
+    <w:p>
+      <w:r>
+        <w:t>Quelle, Laufzeit-Strafe). Repariert wird nur, was nicht durch autorisierte</w:t>
+      </w:r>
+    </w:p>
+    <w:p>
+      <w:r>
+        <w:t>Koordinaten geschützt ist; eine Zelle mit zwei Geometrie-Flächen bleibt und wird</w:t>
+      </w:r>
+    </w:p>
+    <w:p>
+      <w:r>
+        <w:t xml:space="preserve">als </w:t>
+      </w:r>
+      <w:r>
+        <w:rPr>
+          <w:rFonts w:ascii="Consolas" w:hAnsi="Consolas"/>
+          <w:sz w:val="18"/>
+        </w:rPr>
+        <w:t>geometrie</w:t>
+      </w:r>
+      <w:r>
+        <w:t xml:space="preserve"> berichtet. Die Reparatur läuft als letzter Schritt der</w:t>
+      </w:r>
+    </w:p>
+    <w:p>
+      <w:r>
+        <w:t>Mesherzeugung — Vorschau und generiertes Solver-Skript erzeugen dasselbe Gitter.</w:t>
+      </w:r>
+    </w:p>
+    <w:p>
+      <w:r>
+        <w:rPr>
+          <w:b/>
+        </w:rPr>
+        <w:t>Mindestzellgröße erzwingen (V2, Standard: aus).</w:t>
+      </w:r>
+      <w:r>
+        <w:t xml:space="preserve"> In </w:t>
+      </w:r>
+      <w:r>
+        <w:rPr>
+          <w:i/>
+        </w:rPr>
+        <w:t>Mesh Parameters</w:t>
+      </w:r>
+      <w:r>
+        <w:t xml:space="preserve"> macht</w:t>
+      </w:r>
+    </w:p>
+    <w:p>
+      <w:r>
+        <w:t>„Enforce min cell size (repair)" aus „Min cell size" eine harte Untergrenze</w:t>
+      </w:r>
+    </w:p>
+    <w:p>
+      <w:r>
+        <w:t>(„Min cell size (Z)" überschreibt die Schichtdicke): Zellen darunter werden in</w:t>
+      </w:r>
+    </w:p>
+    <w:p>
+      <w:r>
+        <w:t>den kleineren Nachbarn verschmolzen, das Grading wird neu verteilt; echte Spalte</w:t>
+      </w:r>
+    </w:p>
+    <w:p>
+      <w:r>
+        <w:t>(beide Flächen aus der Geometrie) bleiben und stehen als „not reached" im</w:t>
+      </w:r>
+    </w:p>
+    <w:p>
+      <w:r>
+        <w:t>Bericht. Der Schalter ist opt-in, damit bestehende Presets unverändert</w:t>
+      </w:r>
+    </w:p>
+    <w:p>
+      <w:r>
+        <w:t>reproduzierbar bleiben; easyMesh bekommt die Untergrenze dabei nicht mehr zu</w:t>
+      </w:r>
+    </w:p>
+    <w:p>
+      <w:r>
+        <w:t>sehen (sonst verfeinert es die lateralen Achsen gegen die Reparatur).</w:t>
       </w:r>
     </w:p>
     <w:p>

</xml_diff>

<commit_message>
feat(ui): mirror the critical-cell actions in the Mesh menu
The Mesh menu offered a different set than the viewer's right-click menu
(global switch + 'repair the worst' only). It now has a 'Critical cells
(N open)' submenu with the same actions: Mark critical cells (overlay),
Repair the worst open region…, Remove the offending line…, Snap onto the
neighbour line…, Accept region (do not repair), Explain… and Enforce min
cell size (repair).

Without a cursor the target is the worst open finding. Enablement comes
from the new MeshGeometryViewer.critical_action_state() that the right-click
menu uses as well, so the two menus cannot disagree (repair disabled for
'geometrie', snap only for slivers, ...). The submenu title carries the open
count and refreshes on aboutToShow and on every mark change.

tests/menu_smoke.py checks the submenu entries, the enablement with and
without a mark, the accept round-trip and the two-way sync with the Mesh
Parameters checkbox; docs/help/changelog updated.
</commit_message>
<xml_diff>
--- a/docs/ANLEITUNG_DE.docx
+++ b/docs/ANLEITUNG_DE.docx
@@ -4203,22 +4203,31 @@
         <w:t>Mesh-Menü</w:t>
       </w:r>
       <w:r>
-        <w:t>: „Enforce min cell size (repair)" (spiegelt</w:t>
-      </w:r>
-    </w:p>
-    <w:p>
-      <w:r>
-        <w:t>die Checkbox), „Repair critical cells…" (öffnet den Viewer und die Vorschau für</w:t>
-      </w:r>
-    </w:p>
-    <w:p>
-      <w:r>
-        <w:t>den schlimmsten offenen Befund) und „Mark critical cells (N)" (schaltet das</w:t>
-      </w:r>
-    </w:p>
-    <w:p>
-      <w:r>
-        <w:t>Overlay ein/aus, mit der Zahl der offenen Befunde).</w:t>
+        <w:t xml:space="preserve"> unter </w:t>
+      </w:r>
+      <w:r>
+        <w:rPr>
+          <w:i/>
+        </w:rPr>
+        <w:t>Critical cells (N open)</w:t>
+      </w:r>
+      <w:r>
+        <w:t>: Overlay-</w:t>
+      </w:r>
+    </w:p>
+    <w:p>
+      <w:r>
+        <w:t>Schalter, Repair/Remove/Snap/Accept/Explain für den schlimmsten offenen Befund</w:t>
+      </w:r>
+    </w:p>
+    <w:p>
+      <w:r>
+        <w:t>und der Enforce-Schalter. Die Aktionen sind dort nur aktiv, wo sie auch im</w:t>
+      </w:r>
+    </w:p>
+    <w:p>
+      <w:r>
+        <w:t>Rechtsklick-Menü aktiv wären.</w:t>
       </w:r>
     </w:p>
     <w:p>

</xml_diff>

<commit_message>
docs(help): detailed Mesh Repair topic and reachable help buttons
- app/ui/tab_help.py: new topic 'Mesh Repair' (~6k chars) covering the cause
  codes, the five per-mark actions, the preview dialog, the protection rules,
  the global floor (V2, incl. the easyMesh decoupling and the report lines),
  the stored MeshSpec fields and the limits. The Mesh Viewer topic now names
  cause/penalty/accepted and links to it; Mesh Parameters documents the
  requested-vs-achieved report lines and the cylindrical limitation.
- app/ui/repair_dialog.py: Help button (QDialogButtonBox.Help) opens the topic.
- app/ui/main_window.py: Help -> 'Mesh repair (critical cells)…'.
- tests: the repair smoke checks the topic + Help button, the menu smoke the
  Help entry. Docs (DE/EN) and CHANGELOG updated, DE DOCX rebuilt.
</commit_message>
<xml_diff>
--- a/docs/ANLEITUNG_DE.docx
+++ b/docs/ANLEITUNG_DE.docx
@@ -4228,6 +4228,25 @@
     <w:p>
       <w:r>
         <w:t>Rechtsklick-Menü aktiv wären.</w:t>
+      </w:r>
+    </w:p>
+    <w:p>
+      <w:r>
+        <w:t xml:space="preserve">Ausführliche Beschreibung: </w:t>
+      </w:r>
+      <w:r>
+        <w:rPr>
+          <w:b/>
+        </w:rPr>
+        <w:t>F1 → „Mesh Repair"</w:t>
+      </w:r>
+      <w:r>
+        <w:t xml:space="preserve"> (auch Help-Knopf im</w:t>
+      </w:r>
+    </w:p>
+    <w:p>
+      <w:r>
+        <w:t>Reparatur-Dialog und Help → „Mesh repair (critical cells)…").</w:t>
       </w:r>
     </w:p>
     <w:p>

</xml_diff>

<commit_message>
docs(help): polarization / phase center in the help and manual
- Help menu: 'Polarization / phase center…' opens the new topic directly.
- Antenna tab help: a 'Polarization / phase center' block describing the
  button, the table columns (AR, sense, tilt, peak angle, dx/dy/dz, RMS),
  the 'linear' / 'not well-defined' cases and Copy/Help.
- Manual (DE/EN, section 7 Evaluation): the Antenna tab paragraph now
  explains the Polarization… button and its limits; DE DOCX rebuilt.
- tests/menu_smoke.py: checks the new Help-menu entry.
</commit_message>
<xml_diff>
--- a/docs/ANLEITUNG_DE.docx
+++ b/docs/ANLEITUNG_DE.docx
@@ -5590,7 +5590,66 @@
         <w:t>work/&lt;projekt&gt;/nf2ff/</w:t>
       </w:r>
       <w:r>
-        <w:t>)</w:t>
+        <w:t>).</w:t>
+      </w:r>
+    </w:p>
+    <w:p>
+      <w:r>
+        <w:rPr>
+          <w:b/>
+        </w:rPr>
+        <w:t>Polarization…</w:t>
+      </w:r>
+      <w:r>
+        <w:t xml:space="preserve"> (Button im Antenna-Tab) zeigt Größen aus demselben</w:t>
+      </w:r>
+    </w:p>
+    <w:p>
+      <w:r>
+        <w:t xml:space="preserve">NF2FF-Ergebnis — ohne neuen Lauf: </w:t>
+      </w:r>
+      <w:r>
+        <w:rPr>
+          <w:b/>
+        </w:rPr>
+        <w:t>Axial Ratio</w:t>
+      </w:r>
+      <w:r>
+        <w:t xml:space="preserve"> (dB, Drehsinn</w:t>
+      </w:r>
+    </w:p>
+    <w:p>
+      <w:r>
+        <w:t xml:space="preserve">RHCP/LHCP, Tilt; linear → „linear") und </w:t>
+      </w:r>
+      <w:r>
+        <w:rPr>
+          <w:b/>
+        </w:rPr>
+        <w:t>Phase Center</w:t>
+      </w:r>
+      <w:r>
+        <w:t xml:space="preserve"> (Δx/Δy/Δz in mm</w:t>
+      </w:r>
+    </w:p>
+    <w:p>
+      <w:r>
+        <w:t>plus RMS des Phasen-Fits) relativ zum NF2FF-Boxmittelpunkt. Der</w:t>
+      </w:r>
+    </w:p>
+    <w:p>
+      <w:r>
+        <w:t>Phase-Center-Wert ist eine Schätzung für einen klaren Hauptstrahl; passt</w:t>
+      </w:r>
+    </w:p>
+    <w:p>
+      <w:r>
+        <w:t>der Fit nicht, steht „—" mit „phase not well-defined". Details:</w:t>
+      </w:r>
+    </w:p>
+    <w:p>
+      <w:r>
+        <w:t>F1 → „Polarization &amp; Phase Center".</w:t>
       </w:r>
     </w:p>
     <w:p>

</xml_diff>

<commit_message>
docs(ui): illustrate the antenna evaluation tab
Adds four screenshots to the German and English manual (section 7.1): the Antenna tab with an H-plane cut, the new axial-ratio cut, the 3D pattern with labelled x/y/z axes, and the Polarization dialog. Rendered from real NF2FF results (2.45 GHz example for the generic views, GPS L1 design for the AR plots, which are meaningless for a linearly polarised patch).

examples/build_anleitung_docx.py now understands ![alt](path) so the Word version carries the same figures; ANLEITUNG_DE.docx regenerated.
</commit_message>
<xml_diff>
--- a/docs/ANLEITUNG_DE.docx
+++ b/docs/ANLEITUNG_DE.docx
@@ -5806,6 +5806,239 @@
     <w:p>
       <w:r>
         <w:t>von Bild zu Bild vergleichbar.</w:t>
+      </w:r>
+    </w:p>
+    <w:p>
+      <w:r>
+        <w:t>Der Export schreibt zusätzlich eine ParaView-Collection (</w:t>
+      </w:r>
+      <w:r>
+        <w:rPr>
+          <w:rFonts w:ascii="Consolas" w:hAnsi="Consolas"/>
+          <w:sz w:val="18"/>
+        </w:rPr>
+        <w:t>&lt;dump&gt;.pvd</w:t>
+      </w:r>
+      <w:r>
+        <w:t>) neben</w:t>
+      </w:r>
+    </w:p>
+    <w:p>
+      <w:r>
+        <w:t>die Schritt-Dateien, damit die ganze Serie in ParaView aus einer Datei läuft</w:t>
+      </w:r>
+    </w:p>
+    <w:p>
+      <w:r>
+        <w:t>— siehe §12.4.</w:t>
+      </w:r>
+    </w:p>
+    <w:p>
+      <w:pPr>
+        <w:pStyle w:val="Heading3"/>
+      </w:pPr>
+      <w:r>
+        <w:t>7.1 Antenna-Tab in Bildern</w:t>
+      </w:r>
+    </w:p>
+    <w:p>
+      <w:pPr>
+        <w:jc w:val="center"/>
+      </w:pPr>
+      <w:r>
+        <w:drawing>
+          <wp:inline xmlns:a="http://schemas.openxmlformats.org/drawingml/2006/main" xmlns:pic="http://schemas.openxmlformats.org/drawingml/2006/picture">
+            <wp:extent cx="5669280" cy="3631882"/>
+            <wp:docPr id="1" name="Picture 1"/>
+            <wp:cNvGraphicFramePr>
+              <a:graphicFrameLocks noChangeAspect="1"/>
+            </wp:cNvGraphicFramePr>
+            <a:graphic>
+              <a:graphicData uri="http://schemas.openxmlformats.org/drawingml/2006/picture">
+                <pic:pic>
+                  <pic:nvPicPr>
+                    <pic:cNvPr id="0" name="antenna_tab_polar.png"/>
+                    <pic:cNvPicPr/>
+                  </pic:nvPicPr>
+                  <pic:blipFill>
+                    <a:blip r:embed="rId9"/>
+                    <a:stretch>
+                      <a:fillRect/>
+                    </a:stretch>
+                  </pic:blipFill>
+                  <pic:spPr>
+                    <a:xfrm>
+                      <a:off x="0" y="0"/>
+                      <a:ext cx="5669280" cy="3631882"/>
+                    </a:xfrm>
+                    <a:prstGeom prst="rect"/>
+                  </pic:spPr>
+                </pic:pic>
+              </a:graphicData>
+            </a:graphic>
+          </wp:inline>
+        </w:drawing>
+      </w:r>
+    </w:p>
+    <w:p>
+      <w:r>
+        <w:rPr>
+          <w:b/>
+        </w:rPr>
+        <w:t>Abb. 1 — Antenna-Tab, H-Ebene.</w:t>
+      </w:r>
+      <w:r>
+        <w:t xml:space="preserve"> Links die gefundenen NF2FF-Ergebnisse und der Details-Block (Dmax, Gmax, η, Prad, Raster), rechts der Polarschnitt mit dBi-Ringen. Rechtsklick auf den Plot öffnet das Analyse-Menü (HPBW, Vor-Rück-Verhältnis, Marker, Pop-out). Beispiel: der 2,45-GHz-Patch aus §2.2.</w:t>
+      </w:r>
+    </w:p>
+    <w:p>
+      <w:pPr>
+        <w:jc w:val="center"/>
+      </w:pPr>
+      <w:r>
+        <w:drawing>
+          <wp:inline xmlns:a="http://schemas.openxmlformats.org/drawingml/2006/main" xmlns:pic="http://schemas.openxmlformats.org/drawingml/2006/picture">
+            <wp:extent cx="5669280" cy="3631882"/>
+            <wp:docPr id="2" name="Picture 2"/>
+            <wp:cNvGraphicFramePr>
+              <a:graphicFrameLocks noChangeAspect="1"/>
+            </wp:cNvGraphicFramePr>
+            <a:graphic>
+              <a:graphicData uri="http://schemas.openxmlformats.org/drawingml/2006/picture">
+                <pic:pic>
+                  <pic:nvPicPr>
+                    <pic:cNvPr id="0" name="antenna_ar_cut.png"/>
+                    <pic:cNvPicPr/>
+                  </pic:nvPicPr>
+                  <pic:blipFill>
+                    <a:blip r:embed="rId10"/>
+                    <a:stretch>
+                      <a:fillRect/>
+                    </a:stretch>
+                  </pic:blipFill>
+                  <pic:spPr>
+                    <a:xfrm>
+                      <a:off x="0" y="0"/>
+                      <a:ext cx="5669280" cy="3631882"/>
+                    </a:xfrm>
+                    <a:prstGeom prst="rect"/>
+                  </pic:spPr>
+                </pic:pic>
+              </a:graphicData>
+            </a:graphic>
+          </wp:inline>
+        </w:drawing>
+      </w:r>
+    </w:p>
+    <w:p>
+      <w:r>
+        <w:rPr>
+          <w:b/>
+        </w:rPr>
+        <w:t>Abb. 2 — Plottyp „Axial Ratio (theta cut)".</w:t>
+      </w:r>
+      <w:r>
+        <w:t xml:space="preserve"> AR über θ bei wählbarem Azimut (Wähler „AR φ" in der Plot-Toolbar, 0…315°). Das grüne Band ist der Bereich AR ≤ 3 dB; Punktlinie und Text nennen die größte Auslenkung ab Boresight, die diese Grenze noch einhält. Beispiel: GPS-L1-Patch bei 1,57542 GHz — 1,70 dB bei θ = 0°, ≤ 3 dB bis θ = 62°. Beim linear polarisierten 2,45-GHz-Beispiel liegt der AR durchgehend über 10 dB; dort taugt der Schnitt nur als Kontrolle.</w:t>
+      </w:r>
+    </w:p>
+    <w:p>
+      <w:pPr>
+        <w:jc w:val="center"/>
+      </w:pPr>
+      <w:r>
+        <w:drawing>
+          <wp:inline xmlns:a="http://schemas.openxmlformats.org/drawingml/2006/main" xmlns:pic="http://schemas.openxmlformats.org/drawingml/2006/picture">
+            <wp:extent cx="5669280" cy="3631882"/>
+            <wp:docPr id="3" name="Picture 3"/>
+            <wp:cNvGraphicFramePr>
+              <a:graphicFrameLocks noChangeAspect="1"/>
+            </wp:cNvGraphicFramePr>
+            <a:graphic>
+              <a:graphicData uri="http://schemas.openxmlformats.org/drawingml/2006/picture">
+                <pic:pic>
+                  <pic:nvPicPr>
+                    <pic:cNvPr id="0" name="antenna_3d_pattern.png"/>
+                    <pic:cNvPicPr/>
+                  </pic:nvPicPr>
+                  <pic:blipFill>
+                    <a:blip r:embed="rId11"/>
+                    <a:stretch>
+                      <a:fillRect/>
+                    </a:stretch>
+                  </pic:blipFill>
+                  <pic:spPr>
+                    <a:xfrm>
+                      <a:off x="0" y="0"/>
+                      <a:ext cx="5669280" cy="3631882"/>
+                    </a:xfrm>
+                    <a:prstGeom prst="rect"/>
+                  </pic:spPr>
+                </pic:pic>
+              </a:graphicData>
+            </a:graphic>
+          </wp:inline>
+        </w:drawing>
+      </w:r>
+    </w:p>
+    <w:p>
+      <w:r>
+        <w:rPr>
+          <w:b/>
+        </w:rPr>
+        <w:t>Abb. 3 — 3D-Muster.</w:t>
+      </w:r>
+      <w:r>
+        <w:t xml:space="preserve"> Die drei Raumrichtungen sind mit x/y/z beschriftet. Der Radius ist auf das dBi-Fenster normiert (Regler „dBi min" in der Toolbar), die absoluten Werte liefert die Farbskala rechts.</w:t>
+      </w:r>
+    </w:p>
+    <w:p>
+      <w:pPr>
+        <w:jc w:val="center"/>
+      </w:pPr>
+      <w:r>
+        <w:drawing>
+          <wp:inline xmlns:a="http://schemas.openxmlformats.org/drawingml/2006/main" xmlns:pic="http://schemas.openxmlformats.org/drawingml/2006/picture">
+            <wp:extent cx="5669280" cy="2664562"/>
+            <wp:docPr id="4" name="Picture 4"/>
+            <wp:cNvGraphicFramePr>
+              <a:graphicFrameLocks noChangeAspect="1"/>
+            </wp:cNvGraphicFramePr>
+            <a:graphic>
+              <a:graphicData uri="http://schemas.openxmlformats.org/drawingml/2006/picture">
+                <pic:pic>
+                  <pic:nvPicPr>
+                    <pic:cNvPr id="0" name="polarization_dialog.png"/>
+                    <pic:cNvPicPr/>
+                  </pic:nvPicPr>
+                  <pic:blipFill>
+                    <a:blip r:embed="rId12"/>
+                    <a:stretch>
+                      <a:fillRect/>
+                    </a:stretch>
+                  </pic:blipFill>
+                  <pic:spPr>
+                    <a:xfrm>
+                      <a:off x="0" y="0"/>
+                      <a:ext cx="5669280" cy="2664562"/>
+                    </a:xfrm>
+                    <a:prstGeom prst="rect"/>
+                  </pic:spPr>
+                </pic:pic>
+              </a:graphicData>
+            </a:graphic>
+          </wp:inline>
+        </w:drawing>
+      </w:r>
+    </w:p>
+    <w:p>
+      <w:r>
+        <w:rPr>
+          <w:b/>
+        </w:rPr>
+        <w:t>Abb. 4 — Dialog „Polarization…".</w:t>
+      </w:r>
+      <w:r>
+        <w:t xml:space="preserve"> Eine Zeile pro Frequenz mit AR am Strahlmaximum, Drehsinn, Tilt, Peak-Richtung und Phasenzentrum (Δx/Δy/Δz, RMS). Die Kopfzeile nennt Anzahl der Punkte, Anteil mit AR ≤ 3 dB und die vorkommenden Drehsinne. „phase not well-defined" heißt: der Phasen-Fit ist für dieses Muster nicht belastbar.</w:t>
       </w:r>
     </w:p>
     <w:p>
@@ -6952,6 +7185,1231 @@
       </w:tr>
     </w:tbl>
     <w:p/>
+    <w:p>
+      <w:r>
+        <w:t>────────────────────────────────────────────────────────────</w:t>
+      </w:r>
+    </w:p>
+    <w:p>
+      <w:pPr>
+        <w:pStyle w:val="Heading2"/>
+      </w:pPr>
+      <w:r>
+        <w:t>12. Export &amp; Austausch (CAD, CST, ParaView)</w:t>
+      </w:r>
+    </w:p>
+    <w:p>
+      <w:r>
+        <w:t xml:space="preserve">Vier Ausgabewege sind für den Datenaustausch gedacht: </w:t>
+      </w:r>
+      <w:r>
+        <w:rPr>
+          <w:b/>
+        </w:rPr>
+        <w:t>STEP</w:t>
+      </w:r>
+      <w:r>
+        <w:t xml:space="preserve"> (Geometrie),</w:t>
+      </w:r>
+    </w:p>
+    <w:p>
+      <w:r>
+        <w:rPr>
+          <w:b/>
+        </w:rPr>
+        <w:t>Gitter-JSON</w:t>
+      </w:r>
+      <w:r>
+        <w:t xml:space="preserve"> (Mesh-Linien), </w:t>
+      </w:r>
+      <w:r>
+        <w:rPr>
+          <w:b/>
+        </w:rPr>
+        <w:t>Touchstone</w:t>
+      </w:r>
+      <w:r>
+        <w:t xml:space="preserve"> (S-Parameter) und </w:t>
+      </w:r>
+      <w:r>
+        <w:rPr>
+          <w:b/>
+        </w:rPr>
+        <w:t>VTK</w:t>
+      </w:r>
+    </w:p>
+    <w:p>
+      <w:r>
+        <w:t>(Felddaten). Die ersten drei liest ein anderer Solver wie CST Studio Suite</w:t>
+      </w:r>
+    </w:p>
+    <w:p>
+      <w:r>
+        <w:t>direkt; VTK ist das neutrale Format für Felder.</w:t>
+      </w:r>
+    </w:p>
+    <w:p>
+      <w:pPr>
+        <w:pStyle w:val="Heading3"/>
+      </w:pPr>
+      <w:r>
+        <w:t>12.1 STEP — Geometrie nach CAD / CST</w:t>
+      </w:r>
+    </w:p>
+    <w:p>
+      <w:r>
+        <w:rPr>
+          <w:b/>
+        </w:rPr>
+        <w:t>File → Export STEP…</w:t>
+      </w:r>
+    </w:p>
+    <w:p>
+      <w:pPr>
+        <w:pStyle w:val="ListBullet"/>
+      </w:pPr>
+      <w:r>
+        <w:t xml:space="preserve">Exportiert wird die </w:t>
+      </w:r>
+      <w:r>
+        <w:rPr>
+          <w:i/>
+        </w:rPr>
+        <w:t>effektive</w:t>
+      </w:r>
+      <w:r>
+        <w:t xml:space="preserve"> Geometrie, also genau die Primitives, aus</w:t>
+      </w:r>
+    </w:p>
+    <w:p>
+      <w:r>
+        <w:t>denen auch das Simulationsskript gebaut wird: analytische Boxen, Zylinder,</w:t>
+      </w:r>
+    </w:p>
+    <w:p>
+      <w:r>
+        <w:t>Kugeln und extrudierte Polygone sowie alle importierten Dreiecksnetze.</w:t>
+      </w:r>
+    </w:p>
+    <w:p>
+      <w:r>
+        <w:t xml:space="preserve">Importiertes STEP/FCStd kommt dabei </w:t>
+      </w:r>
+      <w:r>
+        <w:rPr>
+          <w:b/>
+        </w:rPr>
+        <w:t>tesselliert</w:t>
+      </w:r>
+      <w:r>
+        <w:t xml:space="preserve"> an (nicht als originales</w:t>
+      </w:r>
+    </w:p>
+    <w:p>
+      <w:r>
+        <w:t>BREP) — der Export zeigt, was openEMS tatsächlich rechnet.</w:t>
+      </w:r>
+    </w:p>
+    <w:p>
+      <w:pPr>
+        <w:pStyle w:val="ListBullet"/>
+      </w:pPr>
+      <w:r>
+        <w:t xml:space="preserve">Ausgabe: </w:t>
+      </w:r>
+      <w:r>
+        <w:rPr>
+          <w:b/>
+        </w:rPr>
+        <w:t>AP214 STEP in Millimetern</w:t>
+      </w:r>
+      <w:r>
+        <w:t>. Die Zeichnungseinheit aus</w:t>
+      </w:r>
+    </w:p>
+    <w:p>
+      <w:r>
+        <w:rPr>
+          <w:i/>
+        </w:rPr>
+        <w:t>Mesh → Drawing unit</w:t>
+      </w:r>
+      <w:r>
+        <w:t xml:space="preserve"> wird umgerechnet, es gibt also keine Einheiten-Raterei.</w:t>
+      </w:r>
+    </w:p>
+    <w:p>
+      <w:pPr>
+        <w:pStyle w:val="ListBullet"/>
+      </w:pPr>
+      <w:r>
+        <w:rPr>
+          <w:b/>
+        </w:rPr>
+        <w:t>Objektnamen bleiben erhalten</w:t>
+      </w:r>
+      <w:r>
+        <w:t>: jedes Solid kommt in CST unter dem Namen an,</w:t>
+      </w:r>
+    </w:p>
+    <w:p>
+      <w:r>
+        <w:t>den es im Mesh Viewer / Projektbaum hat (STEP-</w:t>
+      </w:r>
+      <w:r>
+        <w:rPr>
+          <w:rFonts w:ascii="Consolas" w:hAnsi="Consolas"/>
+          <w:sz w:val="18"/>
+        </w:rPr>
+        <w:t>PRODUCT</w:t>
+      </w:r>
+      <w:r>
+        <w:t>).</w:t>
+      </w:r>
+    </w:p>
+    <w:p>
+      <w:pPr>
+        <w:pStyle w:val="ListBullet"/>
+      </w:pPr>
+      <w:r>
+        <w:t xml:space="preserve">Eine </w:t>
+      </w:r>
+      <w:r>
+        <w:rPr>
+          <w:b/>
+        </w:rPr>
+        <w:t>null-dicke Metallfläche</w:t>
+      </w:r>
+      <w:r>
+        <w:t xml:space="preserve"> (z. B. das </w:t>
+      </w:r>
+      <w:r>
+        <w:rPr>
+          <w:rFonts w:ascii="Consolas" w:hAnsi="Consolas"/>
+          <w:sz w:val="18"/>
+        </w:rPr>
+        <w:t>patch</w:t>
+      </w:r>
+      <w:r>
+        <w:t xml:space="preserve"> des Patch-Presets) wird</w:t>
+      </w:r>
+    </w:p>
+    <w:p>
+      <w:r>
+        <w:t xml:space="preserve">als </w:t>
+      </w:r>
+      <w:r>
+        <w:rPr>
+          <w:b/>
+        </w:rPr>
+        <w:t>planare Fläche</w:t>
+      </w:r>
+      <w:r>
+        <w:t xml:space="preserve"> geschrieben, nicht als degenerierter Solid — openEMS</w:t>
+      </w:r>
+    </w:p>
+    <w:p>
+      <w:r>
+        <w:t>bläht sie erst nach dem Meshing auf 2 nm auf, was als CAD unbrauchbar wäre.</w:t>
+      </w:r>
+    </w:p>
+    <w:p>
+      <w:pPr>
+        <w:pStyle w:val="ListBullet"/>
+      </w:pPr>
+      <w:r>
+        <w:rPr>
+          <w:b/>
+        </w:rPr>
+        <w:t>Geschlossene Netze</w:t>
+      </w:r>
+      <w:r>
+        <w:t xml:space="preserve"> werden Solids, </w:t>
+      </w:r>
+      <w:r>
+        <w:rPr>
+          <w:b/>
+        </w:rPr>
+        <w:t>offene Hüllen</w:t>
+      </w:r>
+      <w:r>
+        <w:t xml:space="preserve"> bleiben Hüllen. Beides</w:t>
+      </w:r>
+    </w:p>
+    <w:p>
+      <w:r>
+        <w:t>ist gültiges STEP und in CST materialisierbar.</w:t>
+      </w:r>
+    </w:p>
+    <w:p>
+      <w:pPr>
+        <w:pStyle w:val="ListBullet"/>
+      </w:pPr>
+      <w:r>
+        <w:t>Nicht darstellbare Geometrie (Punkt, Linie, fehlendes Mesh) landet als Warnung</w:t>
+      </w:r>
+    </w:p>
+    <w:p>
+      <w:r>
+        <w:t>im Log und wird übersprungen; der Rest der Datei entsteht trotzdem.</w:t>
+      </w:r>
+    </w:p>
+    <w:p>
+      <w:pPr>
+        <w:pStyle w:val="ListBullet"/>
+      </w:pPr>
+      <w:r>
+        <w:t xml:space="preserve">Voraussetzung: </w:t>
+      </w:r>
+      <w:r>
+        <w:rPr>
+          <w:b/>
+        </w:rPr>
+        <w:t>FreeCADCmd</w:t>
+      </w:r>
+      <w:r>
+        <w:t xml:space="preserve"> (wie beim STEP-Import), Pfad unter </w:t>
+      </w:r>
+      <w:r>
+        <w:rPr>
+          <w:i/>
+        </w:rPr>
+        <w:t>Settings</w:t>
+      </w:r>
+      <w:r>
+        <w:t>.</w:t>
+      </w:r>
+    </w:p>
+    <w:p>
+      <w:r>
+        <w:t xml:space="preserve">&gt; Der FreeCAD-Dialog „Export CAD…“ ist die </w:t>
+      </w:r>
+      <w:r>
+        <w:rPr>
+          <w:b/>
+        </w:rPr>
+        <w:t>Gegenrichtung</w:t>
+      </w:r>
+      <w:r>
+        <w:t xml:space="preserve"> (FCStd/STEP →</w:t>
+      </w:r>
+    </w:p>
+    <w:p>
+      <w:r>
+        <w:t xml:space="preserve">&gt; per-Object-STL + </w:t>
+      </w:r>
+      <w:r>
+        <w:rPr>
+          <w:rFonts w:ascii="Consolas" w:hAnsi="Consolas"/>
+          <w:sz w:val="18"/>
+        </w:rPr>
+        <w:t>openems_export.json</w:t>
+      </w:r>
+      <w:r>
+        <w:t xml:space="preserve"> für den Importer), kein Geometrie-Export.</w:t>
+      </w:r>
+    </w:p>
+    <w:p>
+      <w:pPr>
+        <w:pStyle w:val="Heading3"/>
+      </w:pPr>
+      <w:r>
+        <w:t>12.2 Gitter-JSON — identische Zellen in CST</w:t>
+      </w:r>
+    </w:p>
+    <w:p>
+      <w:r>
+        <w:rPr>
+          <w:b/>
+        </w:rPr>
+        <w:t>Mesh → Export grid (JSON)…</w:t>
+      </w:r>
+    </w:p>
+    <w:p>
+      <w:r>
+        <w:t>Sowohl openEMS als auch der CST-Zeitbereichslöser rechnen auf einem</w:t>
+      </w:r>
+    </w:p>
+    <w:p>
+      <w:r>
+        <w:t>rechtwinkligen (hexaedrischen) Gitter. Gibt man CST dieselben Linienpositionen</w:t>
+      </w:r>
+    </w:p>
+    <w:p>
+      <w:r>
+        <w:t xml:space="preserve">(z. B. per </w:t>
+      </w:r>
+      <w:r>
+        <w:rPr>
+          <w:rFonts w:ascii="Consolas" w:hAnsi="Consolas"/>
+          <w:sz w:val="18"/>
+        </w:rPr>
+        <w:t>Mesh.SetLines</w:t>
+      </w:r>
+      <w:r>
+        <w:t xml:space="preserve">), laufen beide auf </w:t>
+      </w:r>
+      <w:r>
+        <w:rPr>
+          <w:b/>
+        </w:rPr>
+        <w:t>identischen Zellen</w:t>
+      </w:r>
+      <w:r>
+        <w:t xml:space="preserve"> — statt auf</w:t>
+      </w:r>
+    </w:p>
+    <w:p>
+      <w:r>
+        <w:t>zwei unabhängig vermaschten Modellen. Genau dort würden sich die Solver sonst</w:t>
+      </w:r>
+    </w:p>
+    <w:p>
+      <w:r>
+        <w:t>unterscheiden.</w:t>
+      </w:r>
+    </w:p>
+    <w:p>
+      <w:pPr>
+        <w:pStyle w:val="ListBullet"/>
+      </w:pPr>
+      <w:r>
+        <w:t xml:space="preserve">Quelle ist die CSX des </w:t>
+      </w:r>
+      <w:r>
+        <w:rPr>
+          <w:b/>
+        </w:rPr>
+        <w:t>Mesh Viewers</w:t>
+      </w:r>
+      <w:r>
+        <w:t>, also das Gitter, das wirklich gebaut</w:t>
+      </w:r>
+    </w:p>
+    <w:p>
+      <w:r>
+        <w:t>wurde (keine Neuberechnung). Vorher „Build Mesh“.</w:t>
+      </w:r>
+    </w:p>
+    <w:p>
+      <w:pPr>
+        <w:pStyle w:val="ListBullet"/>
+      </w:pPr>
+      <w:r>
+        <w:t xml:space="preserve">Alles in </w:t>
+      </w:r>
+      <w:r>
+        <w:rPr>
+          <w:b/>
+        </w:rPr>
+        <w:t>mm</w:t>
+      </w:r>
+      <w:r>
+        <w:t>, plus Zellzahl, minimale/maximale Zellgröße und die</w:t>
+      </w:r>
+    </w:p>
+    <w:p>
+      <w:r>
+        <w:t xml:space="preserve">FDTD-Domain. Zylindrische Netze exportieren </w:t>
+      </w:r>
+      <w:r>
+        <w:rPr>
+          <w:rFonts w:ascii="Consolas" w:hAnsi="Consolas"/>
+          <w:sz w:val="18"/>
+        </w:rPr>
+        <w:t>rho/phi/z</w:t>
+      </w:r>
+      <w:r>
+        <w:t>.</w:t>
+      </w:r>
+    </w:p>
+    <w:p>
+      <w:pPr>
+        <w:ind w:left="360"/>
+      </w:pPr>
+      <w:r>
+        <w:rPr>
+          <w:rFonts w:ascii="Consolas" w:hAnsi="Consolas"/>
+          <w:sz w:val="18"/>
+        </w:rPr>
+        <w:t>{</w:t>
+        <w:br/>
+        <w:t xml:space="preserve">  "format": "visualopenems-grid", "version": 1,</w:t>
+        <w:br/>
+        <w:t xml:space="preserve">  "unit": "mm", "source_unit": "mm", "coord_system": "cartesian",</w:t>
+        <w:br/>
+        <w:t xml:space="preserve">  "axes": [</w:t>
+        <w:br/>
+        <w:t xml:space="preserve">    {"name": "x", "lines": [0.0, 0.5, 1.0, 2.0],</w:t>
+        <w:br/>
+        <w:t xml:space="preserve">     "cells": 3, "cell_size_min": 0.5, "cell_size_max": 1.0}</w:t>
+        <w:br/>
+        <w:t xml:space="preserve">  ],</w:t>
+        <w:br/>
+        <w:t xml:space="preserve">  "shape": [3, 2, 2],</w:t>
+        <w:br/>
+        <w:t xml:space="preserve">  "domain": {"start": [0, 0, 0], "stop": [2, 3, 1.6]}</w:t>
+        <w:br/>
+        <w:t>}</w:t>
+      </w:r>
+    </w:p>
+    <w:p>
+      <w:pPr>
+        <w:pStyle w:val="Heading3"/>
+      </w:pPr>
+      <w:r>
+        <w:t>12.3 CSX XML</w:t>
+      </w:r>
+    </w:p>
+    <w:p>
+      <w:r>
+        <w:rPr>
+          <w:b/>
+        </w:rPr>
+        <w:t>Mesh → Export CSX XML…</w:t>
+      </w:r>
+      <w:r>
+        <w:t xml:space="preserve"> bzw. </w:t>
+      </w:r>
+      <w:r>
+        <w:rPr>
+          <w:b/>
+        </w:rPr>
+        <w:t>Open in AppCSXCAD (3D)…</w:t>
+      </w:r>
+    </w:p>
+    <w:p>
+      <w:r>
+        <w:t>Schreibt das komplette CSXCAD-Modell (Geometrie + Gitter, ohne Felddaten) für</w:t>
+      </w:r>
+    </w:p>
+    <w:p>
+      <w:r>
+        <w:t>AppCSXCAD oder ParaView — nützlich zur Kontrolle und zur Übergabe des Modells.</w:t>
+      </w:r>
+    </w:p>
+    <w:p>
+      <w:pPr>
+        <w:pStyle w:val="Heading3"/>
+      </w:pPr>
+      <w:r>
+        <w:t>12.4 Felddaten — VTK, .pvd, MP4</w:t>
+      </w:r>
+    </w:p>
+    <w:p>
+      <w:r>
+        <w:rPr>
+          <w:b/>
+        </w:rPr>
+        <w:t>Simulation → Export field dumps to VTK…</w:t>
+      </w:r>
+    </w:p>
+    <w:p>
+      <w:pPr>
+        <w:pStyle w:val="ListBullet"/>
+      </w:pPr>
+      <w:r>
+        <w:t xml:space="preserve">Pro Dump eine statische Datei </w:t>
+      </w:r>
+      <w:r>
+        <w:rPr>
+          <w:rFonts w:ascii="Consolas" w:hAnsi="Consolas"/>
+          <w:sz w:val="18"/>
+        </w:rPr>
+        <w:t>&lt;dump&gt;.vtr</w:t>
+      </w:r>
+      <w:r>
+        <w:t xml:space="preserve"> und — bei Zeitreihen — pro</w:t>
+      </w:r>
+    </w:p>
+    <w:p>
+      <w:r>
+        <w:t xml:space="preserve">gespeichertem Schritt </w:t>
+      </w:r>
+      <w:r>
+        <w:rPr>
+          <w:rFonts w:ascii="Consolas" w:hAnsi="Consolas"/>
+          <w:sz w:val="18"/>
+        </w:rPr>
+        <w:t>&lt;dump&gt;_0000.vtr</w:t>
+      </w:r>
+      <w:r>
+        <w:t xml:space="preserve"> … plus </w:t>
+      </w:r>
+      <w:r>
+        <w:rPr>
+          <w:rFonts w:ascii="Consolas" w:hAnsi="Consolas"/>
+          <w:sz w:val="18"/>
+        </w:rPr>
+        <w:t>&lt;dump&gt;.series.json</w:t>
+      </w:r>
+    </w:p>
+    <w:p>
+      <w:r>
+        <w:t>(Labels, Dateien, Zeiten/Frequenzen, Stride) für den eingebauten Viewer.</w:t>
+      </w:r>
+    </w:p>
+    <w:p>
+      <w:pPr>
+        <w:pStyle w:val="ListBullet"/>
+      </w:pPr>
+      <w:r>
+        <w:t xml:space="preserve">Zusätzlich eine </w:t>
+      </w:r>
+      <w:r>
+        <w:rPr>
+          <w:b/>
+        </w:rPr>
+        <w:t>ParaView-Collection `&lt;dump&gt;.pvd`</w:t>
+      </w:r>
+      <w:r>
+        <w:t>: in ParaView öffnen und</w:t>
+      </w:r>
+    </w:p>
+    <w:p>
+      <w:r>
+        <w:t xml:space="preserve">die ganze Serie aus </w:t>
+      </w:r>
+      <w:r>
+        <w:rPr>
+          <w:i/>
+        </w:rPr>
+        <w:t>einer</w:t>
+      </w:r>
+      <w:r>
+        <w:t xml:space="preserve"> Datei abspielen. Der Slider-Wert ist die</w:t>
+      </w:r>
+    </w:p>
+    <w:p>
+      <w:r>
+        <w:rPr>
+          <w:b/>
+        </w:rPr>
+        <w:t>physikalische</w:t>
+      </w:r>
+      <w:r>
+        <w:t xml:space="preserve"> Schrittposition (Zeit bei TD-Dumps, Frequenz bei FD-Dumps),</w:t>
+      </w:r>
+    </w:p>
+    <w:p>
+      <w:r>
+        <w:t xml:space="preserve">nicht der Schritt-Index. Die </w:t>
+      </w:r>
+      <w:r>
+        <w:rPr>
+          <w:rFonts w:ascii="Consolas" w:hAnsi="Consolas"/>
+          <w:sz w:val="18"/>
+        </w:rPr>
+        <w:t>.pvd</w:t>
+      </w:r>
+      <w:r>
+        <w:t xml:space="preserve"> wird aus dem Sidecar neu erzeugt, wenn eine</w:t>
+      </w:r>
+    </w:p>
+    <w:p>
+      <w:r>
+        <w:t>aktuelle Serie wiederverwendet wird — ältere Exporte werden so vollständig.</w:t>
+      </w:r>
+    </w:p>
+    <w:p>
+      <w:pPr>
+        <w:pStyle w:val="ListBullet"/>
+      </w:pPr>
+      <w:r>
+        <w:rPr>
+          <w:b/>
+        </w:rPr>
+        <w:t>Inkrementell</w:t>
+      </w:r>
+      <w:r>
+        <w:t>: Ausgaben, die neuer als ihr Dump sind, werden</w:t>
+      </w:r>
+    </w:p>
+    <w:p>
+      <w:r>
+        <w:t>wiederverwendet; ein zweiter Klick ist sofort fertig. Der Per-Step-Schalter</w:t>
+      </w:r>
+    </w:p>
+    <w:p>
+      <w:r>
+        <w:t xml:space="preserve">schreibt die Serie (viele Dateien), </w:t>
+      </w:r>
+      <w:r>
+        <w:rPr>
+          <w:rFonts w:ascii="Consolas" w:hAnsi="Consolas"/>
+          <w:sz w:val="18"/>
+        </w:rPr>
+        <w:t>step_stride</w:t>
+      </w:r>
+      <w:r>
+        <w:t xml:space="preserve"> behält nur jeden N-ten</w:t>
+      </w:r>
+    </w:p>
+    <w:p>
+      <w:r>
+        <w:t>Schritt.</w:t>
+      </w:r>
+    </w:p>
+    <w:p>
+      <w:pPr>
+        <w:pStyle w:val="ListBullet"/>
+      </w:pPr>
+      <w:r>
+        <w:t xml:space="preserve">Punktdaten: Skalar </w:t>
+      </w:r>
+      <w:r>
+        <w:rPr>
+          <w:rFonts w:ascii="Consolas" w:hAnsi="Consolas"/>
+          <w:sz w:val="18"/>
+        </w:rPr>
+        <w:t>magnitude</w:t>
+      </w:r>
+      <w:r>
+        <w:t xml:space="preserve"> (aktiv) und bei xyz-Dumps der Vektor </w:t>
+      </w:r>
+      <w:r>
+        <w:rPr>
+          <w:rFonts w:ascii="Consolas" w:hAnsi="Consolas"/>
+          <w:sz w:val="18"/>
+        </w:rPr>
+        <w:t>field</w:t>
+      </w:r>
+    </w:p>
+    <w:p>
+      <w:r>
+        <w:t>(Realteil), in rohen openEMS-SI-Einheiten (E in V/m …).</w:t>
+      </w:r>
+    </w:p>
+    <w:p>
+      <w:r>
+        <w:rPr>
+          <w:b/>
+        </w:rPr>
+        <w:t>Simulation → Export field video (MP4)…</w:t>
+      </w:r>
+      <w:r>
+        <w:t xml:space="preserve"> rendert die geladene Serie mit der</w:t>
+      </w:r>
+    </w:p>
+    <w:p>
+      <w:r>
+        <w:t xml:space="preserve">aktuellen Field-Viewer-Ansicht (fps aus </w:t>
+      </w:r>
+      <w:r>
+        <w:rPr>
+          <w:i/>
+        </w:rPr>
+        <w:t>Settings</w:t>
+      </w:r>
+      <w:r>
+        <w:t>).</w:t>
+      </w:r>
+    </w:p>
+    <w:p>
+      <w:pPr>
+        <w:pStyle w:val="Heading3"/>
+      </w:pPr>
+      <w:r>
+        <w:t>12.5 Netzwerkdaten — Touchstone</w:t>
+      </w:r>
+    </w:p>
+    <w:p>
+      <w:r>
+        <w:t xml:space="preserve">Der S-Params-Viewer schreibt </w:t>
+      </w:r>
+      <w:r>
+        <w:rPr>
+          <w:b/>
+        </w:rPr>
+        <w:t>Touchstone</w:t>
+      </w:r>
+      <w:r>
+        <w:t xml:space="preserve"> (</w:t>
+      </w:r>
+      <w:r>
+        <w:rPr>
+          <w:rFonts w:ascii="Consolas" w:hAnsi="Consolas"/>
+          <w:sz w:val="18"/>
+        </w:rPr>
+        <w:t>.s1p</w:t>
+      </w:r>
+      <w:r>
+        <w:t xml:space="preserve">, </w:t>
+      </w:r>
+      <w:r>
+        <w:rPr>
+          <w:rFonts w:ascii="Consolas" w:hAnsi="Consolas"/>
+          <w:sz w:val="18"/>
+        </w:rPr>
+        <w:t>.s2p</w:t>
+      </w:r>
+      <w:r>
+        <w:t>, …) — den Standard,</w:t>
+      </w:r>
+    </w:p>
+    <w:p>
+      <w:r>
+        <w:t xml:space="preserve">den CST und openEMS beide lesen. Ein FDTD-Lauf misst </w:t>
+      </w:r>
+      <w:r>
+        <w:rPr>
+          <w:b/>
+        </w:rPr>
+        <w:t>eine</w:t>
+      </w:r>
+      <w:r>
+        <w:t xml:space="preserve"> Spalte der</w:t>
+      </w:r>
+    </w:p>
+    <w:p>
+      <w:r>
+        <w:t>S-Matrix; die Touchstone-Datei entsteht erst, wenn die Matrix vollständig ist</w:t>
+      </w:r>
+    </w:p>
+    <w:p>
+      <w:r>
+        <w:t xml:space="preserve">(Teilmatrizen stehen nur in </w:t>
+      </w:r>
+      <w:r>
+        <w:rPr>
+          <w:rFonts w:ascii="Consolas" w:hAnsi="Consolas"/>
+          <w:sz w:val="18"/>
+        </w:rPr>
+        <w:t>sparams.json</w:t>
+      </w:r>
+      <w:r>
+        <w:t>). Für ein 2-Tor sind also beide</w:t>
+      </w:r>
+    </w:p>
+    <w:p>
+      <w:r>
+        <w:t>Erregungen nötig (</w:t>
+      </w:r>
+      <w:r>
+        <w:rPr>
+          <w:rFonts w:ascii="Consolas" w:hAnsi="Consolas"/>
+          <w:sz w:val="18"/>
+        </w:rPr>
+        <w:t>excite_port</w:t>
+      </w:r>
+      <w:r>
+        <w:t xml:space="preserve"> umschalten, Ergebnisse werden zusammengeführt).</w:t>
+      </w:r>
+    </w:p>
+    <w:p>
+      <w:pPr>
+        <w:pStyle w:val="Heading3"/>
+      </w:pPr>
+      <w:r>
+        <w:t>12.6 Bilder</w:t>
+      </w:r>
+    </w:p>
+    <w:p>
+      <w:r>
+        <w:t xml:space="preserve">Jeder Viewer (S-Params, Antenna, Field Viewer) exportiert </w:t>
+      </w:r>
+      <w:r>
+        <w:rPr>
+          <w:b/>
+        </w:rPr>
+        <w:t>PNG</w:t>
+      </w:r>
+      <w:r>
+        <w:t>.</w:t>
+      </w:r>
+    </w:p>
+    <w:p>
+      <w:pPr>
+        <w:pStyle w:val="Heading3"/>
+      </w:pPr>
+      <w:r>
+        <w:t>12.7 Übersicht</w:t>
+      </w:r>
+    </w:p>
+    <w:tbl>
+      <w:tblPr>
+        <w:tblStyle w:val="TableGrid"/>
+        <w:tblW w:type="auto" w:w="0"/>
+        <w:tblLook w:firstColumn="1" w:firstRow="1" w:lastColumn="0" w:lastRow="0" w:noHBand="0" w:noVBand="1" w:val="04A0"/>
+      </w:tblPr>
+      <w:tblGrid>
+        <w:gridCol w:w="2520"/>
+        <w:gridCol w:w="2520"/>
+        <w:gridCol w:w="2520"/>
+        <w:gridCol w:w="2520"/>
+      </w:tblGrid>
+      <w:tr>
+        <w:tc>
+          <w:tcPr>
+            <w:tcW w:type="dxa" w:w="2520"/>
+          </w:tcPr>
+          <w:p>
+            <w:r/>
+            <w:r>
+              <w:rPr>
+                <w:b/>
+              </w:rPr>
+              <w:t>---</w:t>
+            </w:r>
+          </w:p>
+        </w:tc>
+        <w:tc>
+          <w:tcPr>
+            <w:tcW w:type="dxa" w:w="2520"/>
+          </w:tcPr>
+          <w:p>
+            <w:r/>
+            <w:r>
+              <w:rPr>
+                <w:b/>
+              </w:rPr>
+              <w:t>---</w:t>
+            </w:r>
+          </w:p>
+        </w:tc>
+        <w:tc>
+          <w:tcPr>
+            <w:tcW w:type="dxa" w:w="2520"/>
+          </w:tcPr>
+          <w:p>
+            <w:r/>
+            <w:r>
+              <w:rPr>
+                <w:b/>
+              </w:rPr>
+              <w:t>---</w:t>
+            </w:r>
+          </w:p>
+        </w:tc>
+        <w:tc>
+          <w:tcPr>
+            <w:tcW w:type="dxa" w:w="2520"/>
+          </w:tcPr>
+          <w:p>
+            <w:r/>
+            <w:r>
+              <w:rPr>
+                <w:b/>
+              </w:rPr>
+              <w:t>---</w:t>
+            </w:r>
+          </w:p>
+        </w:tc>
+      </w:tr>
+      <w:tr>
+        <w:tc>
+          <w:tcPr>
+            <w:tcW w:type="dxa" w:w="2520"/>
+          </w:tcPr>
+          <w:p>
+            <w:r/>
+            <w:r>
+              <w:t>Geometrie</w:t>
+            </w:r>
+          </w:p>
+        </w:tc>
+        <w:tc>
+          <w:tcPr>
+            <w:tcW w:type="dxa" w:w="2520"/>
+          </w:tcPr>
+          <w:p>
+            <w:r/>
+            <w:r>
+              <w:t>STEP (mm)</w:t>
+            </w:r>
+          </w:p>
+        </w:tc>
+        <w:tc>
+          <w:tcPr>
+            <w:tcW w:type="dxa" w:w="2520"/>
+          </w:tcPr>
+          <w:p>
+            <w:r/>
+            <w:r>
+              <w:t>raus</w:t>
+            </w:r>
+          </w:p>
+        </w:tc>
+        <w:tc>
+          <w:tcPr>
+            <w:tcW w:type="dxa" w:w="2520"/>
+          </w:tcPr>
+          <w:p>
+            <w:r/>
+            <w:r>
+              <w:t>CAD, CST, FreeCAD</w:t>
+            </w:r>
+          </w:p>
+        </w:tc>
+      </w:tr>
+      <w:tr>
+        <w:tc>
+          <w:tcPr>
+            <w:tcW w:type="dxa" w:w="2520"/>
+          </w:tcPr>
+          <w:p>
+            <w:r/>
+            <w:r>
+              <w:t>Gitterlinien</w:t>
+            </w:r>
+          </w:p>
+        </w:tc>
+        <w:tc>
+          <w:tcPr>
+            <w:tcW w:type="dxa" w:w="2520"/>
+          </w:tcPr>
+          <w:p>
+            <w:r/>
+            <w:r>
+              <w:t>grid JSON (mm)</w:t>
+            </w:r>
+          </w:p>
+        </w:tc>
+        <w:tc>
+          <w:tcPr>
+            <w:tcW w:type="dxa" w:w="2520"/>
+          </w:tcPr>
+          <w:p>
+            <w:r/>
+            <w:r>
+              <w:t>raus</w:t>
+            </w:r>
+          </w:p>
+        </w:tc>
+        <w:tc>
+          <w:tcPr>
+            <w:tcW w:type="dxa" w:w="2520"/>
+          </w:tcPr>
+          <w:p>
+            <w:r/>
+            <w:r>
+              <w:t>CST-FDTD (Mesh.SetLines)</w:t>
+            </w:r>
+          </w:p>
+        </w:tc>
+      </w:tr>
+      <w:tr>
+        <w:tc>
+          <w:tcPr>
+            <w:tcW w:type="dxa" w:w="2520"/>
+          </w:tcPr>
+          <w:p>
+            <w:r/>
+            <w:r>
+              <w:t>S-Parameter</w:t>
+            </w:r>
+          </w:p>
+        </w:tc>
+        <w:tc>
+          <w:tcPr>
+            <w:tcW w:type="dxa" w:w="2520"/>
+          </w:tcPr>
+          <w:p>
+            <w:r/>
+            <w:r>
+              <w:t>Touchstone .sNp</w:t>
+            </w:r>
+          </w:p>
+        </w:tc>
+        <w:tc>
+          <w:tcPr>
+            <w:tcW w:type="dxa" w:w="2520"/>
+          </w:tcPr>
+          <w:p>
+            <w:r/>
+            <w:r>
+              <w:t>raus / rein</w:t>
+            </w:r>
+          </w:p>
+        </w:tc>
+        <w:tc>
+          <w:tcPr>
+            <w:tcW w:type="dxa" w:w="2520"/>
+          </w:tcPr>
+          <w:p>
+            <w:r/>
+            <w:r>
+              <w:t>CST, VNA, scikit-rf</w:t>
+            </w:r>
+          </w:p>
+        </w:tc>
+      </w:tr>
+      <w:tr>
+        <w:tc>
+          <w:tcPr>
+            <w:tcW w:type="dxa" w:w="2520"/>
+          </w:tcPr>
+          <w:p>
+            <w:r/>
+            <w:r>
+              <w:t>E/H-Feldvolumen</w:t>
+            </w:r>
+          </w:p>
+        </w:tc>
+        <w:tc>
+          <w:tcPr>
+            <w:tcW w:type="dxa" w:w="2520"/>
+          </w:tcPr>
+          <w:p>
+            <w:r/>
+            <w:r>
+              <w:t>VTK .vtr + .pvd</w:t>
+            </w:r>
+          </w:p>
+        </w:tc>
+        <w:tc>
+          <w:tcPr>
+            <w:tcW w:type="dxa" w:w="2520"/>
+          </w:tcPr>
+          <w:p>
+            <w:r/>
+            <w:r>
+              <w:t>raus</w:t>
+            </w:r>
+          </w:p>
+        </w:tc>
+        <w:tc>
+          <w:tcPr>
+            <w:tcW w:type="dxa" w:w="2520"/>
+          </w:tcPr>
+          <w:p>
+            <w:r/>
+            <w:r>
+              <w:t>ParaView</w:t>
+            </w:r>
+          </w:p>
+        </w:tc>
+      </w:tr>
+      <w:tr>
+        <w:tc>
+          <w:tcPr>
+            <w:tcW w:type="dxa" w:w="2520"/>
+          </w:tcPr>
+          <w:p>
+            <w:r/>
+            <w:r>
+              <w:t>Vollmodell (CSX)</w:t>
+            </w:r>
+          </w:p>
+        </w:tc>
+        <w:tc>
+          <w:tcPr>
+            <w:tcW w:type="dxa" w:w="2520"/>
+          </w:tcPr>
+          <w:p>
+            <w:r/>
+            <w:r>
+              <w:t>CSX XML</w:t>
+            </w:r>
+          </w:p>
+        </w:tc>
+        <w:tc>
+          <w:tcPr>
+            <w:tcW w:type="dxa" w:w="2520"/>
+          </w:tcPr>
+          <w:p>
+            <w:r/>
+            <w:r>
+              <w:t>raus</w:t>
+            </w:r>
+          </w:p>
+        </w:tc>
+        <w:tc>
+          <w:tcPr>
+            <w:tcW w:type="dxa" w:w="2520"/>
+          </w:tcPr>
+          <w:p>
+            <w:r/>
+            <w:r>
+              <w:t>AppCSXCAD</w:t>
+            </w:r>
+          </w:p>
+        </w:tc>
+      </w:tr>
+    </w:tbl>
+    <w:p/>
+    <w:p>
+      <w:pPr>
+        <w:pStyle w:val="Heading3"/>
+      </w:pPr>
+      <w:r>
+        <w:t>12.8 Grenzen</w:t>
+      </w:r>
+    </w:p>
+    <w:p>
+      <w:pPr>
+        <w:pStyle w:val="ListBullet"/>
+      </w:pPr>
+      <w:r>
+        <w:rPr>
+          <w:b/>
+        </w:rPr>
+        <w:t>STEP transportiert nur Geometrie</w:t>
+      </w:r>
+      <w:r>
+        <w:t xml:space="preserve"> — keine Materialien, Ports oder</w:t>
+      </w:r>
+    </w:p>
+    <w:p>
+      <w:r>
+        <w:t>Randbedingungen. Diese in CST über die erhaltenen Objektnamen zuweisen.</w:t>
+      </w:r>
+    </w:p>
+    <w:p>
+      <w:pPr>
+        <w:pStyle w:val="ListBullet"/>
+      </w:pPr>
+      <w:r>
+        <w:rPr>
+          <w:b/>
+        </w:rPr>
+        <w:t>Kein Felddaten-Import</w:t>
+      </w:r>
+      <w:r>
+        <w:t>: openEMS-Dumps sind HDF5, CST exportiert eigene</w:t>
+      </w:r>
+    </w:p>
+    <w:p>
+      <w:r>
+        <w:t>Formate. Verglichen wird über S-Parameter / Fernfeld oder über VTK in</w:t>
+      </w:r>
+    </w:p>
+    <w:p>
+      <w:r>
+        <w:t>ParaView.</w:t>
+      </w:r>
+    </w:p>
+    <w:p>
+      <w:pPr>
+        <w:pStyle w:val="ListBullet"/>
+      </w:pPr>
+      <w:r>
+        <w:t xml:space="preserve">Einheiten werden beim Export nach </w:t>
+      </w:r>
+      <w:r>
+        <w:rPr>
+          <w:b/>
+        </w:rPr>
+        <w:t>mm</w:t>
+      </w:r>
+      <w:r>
+        <w:t xml:space="preserve"> umgerechnet (STEP und Gitter-JSON);</w:t>
+      </w:r>
+    </w:p>
+    <w:p>
+      <w:r>
+        <w:t xml:space="preserve">Touchstone bleibt in Hz. Quelle ist die Zeichnungseinheit aus </w:t>
+      </w:r>
+      <w:r>
+        <w:rPr>
+          <w:i/>
+        </w:rPr>
+        <w:t>Mesh</w:t>
+      </w:r>
+      <w:r>
+        <w:t>.</w:t>
+      </w:r>
+    </w:p>
     <w:p/>
     <w:p>
       <w:r>

</xml_diff>

<commit_message>
docs(ui): add mesh viewer and field pictures to the manual
Section 6.2 shows the Mesh Viewer (XY slice at the patch plane: grid, staircase chamfers, port, NF2FF box, domain) from a real mesh build of the GPS project. Section 7.2 adds the E-field slice from the Et_substrate dump. Figures renumbered in reading order (1 mesh, 2-5 evaluation tab, 6 field).
</commit_message>
<xml_diff>
--- a/docs/ANLEITUNG_DE.docx
+++ b/docs/ANLEITUNG_DE.docx
@@ -5453,392 +5453,11 @@
       </w:r>
     </w:p>
     <w:p>
-      <w:r>
-        <w:t>────────────────────────────────────────────────────────────</w:t>
-      </w:r>
-    </w:p>
-    <w:p>
-      <w:pPr>
-        <w:pStyle w:val="Heading2"/>
-      </w:pPr>
-      <w:r>
-        <w:t>7. Auswertung</w:t>
-      </w:r>
-    </w:p>
-    <w:p>
-      <w:pPr>
-        <w:pStyle w:val="ListNumber"/>
-      </w:pPr>
-      <w:r>
-        <w:rPr>
-          <w:b/>
-        </w:rPr>
-        <w:t>S-Params Viewer</w:t>
-      </w:r>
-    </w:p>
-    <w:p>
-      <w:pPr>
-        <w:pStyle w:val="ListBullet"/>
-      </w:pPr>
-      <w:r>
-        <w:t>S11 / S21, dB, Phase</w:t>
-      </w:r>
-    </w:p>
-    <w:p>
-      <w:pPr>
-        <w:pStyle w:val="ListBullet"/>
-      </w:pPr>
-      <w:r>
-        <w:t>Marker: Frequenz, S, Γ, Z/Y, VSWR, RL</w:t>
-      </w:r>
-    </w:p>
-    <w:p>
-      <w:pPr>
-        <w:pStyle w:val="ListBullet"/>
-      </w:pPr>
-      <w:r>
-        <w:t>Smith-Chart: Z- und Y-Marker</w:t>
-      </w:r>
-    </w:p>
-    <w:p>
-      <w:pPr>
-        <w:pStyle w:val="ListNumber"/>
-      </w:pPr>
-      <w:r>
-        <w:rPr>
-          <w:b/>
-        </w:rPr>
-        <w:t>Pop-out S-Graph</w:t>
-      </w:r>
-      <w:r>
-        <w:t xml:space="preserve"> — Plot in Extra-Fenster</w:t>
-      </w:r>
-    </w:p>
-    <w:p>
-      <w:pPr>
-        <w:pStyle w:val="ListNumber"/>
-      </w:pPr>
-      <w:r>
-        <w:rPr>
-          <w:b/>
-        </w:rPr>
-        <w:t>Antenna</w:t>
-      </w:r>
-      <w:r>
-        <w:t xml:space="preserve">-Tab / </w:t>
-      </w:r>
-      <w:r>
-        <w:rPr>
-          <w:b/>
-        </w:rPr>
-        <w:t>Simulation → Antenna Pattern Viewer</w:t>
-      </w:r>
-      <w:r>
-        <w:t xml:space="preserve"> — NF2FF-Fernfeld:</w:t>
-      </w:r>
-    </w:p>
-    <w:p>
-      <w:r>
-        <w:t>3D-Polar des Gewinns, 2D-Polarschnitte (E/H-Ebene), Direktivität/Gain/η</w:t>
-      </w:r>
-    </w:p>
-    <w:p>
-      <w:r>
-        <w:t xml:space="preserve">über Frequenz; </w:t>
-      </w:r>
-      <w:r>
-        <w:rPr>
-          <w:b/>
-        </w:rPr>
-        <w:t>Pop-out Antenna Graph</w:t>
-      </w:r>
-      <w:r>
-        <w:t xml:space="preserve"> = Extra-Fenster; Feld-Dumps</w:t>
-      </w:r>
-    </w:p>
-    <w:p>
-      <w:r>
-        <w:t xml:space="preserve">weiterhin unter </w:t>
-      </w:r>
-      <w:r>
-        <w:rPr>
-          <w:rFonts w:ascii="Consolas" w:hAnsi="Consolas"/>
-          <w:sz w:val="18"/>
-        </w:rPr>
-        <w:t>work/&lt;projekt&gt;/fields/</w:t>
-      </w:r>
-      <w:r>
-        <w:t xml:space="preserve"> (S-Parameter in</w:t>
-      </w:r>
-    </w:p>
-    <w:p>
-      <w:r>
-        <w:rPr>
-          <w:rFonts w:ascii="Consolas" w:hAnsi="Consolas"/>
-          <w:sz w:val="18"/>
-        </w:rPr>
-        <w:t>work/&lt;projekt&gt;/sparams/</w:t>
-      </w:r>
-      <w:r>
-        <w:t xml:space="preserve">, NF2FF in </w:t>
-      </w:r>
-      <w:r>
-        <w:rPr>
-          <w:rFonts w:ascii="Consolas" w:hAnsi="Consolas"/>
-          <w:sz w:val="18"/>
-        </w:rPr>
-        <w:t>work/&lt;projekt&gt;/nf2ff/</w:t>
-      </w:r>
-      <w:r>
-        <w:t>).</w:t>
-      </w:r>
-    </w:p>
-    <w:p>
-      <w:r>
-        <w:rPr>
-          <w:b/>
-        </w:rPr>
-        <w:t>Polarization…</w:t>
-      </w:r>
-      <w:r>
-        <w:t xml:space="preserve"> (Button im Antenna-Tab) zeigt Größen aus demselben</w:t>
-      </w:r>
-    </w:p>
-    <w:p>
-      <w:r>
-        <w:t xml:space="preserve">NF2FF-Ergebnis — ohne neuen Lauf: </w:t>
-      </w:r>
-      <w:r>
-        <w:rPr>
-          <w:b/>
-        </w:rPr>
-        <w:t>Axial Ratio</w:t>
-      </w:r>
-      <w:r>
-        <w:t xml:space="preserve"> (dB, Drehsinn</w:t>
-      </w:r>
-    </w:p>
-    <w:p>
-      <w:r>
-        <w:t xml:space="preserve">RHCP/LHCP, Tilt; linear → „linear") und </w:t>
-      </w:r>
-      <w:r>
-        <w:rPr>
-          <w:b/>
-        </w:rPr>
-        <w:t>Phase Center</w:t>
-      </w:r>
-      <w:r>
-        <w:t xml:space="preserve"> (Δx/Δy/Δz in mm</w:t>
-      </w:r>
-    </w:p>
-    <w:p>
-      <w:r>
-        <w:t>plus RMS des Phasen-Fits) relativ zum NF2FF-Boxmittelpunkt. Der</w:t>
-      </w:r>
-    </w:p>
-    <w:p>
-      <w:r>
-        <w:t>Phase-Center-Wert ist eine Schätzung für einen klaren Hauptstrahl; passt</w:t>
-      </w:r>
-    </w:p>
-    <w:p>
-      <w:r>
-        <w:t>der Fit nicht, steht „—" mit „phase not well-defined". Details:</w:t>
-      </w:r>
-    </w:p>
-    <w:p>
-      <w:r>
-        <w:t>F1 → „Polarization &amp; Phase Center".</w:t>
-      </w:r>
-    </w:p>
-    <w:p>
-      <w:pPr>
-        <w:pStyle w:val="ListNumber"/>
-      </w:pPr>
-      <w:r>
-        <w:rPr>
-          <w:b/>
-        </w:rPr>
-        <w:t>2-Port (S2P)</w:t>
-      </w:r>
-      <w:r>
-        <w:t xml:space="preserve"> — ein FDTD-Lauf misst </w:t>
-      </w:r>
-      <w:r>
-        <w:rPr>
-          <w:b/>
-        </w:rPr>
-        <w:t>eine</w:t>
-      </w:r>
-      <w:r>
-        <w:t xml:space="preserve"> Spalte der S-Matrix (für 2 Ports:</w:t>
-      </w:r>
-    </w:p>
-    <w:p>
-      <w:r>
-        <w:t>S11 + S21). Weitere Spalten brauchen weitere Läufe mit anderem erregtem Port</w:t>
-      </w:r>
-    </w:p>
-    <w:p>
-      <w:r>
-        <w:t>(</w:t>
-      </w:r>
-      <w:r>
-        <w:rPr>
-          <w:rFonts w:ascii="Consolas" w:hAnsi="Consolas"/>
-          <w:sz w:val="18"/>
-        </w:rPr>
-        <w:t>excite_port</w:t>
-      </w:r>
-      <w:r>
-        <w:t xml:space="preserve"> umschalten); die JSON-Ergebnisse werden danach zusammengeführt —</w:t>
-      </w:r>
-    </w:p>
-    <w:p>
-      <w:r>
-        <w:t xml:space="preserve">Beispiel: </w:t>
-      </w:r>
-      <w:r>
-        <w:rPr>
-          <w:rFonts w:ascii="Consolas" w:hAnsi="Consolas"/>
-          <w:sz w:val="18"/>
-        </w:rPr>
-        <w:t>examples\run_pcb_filter_example.py</w:t>
-      </w:r>
-      <w:r>
-        <w:t>.</w:t>
-      </w:r>
-    </w:p>
-    <w:p>
-      <w:r>
-        <w:t xml:space="preserve">Nicht gemessene Einträge bleiben leer (NaN) in </w:t>
-      </w:r>
-      <w:r>
-        <w:rPr>
-          <w:rFonts w:ascii="Consolas" w:hAnsi="Consolas"/>
-          <w:sz w:val="18"/>
-        </w:rPr>
-        <w:t>sparams.json</w:t>
-      </w:r>
-      <w:r>
-        <w:t>, die Touchstone-Datei</w:t>
-      </w:r>
-    </w:p>
-    <w:p>
-      <w:r>
-        <w:t>(</w:t>
-      </w:r>
-      <w:r>
-        <w:rPr>
-          <w:rFonts w:ascii="Consolas" w:hAnsi="Consolas"/>
-          <w:sz w:val="18"/>
-        </w:rPr>
-        <w:t>.s2p</w:t>
-      </w:r>
-      <w:r>
-        <w:t>) entsteht erst, wenn die Matrix vollständig ist.</w:t>
-      </w:r>
-    </w:p>
-    <w:p>
-      <w:pPr>
-        <w:pStyle w:val="ListNumber"/>
-      </w:pPr>
-      <w:r>
-        <w:rPr>
-          <w:b/>
-        </w:rPr>
-        <w:t>Field Viewer</w:t>
-      </w:r>
-      <w:r>
-        <w:t xml:space="preserve"> — 3D-Ansicht der Felddumps (F1 für die Hilfe). Die</w:t>
-      </w:r>
-    </w:p>
-    <w:p>
-      <w:r>
-        <w:t xml:space="preserve">Vektor-Pfeile („Vectors") </w:t>
-      </w:r>
-      <w:r>
-        <w:rPr>
-          <w:b/>
-        </w:rPr>
-        <w:t>ersetzen</w:t>
-      </w:r>
-      <w:r>
-        <w:t xml:space="preserve"> die farbige Felddarstellung</w:t>
-      </w:r>
-    </w:p>
-    <w:p>
-      <w:r>
-        <w:t>(ParaView-Stil), damit keine opake Schnitt-/Oberflächenebene die Pfeile</w:t>
-      </w:r>
-    </w:p>
-    <w:p>
-      <w:r>
-        <w:t>verdeckt; mit „field underneath" läßt sich die Überlagerung wieder</w:t>
-      </w:r>
-    </w:p>
-    <w:p>
-      <w:r>
-        <w:t>einschalten. Beim manuellen Durchschalten einer Serie meldet die</w:t>
-      </w:r>
-    </w:p>
-    <w:p>
-      <w:r>
-        <w:t>Schritt-Anzeige, wie viele Pfeile sich gegenüber dem vorigen Schritt gedreht</w:t>
-      </w:r>
-    </w:p>
-    <w:p>
-      <w:r>
-        <w:t>haben — damit ist sofort sichtbar, ob die Pfeile dem Feld wirklich folgen.</w:t>
-      </w:r>
-    </w:p>
-    <w:p>
-      <w:r>
-        <w:t>Bei ausgeschaltetem „same length" zeigt die Pfeillänge die Amplitude; die</w:t>
-      </w:r>
-    </w:p>
-    <w:p>
-      <w:r>
-        <w:t>Referenz wird einmal über die ganze Serie gemessen, die Längen sind also</w:t>
-      </w:r>
-    </w:p>
-    <w:p>
-      <w:r>
-        <w:t>von Bild zu Bild vergleichbar.</w:t>
-      </w:r>
-    </w:p>
-    <w:p>
-      <w:r>
-        <w:t>Der Export schreibt zusätzlich eine ParaView-Collection (</w:t>
-      </w:r>
-      <w:r>
-        <w:rPr>
-          <w:rFonts w:ascii="Consolas" w:hAnsi="Consolas"/>
-          <w:sz w:val="18"/>
-        </w:rPr>
-        <w:t>&lt;dump&gt;.pvd</w:t>
-      </w:r>
-      <w:r>
-        <w:t>) neben</w:t>
-      </w:r>
-    </w:p>
-    <w:p>
-      <w:r>
-        <w:t>die Schritt-Dateien, damit die ganze Serie in ParaView aus einer Datei läuft</w:t>
-      </w:r>
-    </w:p>
-    <w:p>
-      <w:r>
-        <w:t>— siehe §12.4.</w:t>
-      </w:r>
-    </w:p>
-    <w:p>
       <w:pPr>
         <w:pStyle w:val="Heading3"/>
       </w:pPr>
       <w:r>
-        <w:t>7.1 Antenna-Tab in Bildern</w:t>
+        <w:t>6.2 Mesh-Viewer</w:t>
       </w:r>
     </w:p>
     <w:p>
@@ -5857,7 +5476,7 @@
               <a:graphicData uri="http://schemas.openxmlformats.org/drawingml/2006/picture">
                 <pic:pic>
                   <pic:nvPicPr>
-                    <pic:cNvPr id="0" name="antenna_tab_polar.png"/>
+                    <pic:cNvPr id="0" name="mesh_viewer.png"/>
                     <pic:cNvPicPr/>
                   </pic:nvPicPr>
                   <pic:blipFill>
@@ -5885,10 +5504,399 @@
         <w:rPr>
           <w:b/>
         </w:rPr>
-        <w:t>Abb. 1 — Antenna-Tab, H-Ebene.</w:t>
-      </w:r>
-      <w:r>
-        <w:t xml:space="preserve"> Links die gefundenen NF2FF-Ergebnisse und der Details-Block (Dmax, Gmax, η, Prad, Raster), rechts der Polarschnitt mit dBi-Ringen. Rechtsklick auf den Plot öffnet das Analyse-Menü (HPBW, Vor-Rück-Verhältnis, Marker, Pop-out). Beispiel: der 2,45-GHz-Patch aus §2.2.</w:t>
+        <w:t>Abb. 1 — Mesh-Viewer, XY-Schnitt bei z = 1,6 mm.</w:t>
+      </w:r>
+      <w:r>
+        <w:t xml:space="preserve"> Das Gitter erscheint als Linien, die Geometrie als Flächen: 75-mm-Board (blau), Patch mit den beiden Treppen-Fasen (orange), Port (rot), NF2FF-Box (violett gestrichelt) und Rechen-Domain (schwarz gestrichelt). Man sieht, wie die Zellen über dem Patch feiner werden und nach außen auf die maximal erlaubte Zellgröße wachsen. Der Schieber neben „Plane" legt den Schnitt, „Mesh grid" blendet das Gitter, „Cell sizes" färbt die Zellgrößen, „Overview" zeigt die 3D-Ansicht. Rechtsklick auf eine markierte Zelle öffnet die Reparatur-Aktionen aus §6.1.</w:t>
+      </w:r>
+    </w:p>
+    <w:p>
+      <w:r>
+        <w:t>────────────────────────────────────────────────────────────</w:t>
+      </w:r>
+    </w:p>
+    <w:p>
+      <w:pPr>
+        <w:pStyle w:val="Heading2"/>
+      </w:pPr>
+      <w:r>
+        <w:t>7. Auswertung</w:t>
+      </w:r>
+    </w:p>
+    <w:p>
+      <w:pPr>
+        <w:pStyle w:val="ListNumber"/>
+      </w:pPr>
+      <w:r>
+        <w:rPr>
+          <w:b/>
+        </w:rPr>
+        <w:t>S-Params Viewer</w:t>
+      </w:r>
+    </w:p>
+    <w:p>
+      <w:pPr>
+        <w:pStyle w:val="ListBullet"/>
+      </w:pPr>
+      <w:r>
+        <w:t>S11 / S21, dB, Phase</w:t>
+      </w:r>
+    </w:p>
+    <w:p>
+      <w:pPr>
+        <w:pStyle w:val="ListBullet"/>
+      </w:pPr>
+      <w:r>
+        <w:t>Marker: Frequenz, S, Γ, Z/Y, VSWR, RL</w:t>
+      </w:r>
+    </w:p>
+    <w:p>
+      <w:pPr>
+        <w:pStyle w:val="ListBullet"/>
+      </w:pPr>
+      <w:r>
+        <w:t>Smith-Chart: Z- und Y-Marker</w:t>
+      </w:r>
+    </w:p>
+    <w:p>
+      <w:pPr>
+        <w:pStyle w:val="ListNumber"/>
+      </w:pPr>
+      <w:r>
+        <w:rPr>
+          <w:b/>
+        </w:rPr>
+        <w:t>Pop-out S-Graph</w:t>
+      </w:r>
+      <w:r>
+        <w:t xml:space="preserve"> — Plot in Extra-Fenster</w:t>
+      </w:r>
+    </w:p>
+    <w:p>
+      <w:pPr>
+        <w:pStyle w:val="ListNumber"/>
+      </w:pPr>
+      <w:r>
+        <w:rPr>
+          <w:b/>
+        </w:rPr>
+        <w:t>Antenna</w:t>
+      </w:r>
+      <w:r>
+        <w:t xml:space="preserve">-Tab / </w:t>
+      </w:r>
+      <w:r>
+        <w:rPr>
+          <w:b/>
+        </w:rPr>
+        <w:t>Simulation → Antenna Pattern Viewer</w:t>
+      </w:r>
+      <w:r>
+        <w:t xml:space="preserve"> — NF2FF-Fernfeld:</w:t>
+      </w:r>
+    </w:p>
+    <w:p>
+      <w:r>
+        <w:t>3D-Polar des Gewinns, 2D-Polarschnitte (E/H-Ebene), Direktivität/Gain/η</w:t>
+      </w:r>
+    </w:p>
+    <w:p>
+      <w:r>
+        <w:t xml:space="preserve">über Frequenz; </w:t>
+      </w:r>
+      <w:r>
+        <w:rPr>
+          <w:b/>
+        </w:rPr>
+        <w:t>Pop-out Antenna Graph</w:t>
+      </w:r>
+      <w:r>
+        <w:t xml:space="preserve"> = Extra-Fenster; Feld-Dumps</w:t>
+      </w:r>
+    </w:p>
+    <w:p>
+      <w:r>
+        <w:t xml:space="preserve">weiterhin unter </w:t>
+      </w:r>
+      <w:r>
+        <w:rPr>
+          <w:rFonts w:ascii="Consolas" w:hAnsi="Consolas"/>
+          <w:sz w:val="18"/>
+        </w:rPr>
+        <w:t>work/&lt;projekt&gt;/fields/</w:t>
+      </w:r>
+      <w:r>
+        <w:t xml:space="preserve"> (S-Parameter in</w:t>
+      </w:r>
+    </w:p>
+    <w:p>
+      <w:r>
+        <w:rPr>
+          <w:rFonts w:ascii="Consolas" w:hAnsi="Consolas"/>
+          <w:sz w:val="18"/>
+        </w:rPr>
+        <w:t>work/&lt;projekt&gt;/sparams/</w:t>
+      </w:r>
+      <w:r>
+        <w:t xml:space="preserve">, NF2FF in </w:t>
+      </w:r>
+      <w:r>
+        <w:rPr>
+          <w:rFonts w:ascii="Consolas" w:hAnsi="Consolas"/>
+          <w:sz w:val="18"/>
+        </w:rPr>
+        <w:t>work/&lt;projekt&gt;/nf2ff/</w:t>
+      </w:r>
+      <w:r>
+        <w:t>).</w:t>
+      </w:r>
+    </w:p>
+    <w:p>
+      <w:r>
+        <w:rPr>
+          <w:b/>
+        </w:rPr>
+        <w:t>Polarization…</w:t>
+      </w:r>
+      <w:r>
+        <w:t xml:space="preserve"> (Button im Antenna-Tab) zeigt Größen aus demselben</w:t>
+      </w:r>
+    </w:p>
+    <w:p>
+      <w:r>
+        <w:t xml:space="preserve">NF2FF-Ergebnis — ohne neuen Lauf: </w:t>
+      </w:r>
+      <w:r>
+        <w:rPr>
+          <w:b/>
+        </w:rPr>
+        <w:t>Axial Ratio</w:t>
+      </w:r>
+      <w:r>
+        <w:t xml:space="preserve"> (dB, Drehsinn</w:t>
+      </w:r>
+    </w:p>
+    <w:p>
+      <w:r>
+        <w:t xml:space="preserve">RHCP/LHCP, Tilt; linear → „linear") und </w:t>
+      </w:r>
+      <w:r>
+        <w:rPr>
+          <w:b/>
+        </w:rPr>
+        <w:t>Phase Center</w:t>
+      </w:r>
+      <w:r>
+        <w:t xml:space="preserve"> (Δx/Δy/Δz in mm</w:t>
+      </w:r>
+    </w:p>
+    <w:p>
+      <w:r>
+        <w:t>plus RMS des Phasen-Fits) relativ zum NF2FF-Boxmittelpunkt. Der</w:t>
+      </w:r>
+    </w:p>
+    <w:p>
+      <w:r>
+        <w:t>Phase-Center-Wert ist eine Schätzung für einen klaren Hauptstrahl; passt</w:t>
+      </w:r>
+    </w:p>
+    <w:p>
+      <w:r>
+        <w:t>der Fit nicht, steht „—" mit „phase not well-defined". Details:</w:t>
+      </w:r>
+    </w:p>
+    <w:p>
+      <w:r>
+        <w:t>F1 → „Polarization &amp; Phase Center".</w:t>
+      </w:r>
+    </w:p>
+    <w:p>
+      <w:pPr>
+        <w:pStyle w:val="ListNumber"/>
+      </w:pPr>
+      <w:r>
+        <w:rPr>
+          <w:b/>
+        </w:rPr>
+        <w:t>2-Port (S2P)</w:t>
+      </w:r>
+      <w:r>
+        <w:t xml:space="preserve"> — ein FDTD-Lauf misst </w:t>
+      </w:r>
+      <w:r>
+        <w:rPr>
+          <w:b/>
+        </w:rPr>
+        <w:t>eine</w:t>
+      </w:r>
+      <w:r>
+        <w:t xml:space="preserve"> Spalte der S-Matrix (für 2 Ports:</w:t>
+      </w:r>
+    </w:p>
+    <w:p>
+      <w:r>
+        <w:t>S11 + S21). Weitere Spalten brauchen weitere Läufe mit anderem erregtem Port</w:t>
+      </w:r>
+    </w:p>
+    <w:p>
+      <w:r>
+        <w:t>(</w:t>
+      </w:r>
+      <w:r>
+        <w:rPr>
+          <w:rFonts w:ascii="Consolas" w:hAnsi="Consolas"/>
+          <w:sz w:val="18"/>
+        </w:rPr>
+        <w:t>excite_port</w:t>
+      </w:r>
+      <w:r>
+        <w:t xml:space="preserve"> umschalten); die JSON-Ergebnisse werden danach zusammengeführt —</w:t>
+      </w:r>
+    </w:p>
+    <w:p>
+      <w:r>
+        <w:t xml:space="preserve">Beispiel: </w:t>
+      </w:r>
+      <w:r>
+        <w:rPr>
+          <w:rFonts w:ascii="Consolas" w:hAnsi="Consolas"/>
+          <w:sz w:val="18"/>
+        </w:rPr>
+        <w:t>examples\run_pcb_filter_example.py</w:t>
+      </w:r>
+      <w:r>
+        <w:t>.</w:t>
+      </w:r>
+    </w:p>
+    <w:p>
+      <w:r>
+        <w:t xml:space="preserve">Nicht gemessene Einträge bleiben leer (NaN) in </w:t>
+      </w:r>
+      <w:r>
+        <w:rPr>
+          <w:rFonts w:ascii="Consolas" w:hAnsi="Consolas"/>
+          <w:sz w:val="18"/>
+        </w:rPr>
+        <w:t>sparams.json</w:t>
+      </w:r>
+      <w:r>
+        <w:t>, die Touchstone-Datei</w:t>
+      </w:r>
+    </w:p>
+    <w:p>
+      <w:r>
+        <w:t>(</w:t>
+      </w:r>
+      <w:r>
+        <w:rPr>
+          <w:rFonts w:ascii="Consolas" w:hAnsi="Consolas"/>
+          <w:sz w:val="18"/>
+        </w:rPr>
+        <w:t>.s2p</w:t>
+      </w:r>
+      <w:r>
+        <w:t>) entsteht erst, wenn die Matrix vollständig ist.</w:t>
+      </w:r>
+    </w:p>
+    <w:p>
+      <w:pPr>
+        <w:pStyle w:val="ListNumber"/>
+      </w:pPr>
+      <w:r>
+        <w:rPr>
+          <w:b/>
+        </w:rPr>
+        <w:t>Field Viewer</w:t>
+      </w:r>
+      <w:r>
+        <w:t xml:space="preserve"> — 3D-Ansicht der Felddumps (F1 für die Hilfe). Die</w:t>
+      </w:r>
+    </w:p>
+    <w:p>
+      <w:r>
+        <w:t xml:space="preserve">Vektor-Pfeile („Vectors") </w:t>
+      </w:r>
+      <w:r>
+        <w:rPr>
+          <w:b/>
+        </w:rPr>
+        <w:t>ersetzen</w:t>
+      </w:r>
+      <w:r>
+        <w:t xml:space="preserve"> die farbige Felddarstellung</w:t>
+      </w:r>
+    </w:p>
+    <w:p>
+      <w:r>
+        <w:t>(ParaView-Stil), damit keine opake Schnitt-/Oberflächenebene die Pfeile</w:t>
+      </w:r>
+    </w:p>
+    <w:p>
+      <w:r>
+        <w:t>verdeckt; mit „field underneath" läßt sich die Überlagerung wieder</w:t>
+      </w:r>
+    </w:p>
+    <w:p>
+      <w:r>
+        <w:t>einschalten. Beim manuellen Durchschalten einer Serie meldet die</w:t>
+      </w:r>
+    </w:p>
+    <w:p>
+      <w:r>
+        <w:t>Schritt-Anzeige, wie viele Pfeile sich gegenüber dem vorigen Schritt gedreht</w:t>
+      </w:r>
+    </w:p>
+    <w:p>
+      <w:r>
+        <w:t>haben — damit ist sofort sichtbar, ob die Pfeile dem Feld wirklich folgen.</w:t>
+      </w:r>
+    </w:p>
+    <w:p>
+      <w:r>
+        <w:t>Bei ausgeschaltetem „same length" zeigt die Pfeillänge die Amplitude; die</w:t>
+      </w:r>
+    </w:p>
+    <w:p>
+      <w:r>
+        <w:t>Referenz wird einmal über die ganze Serie gemessen, die Längen sind also</w:t>
+      </w:r>
+    </w:p>
+    <w:p>
+      <w:r>
+        <w:t>von Bild zu Bild vergleichbar.</w:t>
+      </w:r>
+    </w:p>
+    <w:p>
+      <w:r>
+        <w:t>Der Export schreibt zusätzlich eine ParaView-Collection (</w:t>
+      </w:r>
+      <w:r>
+        <w:rPr>
+          <w:rFonts w:ascii="Consolas" w:hAnsi="Consolas"/>
+          <w:sz w:val="18"/>
+        </w:rPr>
+        <w:t>&lt;dump&gt;.pvd</w:t>
+      </w:r>
+      <w:r>
+        <w:t>) neben</w:t>
+      </w:r>
+    </w:p>
+    <w:p>
+      <w:r>
+        <w:t>die Schritt-Dateien, damit die ganze Serie in ParaView aus einer Datei läuft</w:t>
+      </w:r>
+    </w:p>
+    <w:p>
+      <w:r>
+        <w:t>— siehe §12.4.</w:t>
+      </w:r>
+    </w:p>
+    <w:p>
+      <w:pPr>
+        <w:pStyle w:val="Heading3"/>
+      </w:pPr>
+      <w:r>
+        <w:t>7.1 Antenna-Tab in Bildern</w:t>
       </w:r>
     </w:p>
     <w:p>
@@ -5907,7 +5915,7 @@
               <a:graphicData uri="http://schemas.openxmlformats.org/drawingml/2006/picture">
                 <pic:pic>
                   <pic:nvPicPr>
-                    <pic:cNvPr id="0" name="antenna_ar_cut.png"/>
+                    <pic:cNvPr id="0" name="antenna_tab_polar.png"/>
                     <pic:cNvPicPr/>
                   </pic:nvPicPr>
                   <pic:blipFill>
@@ -5935,10 +5943,10 @@
         <w:rPr>
           <w:b/>
         </w:rPr>
-        <w:t>Abb. 2 — Plottyp „Axial Ratio (theta cut)".</w:t>
-      </w:r>
-      <w:r>
-        <w:t xml:space="preserve"> AR über θ bei wählbarem Azimut (Wähler „AR φ" in der Plot-Toolbar, 0…315°). Das grüne Band ist der Bereich AR ≤ 3 dB; Punktlinie und Text nennen die größte Auslenkung ab Boresight, die diese Grenze noch einhält. Beispiel: GPS-L1-Patch bei 1,57542 GHz — 1,70 dB bei θ = 0°, ≤ 3 dB bis θ = 62°. Beim linear polarisierten 2,45-GHz-Beispiel liegt der AR durchgehend über 10 dB; dort taugt der Schnitt nur als Kontrolle.</w:t>
+        <w:t>Abb. 2 — Antenna-Tab, H-Ebene.</w:t>
+      </w:r>
+      <w:r>
+        <w:t xml:space="preserve"> Links die gefundenen NF2FF-Ergebnisse und der Details-Block (Dmax, Gmax, η, Prad, Raster), rechts der Polarschnitt mit dBi-Ringen. Rechtsklick auf den Plot öffnet das Analyse-Menü (HPBW, Vor-Rück-Verhältnis, Marker, Pop-out). Beispiel: der 2,45-GHz-Patch aus §2.2.</w:t>
       </w:r>
     </w:p>
     <w:p>
@@ -5957,7 +5965,7 @@
               <a:graphicData uri="http://schemas.openxmlformats.org/drawingml/2006/picture">
                 <pic:pic>
                   <pic:nvPicPr>
-                    <pic:cNvPr id="0" name="antenna_3d_pattern.png"/>
+                    <pic:cNvPr id="0" name="antenna_ar_cut.png"/>
                     <pic:cNvPicPr/>
                   </pic:nvPicPr>
                   <pic:blipFill>
@@ -5985,10 +5993,10 @@
         <w:rPr>
           <w:b/>
         </w:rPr>
-        <w:t>Abb. 3 — 3D-Muster.</w:t>
-      </w:r>
-      <w:r>
-        <w:t xml:space="preserve"> Die drei Raumrichtungen sind mit x/y/z beschriftet. Der Radius ist auf das dBi-Fenster normiert (Regler „dBi min" in der Toolbar), die absoluten Werte liefert die Farbskala rechts.</w:t>
+        <w:t>Abb. 3 — Plottyp „Axial Ratio (theta cut)".</w:t>
+      </w:r>
+      <w:r>
+        <w:t xml:space="preserve"> AR über θ bei wählbarem Azimut (Wähler „AR φ" in der Plot-Toolbar, 0…315°). Das grüne Band ist der Bereich AR ≤ 3 dB; Punktlinie und Text nennen die größte Auslenkung ab Boresight, die diese Grenze noch einhält. Beispiel: GPS-L1-Patch bei 1,57542 GHz — 1,70 dB bei θ = 0°, ≤ 3 dB bis θ = 62°. Beim linear polarisierten 2,45-GHz-Beispiel liegt der AR durchgehend über 10 dB; dort taugt der Schnitt nur als Kontrolle.</w:t>
       </w:r>
     </w:p>
     <w:p>
@@ -5998,8 +6006,58 @@
       <w:r>
         <w:drawing>
           <wp:inline xmlns:a="http://schemas.openxmlformats.org/drawingml/2006/main" xmlns:pic="http://schemas.openxmlformats.org/drawingml/2006/picture">
+            <wp:extent cx="5669280" cy="3631882"/>
+            <wp:docPr id="4" name="Picture 4"/>
+            <wp:cNvGraphicFramePr>
+              <a:graphicFrameLocks noChangeAspect="1"/>
+            </wp:cNvGraphicFramePr>
+            <a:graphic>
+              <a:graphicData uri="http://schemas.openxmlformats.org/drawingml/2006/picture">
+                <pic:pic>
+                  <pic:nvPicPr>
+                    <pic:cNvPr id="0" name="antenna_3d_pattern.png"/>
+                    <pic:cNvPicPr/>
+                  </pic:nvPicPr>
+                  <pic:blipFill>
+                    <a:blip r:embed="rId12"/>
+                    <a:stretch>
+                      <a:fillRect/>
+                    </a:stretch>
+                  </pic:blipFill>
+                  <pic:spPr>
+                    <a:xfrm>
+                      <a:off x="0" y="0"/>
+                      <a:ext cx="5669280" cy="3631882"/>
+                    </a:xfrm>
+                    <a:prstGeom prst="rect"/>
+                  </pic:spPr>
+                </pic:pic>
+              </a:graphicData>
+            </a:graphic>
+          </wp:inline>
+        </w:drawing>
+      </w:r>
+    </w:p>
+    <w:p>
+      <w:r>
+        <w:rPr>
+          <w:b/>
+        </w:rPr>
+        <w:t>Abb. 4 — 3D-Muster.</w:t>
+      </w:r>
+      <w:r>
+        <w:t xml:space="preserve"> Die drei Raumrichtungen sind mit x/y/z beschriftet. Der Radius ist auf das dBi-Fenster normiert (Regler „dBi min" in der Toolbar), die absoluten Werte liefert die Farbskala rechts.</w:t>
+      </w:r>
+    </w:p>
+    <w:p>
+      <w:pPr>
+        <w:jc w:val="center"/>
+      </w:pPr>
+      <w:r>
+        <w:drawing>
+          <wp:inline xmlns:a="http://schemas.openxmlformats.org/drawingml/2006/main" xmlns:pic="http://schemas.openxmlformats.org/drawingml/2006/picture">
             <wp:extent cx="5669280" cy="2664562"/>
-            <wp:docPr id="4" name="Picture 4"/>
+            <wp:docPr id="5" name="Picture 5"/>
             <wp:cNvGraphicFramePr>
               <a:graphicFrameLocks noChangeAspect="1"/>
             </wp:cNvGraphicFramePr>
@@ -6011,7 +6069,7 @@
                     <pic:cNvPicPr/>
                   </pic:nvPicPr>
                   <pic:blipFill>
-                    <a:blip r:embed="rId12"/>
+                    <a:blip r:embed="rId13"/>
                     <a:stretch>
                       <a:fillRect/>
                     </a:stretch>
@@ -6035,10 +6093,97 @@
         <w:rPr>
           <w:b/>
         </w:rPr>
-        <w:t>Abb. 4 — Dialog „Polarization…".</w:t>
+        <w:t>Abb. 5 — Dialog „Polarization…".</w:t>
       </w:r>
       <w:r>
         <w:t xml:space="preserve"> Eine Zeile pro Frequenz mit AR am Strahlmaximum, Drehsinn, Tilt, Peak-Richtung und Phasenzentrum (Δx/Δy/Δz, RMS). Die Kopfzeile nennt Anzahl der Punkte, Anteil mit AR ≤ 3 dB und die vorkommenden Drehsinne. „phase not well-defined" heißt: der Phasen-Fit ist für dieses Muster nicht belastbar.</w:t>
+      </w:r>
+    </w:p>
+    <w:p>
+      <w:pPr>
+        <w:pStyle w:val="Heading3"/>
+      </w:pPr>
+      <w:r>
+        <w:t>7.2 Feldbild</w:t>
+      </w:r>
+    </w:p>
+    <w:p>
+      <w:pPr>
+        <w:jc w:val="center"/>
+      </w:pPr>
+      <w:r>
+        <w:drawing>
+          <wp:inline xmlns:a="http://schemas.openxmlformats.org/drawingml/2006/main" xmlns:pic="http://schemas.openxmlformats.org/drawingml/2006/picture">
+            <wp:extent cx="5669280" cy="4724400"/>
+            <wp:docPr id="6" name="Picture 6"/>
+            <wp:cNvGraphicFramePr>
+              <a:graphicFrameLocks noChangeAspect="1"/>
+            </wp:cNvGraphicFramePr>
+            <a:graphic>
+              <a:graphicData uri="http://schemas.openxmlformats.org/drawingml/2006/picture">
+                <pic:pic>
+                  <pic:nvPicPr>
+                    <pic:cNvPr id="0" name="e_field_slice.png"/>
+                    <pic:cNvPicPr/>
+                  </pic:nvPicPr>
+                  <pic:blipFill>
+                    <a:blip r:embed="rId14"/>
+                    <a:stretch>
+                      <a:fillRect/>
+                    </a:stretch>
+                  </pic:blipFill>
+                  <pic:spPr>
+                    <a:xfrm>
+                      <a:off x="0" y="0"/>
+                      <a:ext cx="5669280" cy="4724400"/>
+                    </a:xfrm>
+                    <a:prstGeom prst="rect"/>
+                  </pic:spPr>
+                </pic:pic>
+              </a:graphicData>
+            </a:graphic>
+          </wp:inline>
+        </w:drawing>
+      </w:r>
+    </w:p>
+    <w:p>
+      <w:r>
+        <w:rPr>
+          <w:b/>
+        </w:rPr>
+        <w:t>Abb. 6 — |Et| im Substrat, Schnitt aus dem Felddump Et_substrate (2,45-GHz-Beispiel).</w:t>
+      </w:r>
+      <w:r>
+        <w:t xml:space="preserve"> Zwei Maxima links und rechts der Mitte, dazwischen die Moden-Null. Die Achsen stehen in Metern, die Farbskala in V/m. Solche Schnitte schreibt das Postprocessing als PNG neben den Dump (</w:t>
+      </w:r>
+      <w:r>
+        <w:rPr>
+          <w:rFonts w:ascii="Consolas" w:hAnsi="Consolas"/>
+          <w:sz w:val="18"/>
+        </w:rPr>
+        <w:t>work/&lt;projekt&gt;/fields/</w:t>
+      </w:r>
+      <w:r>
+        <w:t xml:space="preserve">). Die interaktive Ansicht bietet der Tab </w:t>
+      </w:r>
+      <w:r>
+        <w:rPr>
+          <w:b/>
+        </w:rPr>
+        <w:t>Field Viewer</w:t>
+      </w:r>
+      <w:r>
+        <w:t>: Schnittflächen und Iso-Flächen, Vektorpfeile („Vectors") für die Feldrichtung, Serien-Playback über die Zeit- oder Frequenzschritte, Export als VTK-Serie inklusive ParaView-Collection (</w:t>
+      </w:r>
+      <w:r>
+        <w:rPr>
+          <w:rFonts w:ascii="Consolas" w:hAnsi="Consolas"/>
+          <w:sz w:val="18"/>
+        </w:rPr>
+        <w:t>&lt;dump&gt;.pvd</w:t>
+      </w:r>
+      <w:r>
+        <w:t>) und als MP4.</w:t>
       </w:r>
     </w:p>
     <w:p>

</xml_diff>

<commit_message>
docs(ui): illustrate every configuration step in the guides
Five new screenshots: FreeCAD tools, mesh parameters, material, port and NF2FF box, each placed right below its step. The existing six evaluation pictures stay. Eleven figures per guide (DE and EN), DOCX and ODT rebuilt.

Figure numbers are gone from the captions - the text never referred to them and every insertion used to renumber the rest.
</commit_message>
<xml_diff>
--- a/docs/ANLEITUNG_DE.docx
+++ b/docs/ANLEITUNG_DE.docx
@@ -1655,6 +1655,74 @@
       </w:pPr>
       <w:r>
         <w:t>Variante B — FreeCAD-Tools in der GUI</w:t>
+      </w:r>
+    </w:p>
+    <w:p>
+      <w:pPr>
+        <w:jc w:val="center"/>
+      </w:pPr>
+      <w:r>
+        <w:drawing>
+          <wp:inline xmlns:a="http://schemas.openxmlformats.org/drawingml/2006/main" xmlns:pic="http://schemas.openxmlformats.org/drawingml/2006/picture">
+            <wp:extent cx="5669280" cy="4164740"/>
+            <wp:docPr id="1" name="Picture 1"/>
+            <wp:cNvGraphicFramePr>
+              <a:graphicFrameLocks noChangeAspect="1"/>
+            </wp:cNvGraphicFramePr>
+            <a:graphic>
+              <a:graphicData uri="http://schemas.openxmlformats.org/drawingml/2006/picture">
+                <pic:pic>
+                  <pic:nvPicPr>
+                    <pic:cNvPr id="0" name="dialog_freecad_tools.png"/>
+                    <pic:cNvPicPr/>
+                  </pic:nvPicPr>
+                  <pic:blipFill>
+                    <a:blip r:embed="rId9"/>
+                    <a:stretch>
+                      <a:fillRect/>
+                    </a:stretch>
+                  </pic:blipFill>
+                  <pic:spPr>
+                    <a:xfrm>
+                      <a:off x="0" y="0"/>
+                      <a:ext cx="5669280" cy="4164740"/>
+                    </a:xfrm>
+                    <a:prstGeom prst="rect"/>
+                  </pic:spPr>
+                </pic:pic>
+              </a:graphicData>
+            </a:graphic>
+          </wp:inline>
+        </w:drawing>
+      </w:r>
+    </w:p>
+    <w:p>
+      <w:r>
+        <w:rPr>
+          <w:b/>
+        </w:rPr>
+        <w:t>FreeCAD-Tools.</w:t>
+      </w:r>
+      <w:r>
+        <w:t xml:space="preserve"> Pfade zu FreeCADCmd und zur FreeCAD-GUI (Beispiel), Work-Verzeichnis, Deflection und Importformat. </w:t>
+      </w:r>
+      <w:r>
+        <w:rPr>
+          <w:b/>
+        </w:rPr>
+        <w:t>Launch FreeCAD</w:t>
+      </w:r>
+      <w:r>
+        <w:t xml:space="preserve"> öffnet FreeCAD mit diesem Arbeitsordner, </w:t>
+      </w:r>
+      <w:r>
+        <w:rPr>
+          <w:b/>
+        </w:rPr>
+        <w:t>Export CAD…</w:t>
+      </w:r>
+      <w:r>
+        <w:t xml:space="preserve"> schreibt STEP/STL ins Projekt.</w:t>
       </w:r>
     </w:p>
     <w:p>
@@ -3612,6 +3680,65 @@
       </w:r>
     </w:p>
     <w:p>
+      <w:pPr>
+        <w:jc w:val="center"/>
+      </w:pPr>
+      <w:r>
+        <w:drawing>
+          <wp:inline xmlns:a="http://schemas.openxmlformats.org/drawingml/2006/main" xmlns:pic="http://schemas.openxmlformats.org/drawingml/2006/picture">
+            <wp:extent cx="5669280" cy="6105378"/>
+            <wp:docPr id="2" name="Picture 2"/>
+            <wp:cNvGraphicFramePr>
+              <a:graphicFrameLocks noChangeAspect="1"/>
+            </wp:cNvGraphicFramePr>
+            <a:graphic>
+              <a:graphicData uri="http://schemas.openxmlformats.org/drawingml/2006/picture">
+                <pic:pic>
+                  <pic:nvPicPr>
+                    <pic:cNvPr id="0" name="dialog_mesh_params.png"/>
+                    <pic:cNvPicPr/>
+                  </pic:nvPicPr>
+                  <pic:blipFill>
+                    <a:blip r:embed="rId10"/>
+                    <a:stretch>
+                      <a:fillRect/>
+                    </a:stretch>
+                  </pic:blipFill>
+                  <pic:spPr>
+                    <a:xfrm>
+                      <a:off x="0" y="0"/>
+                      <a:ext cx="5669280" cy="6105378"/>
+                    </a:xfrm>
+                    <a:prstGeom prst="rect"/>
+                  </pic:spPr>
+                </pic:pic>
+              </a:graphicData>
+            </a:graphic>
+          </wp:inline>
+        </w:drawing>
+      </w:r>
+    </w:p>
+    <w:p>
+      <w:r>
+        <w:rPr>
+          <w:b/>
+        </w:rPr>
+        <w:t>Mesh-Parameter.</w:t>
+      </w:r>
+      <w:r>
+        <w:t xml:space="preserve"> Preset, Frequenzbereich (f0/fc), Anregung und die Overrides für die Zellgrößen an einer Stelle; </w:t>
+      </w:r>
+      <w:r>
+        <w:rPr>
+          <w:b/>
+        </w:rPr>
+        <w:t>Apply</w:t>
+      </w:r>
+      <w:r>
+        <w:t xml:space="preserve"> schreibt sie ins Projekt.</w:t>
+      </w:r>
+    </w:p>
+    <w:p>
       <w:r>
         <w:t>Mesh-Parameter (siehe §5.0):</w:t>
       </w:r>
@@ -4259,33 +4386,52 @@
     </w:p>
     <w:p>
       <w:pPr>
-        <w:pStyle w:val="ListNumber"/>
+        <w:jc w:val="center"/>
       </w:pPr>
       <w:r>
+        <w:drawing>
+          <wp:inline xmlns:a="http://schemas.openxmlformats.org/drawingml/2006/main" xmlns:pic="http://schemas.openxmlformats.org/drawingml/2006/picture">
+            <wp:extent cx="5669280" cy="4668819"/>
+            <wp:docPr id="3" name="Picture 3"/>
+            <wp:cNvGraphicFramePr>
+              <a:graphicFrameLocks noChangeAspect="1"/>
+            </wp:cNvGraphicFramePr>
+            <a:graphic>
+              <a:graphicData uri="http://schemas.openxmlformats.org/drawingml/2006/picture">
+                <pic:pic>
+                  <pic:nvPicPr>
+                    <pic:cNvPr id="0" name="dialog_material.png"/>
+                    <pic:cNvPicPr/>
+                  </pic:nvPicPr>
+                  <pic:blipFill>
+                    <a:blip r:embed="rId11"/>
+                    <a:stretch>
+                      <a:fillRect/>
+                    </a:stretch>
+                  </pic:blipFill>
+                  <pic:spPr>
+                    <a:xfrm>
+                      <a:off x="0" y="0"/>
+                      <a:ext cx="5669280" cy="4668819"/>
+                    </a:xfrm>
+                    <a:prstGeom prst="rect"/>
+                  </pic:spPr>
+                </pic:pic>
+              </a:graphicData>
+            </a:graphic>
+          </wp:inline>
+        </w:drawing>
+      </w:r>
+    </w:p>
+    <w:p>
+      <w:r>
         <w:rPr>
           <w:b/>
         </w:rPr>
-        <w:t>Add Material…</w:t>
-      </w:r>
-      <w:r>
-        <w:t xml:space="preserve"> — z. B. </w:t>
-      </w:r>
-      <w:r>
-        <w:rPr>
-          <w:rFonts w:ascii="Consolas" w:hAnsi="Consolas"/>
-          <w:sz w:val="18"/>
-        </w:rPr>
-        <w:t>substrate</w:t>
-      </w:r>
-      <w:r>
-        <w:t xml:space="preserve"> (εr=4,4, tanδ=0,02), </w:t>
-      </w:r>
-      <w:r>
-        <w:rPr>
-          <w:rFonts w:ascii="Consolas" w:hAnsi="Consolas"/>
-          <w:sz w:val="18"/>
-        </w:rPr>
-        <w:t>copper</w:t>
+        <w:t>Material.</w:t>
+      </w:r>
+      <w:r>
+        <w:t xml:space="preserve"> Art (dielectric / pec), εr, κ und tan δ — für FR4: εr 4,4, tan δ 0,02; Kupfer als pec.</w:t>
       </w:r>
     </w:p>
     <w:p>
@@ -4296,6 +4442,37 @@
         <w:rPr>
           <w:b/>
         </w:rPr>
+        <w:t>Add Material…</w:t>
+      </w:r>
+      <w:r>
+        <w:t xml:space="preserve"> — z. B. </w:t>
+      </w:r>
+      <w:r>
+        <w:rPr>
+          <w:rFonts w:ascii="Consolas" w:hAnsi="Consolas"/>
+          <w:sz w:val="18"/>
+        </w:rPr>
+        <w:t>substrate</w:t>
+      </w:r>
+      <w:r>
+        <w:t xml:space="preserve"> (εr=4,4, tanδ=0,02), </w:t>
+      </w:r>
+      <w:r>
+        <w:rPr>
+          <w:rFonts w:ascii="Consolas" w:hAnsi="Consolas"/>
+          <w:sz w:val="18"/>
+        </w:rPr>
+        <w:t>copper</w:t>
+      </w:r>
+    </w:p>
+    <w:p>
+      <w:pPr>
+        <w:pStyle w:val="ListNumber"/>
+      </w:pPr>
+      <w:r>
+        <w:rPr>
+          <w:b/>
+        </w:rPr>
         <w:t>Add Assignment…</w:t>
       </w:r>
     </w:p>
@@ -4381,13 +4558,52 @@
     </w:p>
     <w:p>
       <w:pPr>
-        <w:pStyle w:val="ListNumber"/>
+        <w:jc w:val="center"/>
       </w:pPr>
       <w:r>
+        <w:drawing>
+          <wp:inline xmlns:a="http://schemas.openxmlformats.org/drawingml/2006/main" xmlns:pic="http://schemas.openxmlformats.org/drawingml/2006/picture">
+            <wp:extent cx="5669280" cy="7698285"/>
+            <wp:docPr id="4" name="Picture 4"/>
+            <wp:cNvGraphicFramePr>
+              <a:graphicFrameLocks noChangeAspect="1"/>
+            </wp:cNvGraphicFramePr>
+            <a:graphic>
+              <a:graphicData uri="http://schemas.openxmlformats.org/drawingml/2006/picture">
+                <pic:pic>
+                  <pic:nvPicPr>
+                    <pic:cNvPr id="0" name="dialog_port.png"/>
+                    <pic:cNvPicPr/>
+                  </pic:nvPicPr>
+                  <pic:blipFill>
+                    <a:blip r:embed="rId12"/>
+                    <a:stretch>
+                      <a:fillRect/>
+                    </a:stretch>
+                  </pic:blipFill>
+                  <pic:spPr>
+                    <a:xfrm>
+                      <a:off x="0" y="0"/>
+                      <a:ext cx="5669280" cy="7698285"/>
+                    </a:xfrm>
+                    <a:prstGeom prst="rect"/>
+                  </pic:spPr>
+                </pic:pic>
+              </a:graphicData>
+            </a:graphic>
+          </wp:inline>
+        </w:drawing>
+      </w:r>
+    </w:p>
+    <w:p>
+      <w:r>
         <w:rPr>
           <w:b/>
         </w:rPr>
-        <w:t>Add Port…</w:t>
+        <w:t>Port.</w:t>
+      </w:r>
+      <w:r>
+        <w:t xml:space="preserve"> lumped, 50 Ω, Richtung, Mesh dirs und Start/Stop in mm. Beispiel: der Probe-Port des GPS-Presets — 1 mm × 1 mm von der Ground-Ebene (z = 0) bis zur Patch-Oberkante (z = 1,6 mm).</w:t>
       </w:r>
     </w:p>
     <w:p>
@@ -4395,22 +4611,10 @@
         <w:pStyle w:val="ListNumber"/>
       </w:pPr>
       <w:r>
-        <w:t xml:space="preserve">Typ: </w:t>
-      </w:r>
-      <w:r>
         <w:rPr>
           <w:b/>
         </w:rPr>
-        <w:t>lumped</w:t>
-      </w:r>
-      <w:r>
-        <w:t xml:space="preserve"> (Patch) — Resistanz </w:t>
-      </w:r>
-      <w:r>
-        <w:rPr>
-          <w:b/>
-        </w:rPr>
-        <w:t>50</w:t>
+        <w:t>Add Port…</w:t>
       </w:r>
     </w:p>
     <w:p>
@@ -4418,26 +4622,22 @@
         <w:pStyle w:val="ListNumber"/>
       </w:pPr>
       <w:r>
-        <w:t>start / stop: Kante des Patches (mm), z. B.</w:t>
-      </w:r>
-    </w:p>
-    <w:p>
-      <w:r>
-        <w:rPr>
-          <w:rFonts w:ascii="Consolas" w:hAnsi="Consolas"/>
-          <w:sz w:val="18"/>
-        </w:rPr>
-        <w:t>start=[-1.0, 0.0, -1.0]</w:t>
-      </w:r>
-      <w:r>
-        <w:t xml:space="preserve">, </w:t>
-      </w:r>
-      <w:r>
-        <w:rPr>
-          <w:rFonts w:ascii="Consolas" w:hAnsi="Consolas"/>
-          <w:sz w:val="18"/>
-        </w:rPr>
-        <w:t>stop=[1.0, 0.0, 1.0]</w:t>
+        <w:t xml:space="preserve">Typ: </w:t>
+      </w:r>
+      <w:r>
+        <w:rPr>
+          <w:b/>
+        </w:rPr>
+        <w:t>lumped</w:t>
+      </w:r>
+      <w:r>
+        <w:t xml:space="preserve"> (Patch) — Resistanz </w:t>
+      </w:r>
+      <w:r>
+        <w:rPr>
+          <w:b/>
+        </w:rPr>
+        <w:t>50</w:t>
       </w:r>
     </w:p>
     <w:p>
@@ -4445,27 +4645,26 @@
         <w:pStyle w:val="ListNumber"/>
       </w:pPr>
       <w:r>
-        <w:t xml:space="preserve">Direction: </w:t>
-      </w:r>
+        <w:t>start / stop: Kante des Patches (mm), z. B.</w:t>
+      </w:r>
+    </w:p>
+    <w:p>
       <w:r>
         <w:rPr>
           <w:rFonts w:ascii="Consolas" w:hAnsi="Consolas"/>
           <w:sz w:val="18"/>
         </w:rPr>
-        <w:t>x</w:t>
-      </w:r>
-      <w:r>
-        <w:t xml:space="preserve"> oder </w:t>
+        <w:t>start=[-1.0, 0.0, -1.0]</w:t>
+      </w:r>
+      <w:r>
+        <w:t xml:space="preserve">, </w:t>
       </w:r>
       <w:r>
         <w:rPr>
           <w:rFonts w:ascii="Consolas" w:hAnsi="Consolas"/>
           <w:sz w:val="18"/>
         </w:rPr>
-        <w:t>y</w:t>
-      </w:r>
-      <w:r>
-        <w:t xml:space="preserve"> (parallel zum Spannungsabfall am Port)</w:t>
+        <w:t>stop=[1.0, 0.0, 1.0]</w:t>
       </w:r>
     </w:p>
     <w:p>
@@ -4473,14 +4672,27 @@
         <w:pStyle w:val="ListNumber"/>
       </w:pPr>
       <w:r>
+        <w:t xml:space="preserve">Direction: </w:t>
+      </w:r>
+      <w:r>
         <w:rPr>
           <w:rFonts w:ascii="Consolas" w:hAnsi="Consolas"/>
           <w:sz w:val="18"/>
         </w:rPr>
-        <w:t>excite_port = true</w:t>
-      </w:r>
-      <w:r>
-        <w:t xml:space="preserve"> (Port 1)</w:t>
+        <w:t>x</w:t>
+      </w:r>
+      <w:r>
+        <w:t xml:space="preserve"> oder </w:t>
+      </w:r>
+      <w:r>
+        <w:rPr>
+          <w:rFonts w:ascii="Consolas" w:hAnsi="Consolas"/>
+          <w:sz w:val="18"/>
+        </w:rPr>
+        <w:t>y</w:t>
+      </w:r>
+      <w:r>
+        <w:t xml:space="preserve"> (parallel zum Spannungsabfall am Port)</w:t>
       </w:r>
     </w:p>
     <w:p>
@@ -4488,6 +4700,21 @@
         <w:pStyle w:val="ListNumber"/>
       </w:pPr>
       <w:r>
+        <w:rPr>
+          <w:rFonts w:ascii="Consolas" w:hAnsi="Consolas"/>
+          <w:sz w:val="18"/>
+        </w:rPr>
+        <w:t>excite_port = true</w:t>
+      </w:r>
+      <w:r>
+        <w:t xml:space="preserve"> (Port 1)</w:t>
+      </w:r>
+    </w:p>
+    <w:p>
+      <w:pPr>
+        <w:pStyle w:val="ListNumber"/>
+      </w:pPr>
+      <w:r>
         <w:t>Geometrie prüfen: Viewer / Mesh-Preview</w:t>
       </w:r>
     </w:p>
@@ -4529,6 +4756,65 @@
       </w:pPr>
       <w:r>
         <w:t>5.4 NF2FF (Strahlungsdiagramm)</w:t>
+      </w:r>
+    </w:p>
+    <w:p>
+      <w:pPr>
+        <w:jc w:val="center"/>
+      </w:pPr>
+      <w:r>
+        <w:drawing>
+          <wp:inline xmlns:a="http://schemas.openxmlformats.org/drawingml/2006/main" xmlns:pic="http://schemas.openxmlformats.org/drawingml/2006/picture">
+            <wp:extent cx="5669280" cy="5354320"/>
+            <wp:docPr id="5" name="Picture 5"/>
+            <wp:cNvGraphicFramePr>
+              <a:graphicFrameLocks noChangeAspect="1"/>
+            </wp:cNvGraphicFramePr>
+            <a:graphic>
+              <a:graphicData uri="http://schemas.openxmlformats.org/drawingml/2006/picture">
+                <pic:pic>
+                  <pic:nvPicPr>
+                    <pic:cNvPr id="0" name="dialog_nf2ff.png"/>
+                    <pic:cNvPicPr/>
+                  </pic:nvPicPr>
+                  <pic:blipFill>
+                    <a:blip r:embed="rId13"/>
+                    <a:stretch>
+                      <a:fillRect/>
+                    </a:stretch>
+                  </pic:blipFill>
+                  <pic:spPr>
+                    <a:xfrm>
+                      <a:off x="0" y="0"/>
+                      <a:ext cx="5669280" cy="5354320"/>
+                    </a:xfrm>
+                    <a:prstGeom prst="rect"/>
+                  </pic:spPr>
+                </pic:pic>
+              </a:graphicData>
+            </a:graphic>
+          </wp:inline>
+        </w:drawing>
+      </w:r>
+    </w:p>
+    <w:p>
+      <w:r>
+        <w:rPr>
+          <w:b/>
+        </w:rPr>
+        <w:t>NF2FF-Box.</w:t>
+      </w:r>
+      <w:r>
+        <w:t xml:space="preserve"> Start/Stop in mm; sie muss die Antenne samt Keule umschließen. Beispiel: die Box des GPS-Presets (±55 mm, z −25 … 28,2 mm). </w:t>
+      </w:r>
+      <w:r>
+        <w:rPr>
+          <w:b/>
+        </w:rPr>
+        <w:t>Fit NF2FF to Geometry</w:t>
+      </w:r>
+      <w:r>
+        <w:t xml:space="preserve"> setzt sie automatisch.</w:t>
       </w:r>
     </w:p>
     <w:p>
@@ -5468,7 +5754,7 @@
         <w:drawing>
           <wp:inline xmlns:a="http://schemas.openxmlformats.org/drawingml/2006/main" xmlns:pic="http://schemas.openxmlformats.org/drawingml/2006/picture">
             <wp:extent cx="5669280" cy="3631882"/>
-            <wp:docPr id="1" name="Picture 1"/>
+            <wp:docPr id="6" name="Picture 6"/>
             <wp:cNvGraphicFramePr>
               <a:graphicFrameLocks noChangeAspect="1"/>
             </wp:cNvGraphicFramePr>
@@ -5480,7 +5766,7 @@
                     <pic:cNvPicPr/>
                   </pic:nvPicPr>
                   <pic:blipFill>
-                    <a:blip r:embed="rId9"/>
+                    <a:blip r:embed="rId14"/>
                     <a:stretch>
                       <a:fillRect/>
                     </a:stretch>
@@ -5504,7 +5790,7 @@
         <w:rPr>
           <w:b/>
         </w:rPr>
-        <w:t>Abb. 1 — Mesh-Viewer, XY-Schnitt bei z = 1,6 mm.</w:t>
+        <w:t>Mesh-Viewer, XY-Schnitt bei z = 1,6 mm.</w:t>
       </w:r>
       <w:r>
         <w:t xml:space="preserve"> Das Gitter erscheint als Linien, die Geometrie als Flächen: 75-mm-Board (blau), Patch mit den beiden Treppen-Fasen (orange), Port (rot), NF2FF-Box (violett gestrichelt) und Rechen-Domain (schwarz gestrichelt). Man sieht, wie die Zellen über dem Patch feiner werden und nach außen auf die maximal erlaubte Zellgröße wachsen. Der Schieber neben „Plane" legt den Schnitt, „Mesh grid" blendet das Gitter, „Cell sizes" färbt die Zellgrößen, „Overview" zeigt die 3D-Ansicht. Rechtsklick auf eine markierte Zelle öffnet die Reparatur-Aktionen aus §6.1.</w:t>
@@ -5907,7 +6193,7 @@
         <w:drawing>
           <wp:inline xmlns:a="http://schemas.openxmlformats.org/drawingml/2006/main" xmlns:pic="http://schemas.openxmlformats.org/drawingml/2006/picture">
             <wp:extent cx="5669280" cy="3631882"/>
-            <wp:docPr id="2" name="Picture 2"/>
+            <wp:docPr id="7" name="Picture 7"/>
             <wp:cNvGraphicFramePr>
               <a:graphicFrameLocks noChangeAspect="1"/>
             </wp:cNvGraphicFramePr>
@@ -5919,7 +6205,7 @@
                     <pic:cNvPicPr/>
                   </pic:nvPicPr>
                   <pic:blipFill>
-                    <a:blip r:embed="rId10"/>
+                    <a:blip r:embed="rId15"/>
                     <a:stretch>
                       <a:fillRect/>
                     </a:stretch>
@@ -5943,7 +6229,7 @@
         <w:rPr>
           <w:b/>
         </w:rPr>
-        <w:t>Abb. 2 — Antenna-Tab, H-Ebene.</w:t>
+        <w:t>Antenna-Tab, H-Ebene.</w:t>
       </w:r>
       <w:r>
         <w:t xml:space="preserve"> Links die gefundenen NF2FF-Ergebnisse und der Details-Block (Dmax, Gmax, η, Prad, Raster), rechts der Polarschnitt mit dBi-Ringen. Rechtsklick auf den Plot öffnet das Analyse-Menü (HPBW, Vor-Rück-Verhältnis, Marker, Pop-out). Beispiel: der 2,45-GHz-Patch aus §2.2.</w:t>
@@ -5957,7 +6243,7 @@
         <w:drawing>
           <wp:inline xmlns:a="http://schemas.openxmlformats.org/drawingml/2006/main" xmlns:pic="http://schemas.openxmlformats.org/drawingml/2006/picture">
             <wp:extent cx="5669280" cy="3631882"/>
-            <wp:docPr id="3" name="Picture 3"/>
+            <wp:docPr id="8" name="Picture 8"/>
             <wp:cNvGraphicFramePr>
               <a:graphicFrameLocks noChangeAspect="1"/>
             </wp:cNvGraphicFramePr>
@@ -5969,7 +6255,7 @@
                     <pic:cNvPicPr/>
                   </pic:nvPicPr>
                   <pic:blipFill>
-                    <a:blip r:embed="rId11"/>
+                    <a:blip r:embed="rId16"/>
                     <a:stretch>
                       <a:fillRect/>
                     </a:stretch>
@@ -5993,7 +6279,7 @@
         <w:rPr>
           <w:b/>
         </w:rPr>
-        <w:t>Abb. 3 — Plottyp „Axial Ratio (theta cut)".</w:t>
+        <w:t>Plottyp „Axial Ratio (theta cut)".</w:t>
       </w:r>
       <w:r>
         <w:t xml:space="preserve"> AR über θ bei wählbarem Azimut (Wähler „AR φ" in der Plot-Toolbar, 0…315°). Das grüne Band ist der Bereich AR ≤ 3 dB; Punktlinie und Text nennen die größte Auslenkung ab Boresight, die diese Grenze noch einhält. Beispiel: GPS-L1-Patch bei 1,57542 GHz — 1,70 dB bei θ = 0°, ≤ 3 dB bis θ = 62°. Beim linear polarisierten 2,45-GHz-Beispiel liegt der AR durchgehend über 10 dB; dort taugt der Schnitt nur als Kontrolle.</w:t>
@@ -6007,7 +6293,7 @@
         <w:drawing>
           <wp:inline xmlns:a="http://schemas.openxmlformats.org/drawingml/2006/main" xmlns:pic="http://schemas.openxmlformats.org/drawingml/2006/picture">
             <wp:extent cx="5669280" cy="3631882"/>
-            <wp:docPr id="4" name="Picture 4"/>
+            <wp:docPr id="9" name="Picture 9"/>
             <wp:cNvGraphicFramePr>
               <a:graphicFrameLocks noChangeAspect="1"/>
             </wp:cNvGraphicFramePr>
@@ -6019,7 +6305,7 @@
                     <pic:cNvPicPr/>
                   </pic:nvPicPr>
                   <pic:blipFill>
-                    <a:blip r:embed="rId12"/>
+                    <a:blip r:embed="rId17"/>
                     <a:stretch>
                       <a:fillRect/>
                     </a:stretch>
@@ -6043,7 +6329,7 @@
         <w:rPr>
           <w:b/>
         </w:rPr>
-        <w:t>Abb. 4 — 3D-Muster.</w:t>
+        <w:t>3D-Muster.</w:t>
       </w:r>
       <w:r>
         <w:t xml:space="preserve"> Die drei Raumrichtungen sind mit x/y/z beschriftet. Der Radius ist auf das dBi-Fenster normiert (Regler „dBi min" in der Toolbar), die absoluten Werte liefert die Farbskala rechts.</w:t>
@@ -6057,7 +6343,7 @@
         <w:drawing>
           <wp:inline xmlns:a="http://schemas.openxmlformats.org/drawingml/2006/main" xmlns:pic="http://schemas.openxmlformats.org/drawingml/2006/picture">
             <wp:extent cx="5669280" cy="2664562"/>
-            <wp:docPr id="5" name="Picture 5"/>
+            <wp:docPr id="10" name="Picture 10"/>
             <wp:cNvGraphicFramePr>
               <a:graphicFrameLocks noChangeAspect="1"/>
             </wp:cNvGraphicFramePr>
@@ -6069,7 +6355,7 @@
                     <pic:cNvPicPr/>
                   </pic:nvPicPr>
                   <pic:blipFill>
-                    <a:blip r:embed="rId13"/>
+                    <a:blip r:embed="rId18"/>
                     <a:stretch>
                       <a:fillRect/>
                     </a:stretch>
@@ -6093,7 +6379,7 @@
         <w:rPr>
           <w:b/>
         </w:rPr>
-        <w:t>Abb. 5 — Dialog „Polarization…".</w:t>
+        <w:t>Dialog „Polarization…".</w:t>
       </w:r>
       <w:r>
         <w:t xml:space="preserve"> Eine Zeile pro Frequenz mit AR am Strahlmaximum, Drehsinn, Tilt, Peak-Richtung und Phasenzentrum (Δx/Δy/Δz, RMS). Die Kopfzeile nennt Anzahl der Punkte, Anteil mit AR ≤ 3 dB und die vorkommenden Drehsinne. „phase not well-defined" heißt: der Phasen-Fit ist für dieses Muster nicht belastbar.</w:t>
@@ -6115,7 +6401,7 @@
         <w:drawing>
           <wp:inline xmlns:a="http://schemas.openxmlformats.org/drawingml/2006/main" xmlns:pic="http://schemas.openxmlformats.org/drawingml/2006/picture">
             <wp:extent cx="5669280" cy="4724400"/>
-            <wp:docPr id="6" name="Picture 6"/>
+            <wp:docPr id="11" name="Picture 11"/>
             <wp:cNvGraphicFramePr>
               <a:graphicFrameLocks noChangeAspect="1"/>
             </wp:cNvGraphicFramePr>
@@ -6127,7 +6413,7 @@
                     <pic:cNvPicPr/>
                   </pic:nvPicPr>
                   <pic:blipFill>
-                    <a:blip r:embed="rId14"/>
+                    <a:blip r:embed="rId19"/>
                     <a:stretch>
                       <a:fillRect/>
                     </a:stretch>
@@ -6151,7 +6437,7 @@
         <w:rPr>
           <w:b/>
         </w:rPr>
-        <w:t>Abb. 6 — |Et| im Substrat, Schnitt aus dem Felddump Et_substrate (2,45-GHz-Beispiel).</w:t>
+        <w:t>|Et| im Substrat, Schnitt aus dem Felddump Et_substrate (2,45-GHz-Beispiel).</w:t>
       </w:r>
       <w:r>
         <w:t xml:space="preserve"> Zwei Maxima links und rechts der Mitte, dazwischen die Moden-Null. Die Achsen stehen in Metern, die Farbskala in V/m. Solche Schnitte schreibt das Postprocessing als PNG neben den Dump (</w:t>

</xml_diff>

<commit_message>
docs(ui): illustrate the main window, simulation dialog, script editor and S-parameters
Sixteen figures per guide now: main window at start and with the preset loaded, FreeCAD tools, simulation parameters, mesh parameters, material, port, NF2FF box, script editor, mesh viewer, S-parameters, antenna tab, axial-ratio cut, 3D pattern, Polarization dialog and the E-field slice. Only the FreeCAD drawing steps stay without a picture - they cannot be captured headless.

DOCX and ODT rebuilt for both languages.
</commit_message>
<xml_diff>
--- a/docs/ANLEITUNG_DE.docx
+++ b/docs/ANLEITUNG_DE.docx
@@ -959,6 +959,56 @@
     </w:p>
     <w:p>
       <w:pPr>
+        <w:jc w:val="center"/>
+      </w:pPr>
+      <w:r>
+        <w:drawing>
+          <wp:inline xmlns:a="http://schemas.openxmlformats.org/drawingml/2006/main" xmlns:pic="http://schemas.openxmlformats.org/drawingml/2006/picture">
+            <wp:extent cx="5669280" cy="3046468"/>
+            <wp:docPr id="1" name="Picture 1"/>
+            <wp:cNvGraphicFramePr>
+              <a:graphicFrameLocks noChangeAspect="1"/>
+            </wp:cNvGraphicFramePr>
+            <a:graphic>
+              <a:graphicData uri="http://schemas.openxmlformats.org/drawingml/2006/picture">
+                <pic:pic>
+                  <pic:nvPicPr>
+                    <pic:cNvPr id="0" name="main_window.png"/>
+                    <pic:cNvPicPr/>
+                  </pic:nvPicPr>
+                  <pic:blipFill>
+                    <a:blip r:embed="rId9"/>
+                    <a:stretch>
+                      <a:fillRect/>
+                    </a:stretch>
+                  </pic:blipFill>
+                  <pic:spPr>
+                    <a:xfrm>
+                      <a:off x="0" y="0"/>
+                      <a:ext cx="5669280" cy="3046468"/>
+                    </a:xfrm>
+                    <a:prstGeom prst="rect"/>
+                  </pic:spPr>
+                </pic:pic>
+              </a:graphicData>
+            </a:graphic>
+          </wp:inline>
+        </w:drawing>
+      </w:r>
+    </w:p>
+    <w:p>
+      <w:r>
+        <w:rPr>
+          <w:b/>
+        </w:rPr>
+        <w:t>Hauptfenster beim Start.</w:t>
+      </w:r>
+      <w:r>
+        <w:t xml:space="preserve"> Tabs Geometry / Mesh Viewer / S-Params / Antenna / Field Viewer, links der Projektbaum, in der Mitte die Import- und Materialbereiche, unten Log und Mesh-Report.</w:t>
+      </w:r>
+    </w:p>
+    <w:p>
+      <w:pPr>
         <w:ind w:left="360"/>
       </w:pPr>
       <w:r>
@@ -1665,7 +1715,7 @@
         <w:drawing>
           <wp:inline xmlns:a="http://schemas.openxmlformats.org/drawingml/2006/main" xmlns:pic="http://schemas.openxmlformats.org/drawingml/2006/picture">
             <wp:extent cx="5669280" cy="4164740"/>
-            <wp:docPr id="1" name="Picture 1"/>
+            <wp:docPr id="2" name="Picture 2"/>
             <wp:cNvGraphicFramePr>
               <a:graphicFrameLocks noChangeAspect="1"/>
             </wp:cNvGraphicFramePr>
@@ -1677,7 +1727,7 @@
                     <pic:cNvPicPr/>
                   </pic:nvPicPr>
                   <pic:blipFill>
-                    <a:blip r:embed="rId9"/>
+                    <a:blip r:embed="rId10"/>
                     <a:stretch>
                       <a:fillRect/>
                     </a:stretch>
@@ -1885,6 +1935,56 @@
       </w:pPr>
       <w:r>
         <w:t>Variante C — Preset (nur zum Testen der Simulation)</w:t>
+      </w:r>
+    </w:p>
+    <w:p>
+      <w:pPr>
+        <w:jc w:val="center"/>
+      </w:pPr>
+      <w:r>
+        <w:drawing>
+          <wp:inline xmlns:a="http://schemas.openxmlformats.org/drawingml/2006/main" xmlns:pic="http://schemas.openxmlformats.org/drawingml/2006/picture">
+            <wp:extent cx="5669280" cy="3046468"/>
+            <wp:docPr id="3" name="Picture 3"/>
+            <wp:cNvGraphicFramePr>
+              <a:graphicFrameLocks noChangeAspect="1"/>
+            </wp:cNvGraphicFramePr>
+            <a:graphic>
+              <a:graphicData uri="http://schemas.openxmlformats.org/drawingml/2006/picture">
+                <pic:pic>
+                  <pic:nvPicPr>
+                    <pic:cNvPr id="0" name="main_window_gps_preset.png"/>
+                    <pic:cNvPicPr/>
+                  </pic:nvPicPr>
+                  <pic:blipFill>
+                    <a:blip r:embed="rId11"/>
+                    <a:stretch>
+                      <a:fillRect/>
+                    </a:stretch>
+                  </pic:blipFill>
+                  <pic:spPr>
+                    <a:xfrm>
+                      <a:off x="0" y="0"/>
+                      <a:ext cx="5669280" cy="3046468"/>
+                    </a:xfrm>
+                    <a:prstGeom prst="rect"/>
+                  </pic:spPr>
+                </pic:pic>
+              </a:graphicData>
+            </a:graphic>
+          </wp:inline>
+        </w:drawing>
+      </w:r>
+    </w:p>
+    <w:p>
+      <w:r>
+        <w:rPr>
+          <w:b/>
+        </w:rPr>
+        <w:t>Nach dem Laden des Presets.</w:t>
+      </w:r>
+      <w:r>
+        <w:t xml:space="preserve"> Projektbaum mit Ground, Substrat und Patch, Materialien, Port und NF2FF-Box; im Geometrie-Text stehen die Kennwerte des Presets und der Hinweis, wie man den AR-Dip über eine Frequenzliste sichtbar macht.</w:t>
       </w:r>
     </w:p>
     <w:p>
@@ -3205,6 +3305,56 @@
       </w:r>
     </w:p>
     <w:p>
+      <w:pPr>
+        <w:jc w:val="center"/>
+      </w:pPr>
+      <w:r>
+        <w:drawing>
+          <wp:inline xmlns:a="http://schemas.openxmlformats.org/drawingml/2006/main" xmlns:pic="http://schemas.openxmlformats.org/drawingml/2006/picture">
+            <wp:extent cx="5669280" cy="5039360"/>
+            <wp:docPr id="4" name="Picture 4"/>
+            <wp:cNvGraphicFramePr>
+              <a:graphicFrameLocks noChangeAspect="1"/>
+            </wp:cNvGraphicFramePr>
+            <a:graphic>
+              <a:graphicData uri="http://schemas.openxmlformats.org/drawingml/2006/picture">
+                <pic:pic>
+                  <pic:nvPicPr>
+                    <pic:cNvPr id="0" name="dialog_sim_params.png"/>
+                    <pic:cNvPicPr/>
+                  </pic:nvPicPr>
+                  <pic:blipFill>
+                    <a:blip r:embed="rId12"/>
+                    <a:stretch>
+                      <a:fillRect/>
+                    </a:stretch>
+                  </pic:blipFill>
+                  <pic:spPr>
+                    <a:xfrm>
+                      <a:off x="0" y="0"/>
+                      <a:ext cx="5669280" cy="5039360"/>
+                    </a:xfrm>
+                    <a:prstGeom prst="rect"/>
+                  </pic:spPr>
+                </pic:pic>
+              </a:graphicData>
+            </a:graphic>
+          </wp:inline>
+        </w:drawing>
+      </w:r>
+    </w:p>
+    <w:p>
+      <w:r>
+        <w:rPr>
+          <w:b/>
+        </w:rPr>
+        <w:t>Simulation Parameters.</w:t>
+      </w:r>
+      <w:r>
+        <w:t xml:space="preserve"> Zwei Tabs; oben die berechneten Werte (f_max, λ, Zellgrößen, Luftrand), darunter Endkriterium, Timesteps, Threads und Randbedingungen.</w:t>
+      </w:r>
+    </w:p>
+    <w:p>
       <w:r>
         <w:rPr>
           <w:b/>
@@ -3687,7 +3837,7 @@
         <w:drawing>
           <wp:inline xmlns:a="http://schemas.openxmlformats.org/drawingml/2006/main" xmlns:pic="http://schemas.openxmlformats.org/drawingml/2006/picture">
             <wp:extent cx="5669280" cy="6105378"/>
-            <wp:docPr id="2" name="Picture 2"/>
+            <wp:docPr id="5" name="Picture 5"/>
             <wp:cNvGraphicFramePr>
               <a:graphicFrameLocks noChangeAspect="1"/>
             </wp:cNvGraphicFramePr>
@@ -3699,7 +3849,7 @@
                     <pic:cNvPicPr/>
                   </pic:nvPicPr>
                   <pic:blipFill>
-                    <a:blip r:embed="rId10"/>
+                    <a:blip r:embed="rId13"/>
                     <a:stretch>
                       <a:fillRect/>
                     </a:stretch>
@@ -4392,7 +4542,7 @@
         <w:drawing>
           <wp:inline xmlns:a="http://schemas.openxmlformats.org/drawingml/2006/main" xmlns:pic="http://schemas.openxmlformats.org/drawingml/2006/picture">
             <wp:extent cx="5669280" cy="4668819"/>
-            <wp:docPr id="3" name="Picture 3"/>
+            <wp:docPr id="6" name="Picture 6"/>
             <wp:cNvGraphicFramePr>
               <a:graphicFrameLocks noChangeAspect="1"/>
             </wp:cNvGraphicFramePr>
@@ -4404,7 +4554,7 @@
                     <pic:cNvPicPr/>
                   </pic:nvPicPr>
                   <pic:blipFill>
-                    <a:blip r:embed="rId11"/>
+                    <a:blip r:embed="rId14"/>
                     <a:stretch>
                       <a:fillRect/>
                     </a:stretch>
@@ -4564,7 +4714,7 @@
         <w:drawing>
           <wp:inline xmlns:a="http://schemas.openxmlformats.org/drawingml/2006/main" xmlns:pic="http://schemas.openxmlformats.org/drawingml/2006/picture">
             <wp:extent cx="5669280" cy="7698285"/>
-            <wp:docPr id="4" name="Picture 4"/>
+            <wp:docPr id="7" name="Picture 7"/>
             <wp:cNvGraphicFramePr>
               <a:graphicFrameLocks noChangeAspect="1"/>
             </wp:cNvGraphicFramePr>
@@ -4576,7 +4726,7 @@
                     <pic:cNvPicPr/>
                   </pic:nvPicPr>
                   <pic:blipFill>
-                    <a:blip r:embed="rId12"/>
+                    <a:blip r:embed="rId15"/>
                     <a:stretch>
                       <a:fillRect/>
                     </a:stretch>
@@ -4766,7 +4916,7 @@
         <w:drawing>
           <wp:inline xmlns:a="http://schemas.openxmlformats.org/drawingml/2006/main" xmlns:pic="http://schemas.openxmlformats.org/drawingml/2006/picture">
             <wp:extent cx="5669280" cy="5354320"/>
-            <wp:docPr id="5" name="Picture 5"/>
+            <wp:docPr id="8" name="Picture 8"/>
             <wp:cNvGraphicFramePr>
               <a:graphicFrameLocks noChangeAspect="1"/>
             </wp:cNvGraphicFramePr>
@@ -4778,7 +4928,7 @@
                     <pic:cNvPicPr/>
                   </pic:nvPicPr>
                   <pic:blipFill>
-                    <a:blip r:embed="rId13"/>
+                    <a:blip r:embed="rId16"/>
                     <a:stretch>
                       <a:fillRect/>
                     </a:stretch>
@@ -5512,6 +5662,56 @@
     </w:p>
     <w:p>
       <w:pPr>
+        <w:jc w:val="center"/>
+      </w:pPr>
+      <w:r>
+        <w:drawing>
+          <wp:inline xmlns:a="http://schemas.openxmlformats.org/drawingml/2006/main" xmlns:pic="http://schemas.openxmlformats.org/drawingml/2006/picture">
+            <wp:extent cx="5669280" cy="3968496"/>
+            <wp:docPr id="9" name="Picture 9"/>
+            <wp:cNvGraphicFramePr>
+              <a:graphicFrameLocks noChangeAspect="1"/>
+            </wp:cNvGraphicFramePr>
+            <a:graphic>
+              <a:graphicData uri="http://schemas.openxmlformats.org/drawingml/2006/picture">
+                <pic:pic>
+                  <pic:nvPicPr>
+                    <pic:cNvPr id="0" name="dialog_script_editor.png"/>
+                    <pic:cNvPicPr/>
+                  </pic:nvPicPr>
+                  <pic:blipFill>
+                    <a:blip r:embed="rId17"/>
+                    <a:stretch>
+                      <a:fillRect/>
+                    </a:stretch>
+                  </pic:blipFill>
+                  <pic:spPr>
+                    <a:xfrm>
+                      <a:off x="0" y="0"/>
+                      <a:ext cx="5669280" cy="3968496"/>
+                    </a:xfrm>
+                    <a:prstGeom prst="rect"/>
+                  </pic:spPr>
+                </pic:pic>
+              </a:graphicData>
+            </a:graphic>
+          </wp:inline>
+        </w:drawing>
+      </w:r>
+    </w:p>
+    <w:p>
+      <w:r>
+        <w:rPr>
+          <w:b/>
+        </w:rPr>
+        <w:t>Script-Editor.</w:t>
+      </w:r>
+      <w:r>
+        <w:t xml:space="preserve"> Zeigt project_run.py — das Skript, das openEMS wirklich ausführt — mit Save, Revert und Regenerate from project. Eigene Änderungen werden vor dem Neuerzeugen als project_run_edited.py gesichert.</w:t>
+      </w:r>
+    </w:p>
+    <w:p>
+      <w:pPr>
         <w:pStyle w:val="Heading3"/>
       </w:pPr>
       <w:r>
@@ -5754,7 +5954,7 @@
         <w:drawing>
           <wp:inline xmlns:a="http://schemas.openxmlformats.org/drawingml/2006/main" xmlns:pic="http://schemas.openxmlformats.org/drawingml/2006/picture">
             <wp:extent cx="5669280" cy="3631882"/>
-            <wp:docPr id="6" name="Picture 6"/>
+            <wp:docPr id="10" name="Picture 10"/>
             <wp:cNvGraphicFramePr>
               <a:graphicFrameLocks noChangeAspect="1"/>
             </wp:cNvGraphicFramePr>
@@ -5766,7 +5966,7 @@
                     <pic:cNvPicPr/>
                   </pic:nvPicPr>
                   <pic:blipFill>
-                    <a:blip r:embed="rId14"/>
+                    <a:blip r:embed="rId18"/>
                     <a:stretch>
                       <a:fillRect/>
                     </a:stretch>
@@ -5811,389 +6011,13 @@
     </w:p>
     <w:p>
       <w:pPr>
-        <w:pStyle w:val="ListNumber"/>
-      </w:pPr>
-      <w:r>
-        <w:rPr>
-          <w:b/>
-        </w:rPr>
-        <w:t>S-Params Viewer</w:t>
-      </w:r>
-    </w:p>
-    <w:p>
-      <w:pPr>
-        <w:pStyle w:val="ListBullet"/>
-      </w:pPr>
-      <w:r>
-        <w:t>S11 / S21, dB, Phase</w:t>
-      </w:r>
-    </w:p>
-    <w:p>
-      <w:pPr>
-        <w:pStyle w:val="ListBullet"/>
-      </w:pPr>
-      <w:r>
-        <w:t>Marker: Frequenz, S, Γ, Z/Y, VSWR, RL</w:t>
-      </w:r>
-    </w:p>
-    <w:p>
-      <w:pPr>
-        <w:pStyle w:val="ListBullet"/>
-      </w:pPr>
-      <w:r>
-        <w:t>Smith-Chart: Z- und Y-Marker</w:t>
-      </w:r>
-    </w:p>
-    <w:p>
-      <w:pPr>
-        <w:pStyle w:val="ListNumber"/>
-      </w:pPr>
-      <w:r>
-        <w:rPr>
-          <w:b/>
-        </w:rPr>
-        <w:t>Pop-out S-Graph</w:t>
-      </w:r>
-      <w:r>
-        <w:t xml:space="preserve"> — Plot in Extra-Fenster</w:t>
-      </w:r>
-    </w:p>
-    <w:p>
-      <w:pPr>
-        <w:pStyle w:val="ListNumber"/>
-      </w:pPr>
-      <w:r>
-        <w:rPr>
-          <w:b/>
-        </w:rPr>
-        <w:t>Antenna</w:t>
-      </w:r>
-      <w:r>
-        <w:t xml:space="preserve">-Tab / </w:t>
-      </w:r>
-      <w:r>
-        <w:rPr>
-          <w:b/>
-        </w:rPr>
-        <w:t>Simulation → Antenna Pattern Viewer</w:t>
-      </w:r>
-      <w:r>
-        <w:t xml:space="preserve"> — NF2FF-Fernfeld:</w:t>
-      </w:r>
-    </w:p>
-    <w:p>
-      <w:r>
-        <w:t>3D-Polar des Gewinns, 2D-Polarschnitte (E/H-Ebene), Direktivität/Gain/η</w:t>
-      </w:r>
-    </w:p>
-    <w:p>
-      <w:r>
-        <w:t xml:space="preserve">über Frequenz; </w:t>
-      </w:r>
-      <w:r>
-        <w:rPr>
-          <w:b/>
-        </w:rPr>
-        <w:t>Pop-out Antenna Graph</w:t>
-      </w:r>
-      <w:r>
-        <w:t xml:space="preserve"> = Extra-Fenster; Feld-Dumps</w:t>
-      </w:r>
-    </w:p>
-    <w:p>
-      <w:r>
-        <w:t xml:space="preserve">weiterhin unter </w:t>
-      </w:r>
-      <w:r>
-        <w:rPr>
-          <w:rFonts w:ascii="Consolas" w:hAnsi="Consolas"/>
-          <w:sz w:val="18"/>
-        </w:rPr>
-        <w:t>work/&lt;projekt&gt;/fields/</w:t>
-      </w:r>
-      <w:r>
-        <w:t xml:space="preserve"> (S-Parameter in</w:t>
-      </w:r>
-    </w:p>
-    <w:p>
-      <w:r>
-        <w:rPr>
-          <w:rFonts w:ascii="Consolas" w:hAnsi="Consolas"/>
-          <w:sz w:val="18"/>
-        </w:rPr>
-        <w:t>work/&lt;projekt&gt;/sparams/</w:t>
-      </w:r>
-      <w:r>
-        <w:t xml:space="preserve">, NF2FF in </w:t>
-      </w:r>
-      <w:r>
-        <w:rPr>
-          <w:rFonts w:ascii="Consolas" w:hAnsi="Consolas"/>
-          <w:sz w:val="18"/>
-        </w:rPr>
-        <w:t>work/&lt;projekt&gt;/nf2ff/</w:t>
-      </w:r>
-      <w:r>
-        <w:t>).</w:t>
-      </w:r>
-    </w:p>
-    <w:p>
-      <w:r>
-        <w:rPr>
-          <w:b/>
-        </w:rPr>
-        <w:t>Polarization…</w:t>
-      </w:r>
-      <w:r>
-        <w:t xml:space="preserve"> (Button im Antenna-Tab) zeigt Größen aus demselben</w:t>
-      </w:r>
-    </w:p>
-    <w:p>
-      <w:r>
-        <w:t xml:space="preserve">NF2FF-Ergebnis — ohne neuen Lauf: </w:t>
-      </w:r>
-      <w:r>
-        <w:rPr>
-          <w:b/>
-        </w:rPr>
-        <w:t>Axial Ratio</w:t>
-      </w:r>
-      <w:r>
-        <w:t xml:space="preserve"> (dB, Drehsinn</w:t>
-      </w:r>
-    </w:p>
-    <w:p>
-      <w:r>
-        <w:t xml:space="preserve">RHCP/LHCP, Tilt; linear → „linear") und </w:t>
-      </w:r>
-      <w:r>
-        <w:rPr>
-          <w:b/>
-        </w:rPr>
-        <w:t>Phase Center</w:t>
-      </w:r>
-      <w:r>
-        <w:t xml:space="preserve"> (Δx/Δy/Δz in mm</w:t>
-      </w:r>
-    </w:p>
-    <w:p>
-      <w:r>
-        <w:t>plus RMS des Phasen-Fits) relativ zum NF2FF-Boxmittelpunkt. Der</w:t>
-      </w:r>
-    </w:p>
-    <w:p>
-      <w:r>
-        <w:t>Phase-Center-Wert ist eine Schätzung für einen klaren Hauptstrahl; passt</w:t>
-      </w:r>
-    </w:p>
-    <w:p>
-      <w:r>
-        <w:t>der Fit nicht, steht „—" mit „phase not well-defined". Details:</w:t>
-      </w:r>
-    </w:p>
-    <w:p>
-      <w:r>
-        <w:t>F1 → „Polarization &amp; Phase Center".</w:t>
-      </w:r>
-    </w:p>
-    <w:p>
-      <w:pPr>
-        <w:pStyle w:val="ListNumber"/>
-      </w:pPr>
-      <w:r>
-        <w:rPr>
-          <w:b/>
-        </w:rPr>
-        <w:t>2-Port (S2P)</w:t>
-      </w:r>
-      <w:r>
-        <w:t xml:space="preserve"> — ein FDTD-Lauf misst </w:t>
-      </w:r>
-      <w:r>
-        <w:rPr>
-          <w:b/>
-        </w:rPr>
-        <w:t>eine</w:t>
-      </w:r>
-      <w:r>
-        <w:t xml:space="preserve"> Spalte der S-Matrix (für 2 Ports:</w:t>
-      </w:r>
-    </w:p>
-    <w:p>
-      <w:r>
-        <w:t>S11 + S21). Weitere Spalten brauchen weitere Läufe mit anderem erregtem Port</w:t>
-      </w:r>
-    </w:p>
-    <w:p>
-      <w:r>
-        <w:t>(</w:t>
-      </w:r>
-      <w:r>
-        <w:rPr>
-          <w:rFonts w:ascii="Consolas" w:hAnsi="Consolas"/>
-          <w:sz w:val="18"/>
-        </w:rPr>
-        <w:t>excite_port</w:t>
-      </w:r>
-      <w:r>
-        <w:t xml:space="preserve"> umschalten); die JSON-Ergebnisse werden danach zusammengeführt —</w:t>
-      </w:r>
-    </w:p>
-    <w:p>
-      <w:r>
-        <w:t xml:space="preserve">Beispiel: </w:t>
-      </w:r>
-      <w:r>
-        <w:rPr>
-          <w:rFonts w:ascii="Consolas" w:hAnsi="Consolas"/>
-          <w:sz w:val="18"/>
-        </w:rPr>
-        <w:t>examples\run_pcb_filter_example.py</w:t>
-      </w:r>
-      <w:r>
-        <w:t>.</w:t>
-      </w:r>
-    </w:p>
-    <w:p>
-      <w:r>
-        <w:t xml:space="preserve">Nicht gemessene Einträge bleiben leer (NaN) in </w:t>
-      </w:r>
-      <w:r>
-        <w:rPr>
-          <w:rFonts w:ascii="Consolas" w:hAnsi="Consolas"/>
-          <w:sz w:val="18"/>
-        </w:rPr>
-        <w:t>sparams.json</w:t>
-      </w:r>
-      <w:r>
-        <w:t>, die Touchstone-Datei</w:t>
-      </w:r>
-    </w:p>
-    <w:p>
-      <w:r>
-        <w:t>(</w:t>
-      </w:r>
-      <w:r>
-        <w:rPr>
-          <w:rFonts w:ascii="Consolas" w:hAnsi="Consolas"/>
-          <w:sz w:val="18"/>
-        </w:rPr>
-        <w:t>.s2p</w:t>
-      </w:r>
-      <w:r>
-        <w:t>) entsteht erst, wenn die Matrix vollständig ist.</w:t>
-      </w:r>
-    </w:p>
-    <w:p>
-      <w:pPr>
-        <w:pStyle w:val="ListNumber"/>
-      </w:pPr>
-      <w:r>
-        <w:rPr>
-          <w:b/>
-        </w:rPr>
-        <w:t>Field Viewer</w:t>
-      </w:r>
-      <w:r>
-        <w:t xml:space="preserve"> — 3D-Ansicht der Felddumps (F1 für die Hilfe). Die</w:t>
-      </w:r>
-    </w:p>
-    <w:p>
-      <w:r>
-        <w:t xml:space="preserve">Vektor-Pfeile („Vectors") </w:t>
-      </w:r>
-      <w:r>
-        <w:rPr>
-          <w:b/>
-        </w:rPr>
-        <w:t>ersetzen</w:t>
-      </w:r>
-      <w:r>
-        <w:t xml:space="preserve"> die farbige Felddarstellung</w:t>
-      </w:r>
-    </w:p>
-    <w:p>
-      <w:r>
-        <w:t>(ParaView-Stil), damit keine opake Schnitt-/Oberflächenebene die Pfeile</w:t>
-      </w:r>
-    </w:p>
-    <w:p>
-      <w:r>
-        <w:t>verdeckt; mit „field underneath" läßt sich die Überlagerung wieder</w:t>
-      </w:r>
-    </w:p>
-    <w:p>
-      <w:r>
-        <w:t>einschalten. Beim manuellen Durchschalten einer Serie meldet die</w:t>
-      </w:r>
-    </w:p>
-    <w:p>
-      <w:r>
-        <w:t>Schritt-Anzeige, wie viele Pfeile sich gegenüber dem vorigen Schritt gedreht</w:t>
-      </w:r>
-    </w:p>
-    <w:p>
-      <w:r>
-        <w:t>haben — damit ist sofort sichtbar, ob die Pfeile dem Feld wirklich folgen.</w:t>
-      </w:r>
-    </w:p>
-    <w:p>
-      <w:r>
-        <w:t>Bei ausgeschaltetem „same length" zeigt die Pfeillänge die Amplitude; die</w:t>
-      </w:r>
-    </w:p>
-    <w:p>
-      <w:r>
-        <w:t>Referenz wird einmal über die ganze Serie gemessen, die Längen sind also</w:t>
-      </w:r>
-    </w:p>
-    <w:p>
-      <w:r>
-        <w:t>von Bild zu Bild vergleichbar.</w:t>
-      </w:r>
-    </w:p>
-    <w:p>
-      <w:r>
-        <w:t>Der Export schreibt zusätzlich eine ParaView-Collection (</w:t>
-      </w:r>
-      <w:r>
-        <w:rPr>
-          <w:rFonts w:ascii="Consolas" w:hAnsi="Consolas"/>
-          <w:sz w:val="18"/>
-        </w:rPr>
-        <w:t>&lt;dump&gt;.pvd</w:t>
-      </w:r>
-      <w:r>
-        <w:t>) neben</w:t>
-      </w:r>
-    </w:p>
-    <w:p>
-      <w:r>
-        <w:t>die Schritt-Dateien, damit die ganze Serie in ParaView aus einer Datei läuft</w:t>
-      </w:r>
-    </w:p>
-    <w:p>
-      <w:r>
-        <w:t>— siehe §12.4.</w:t>
-      </w:r>
-    </w:p>
-    <w:p>
-      <w:pPr>
-        <w:pStyle w:val="Heading3"/>
-      </w:pPr>
-      <w:r>
-        <w:t>7.1 Antenna-Tab in Bildern</w:t>
-      </w:r>
-    </w:p>
-    <w:p>
-      <w:pPr>
         <w:jc w:val="center"/>
       </w:pPr>
       <w:r>
         <w:drawing>
           <wp:inline xmlns:a="http://schemas.openxmlformats.org/drawingml/2006/main" xmlns:pic="http://schemas.openxmlformats.org/drawingml/2006/picture">
             <wp:extent cx="5669280" cy="3631882"/>
-            <wp:docPr id="7" name="Picture 7"/>
+            <wp:docPr id="11" name="Picture 11"/>
             <wp:cNvGraphicFramePr>
               <a:graphicFrameLocks noChangeAspect="1"/>
             </wp:cNvGraphicFramePr>
@@ -6201,11 +6025,11 @@
               <a:graphicData uri="http://schemas.openxmlformats.org/drawingml/2006/picture">
                 <pic:pic>
                   <pic:nvPicPr>
-                    <pic:cNvPr id="0" name="antenna_tab_polar.png"/>
+                    <pic:cNvPr id="0" name="sparams_viewer.png"/>
                     <pic:cNvPicPr/>
                   </pic:nvPicPr>
                   <pic:blipFill>
-                    <a:blip r:embed="rId15"/>
+                    <a:blip r:embed="rId19"/>
                     <a:stretch>
                       <a:fillRect/>
                     </a:stretch>
@@ -6229,10 +6053,386 @@
         <w:rPr>
           <w:b/>
         </w:rPr>
-        <w:t>Antenna-Tab, H-Ebene.</w:t>
-      </w:r>
-      <w:r>
-        <w:t xml:space="preserve"> Links die gefundenen NF2FF-Ergebnisse und der Details-Block (Dmax, Gmax, η, Prad, Raster), rechts der Polarschnitt mit dBi-Ringen. Rechtsklick auf den Plot öffnet das Analyse-Menü (HPBW, Vor-Rück-Verhältnis, Marker, Pop-out). Beispiel: der 2,45-GHz-Patch aus §2.2.</w:t>
+        <w:t>S-Params.</w:t>
+      </w:r>
+      <w:r>
+        <w:t xml:space="preserve"> Smith-Chart, |S| dB, Phase, VSWR; Marker per Klick, „Go to S-min“ springt auf das Resonanzminimum, „Pop out“ löst den Plot in ein eigenes Fenster.</w:t>
+      </w:r>
+    </w:p>
+    <w:p>
+      <w:pPr>
+        <w:pStyle w:val="ListNumber"/>
+      </w:pPr>
+      <w:r>
+        <w:rPr>
+          <w:b/>
+        </w:rPr>
+        <w:t>S-Params Viewer</w:t>
+      </w:r>
+    </w:p>
+    <w:p>
+      <w:pPr>
+        <w:pStyle w:val="ListBullet"/>
+      </w:pPr>
+      <w:r>
+        <w:t>S11 / S21, dB, Phase</w:t>
+      </w:r>
+    </w:p>
+    <w:p>
+      <w:pPr>
+        <w:pStyle w:val="ListBullet"/>
+      </w:pPr>
+      <w:r>
+        <w:t>Marker: Frequenz, S, Γ, Z/Y, VSWR, RL</w:t>
+      </w:r>
+    </w:p>
+    <w:p>
+      <w:pPr>
+        <w:pStyle w:val="ListBullet"/>
+      </w:pPr>
+      <w:r>
+        <w:t>Smith-Chart: Z- und Y-Marker</w:t>
+      </w:r>
+    </w:p>
+    <w:p>
+      <w:pPr>
+        <w:pStyle w:val="ListNumber"/>
+      </w:pPr>
+      <w:r>
+        <w:rPr>
+          <w:b/>
+        </w:rPr>
+        <w:t>Pop-out S-Graph</w:t>
+      </w:r>
+      <w:r>
+        <w:t xml:space="preserve"> — Plot in Extra-Fenster</w:t>
+      </w:r>
+    </w:p>
+    <w:p>
+      <w:pPr>
+        <w:pStyle w:val="ListNumber"/>
+      </w:pPr>
+      <w:r>
+        <w:rPr>
+          <w:b/>
+        </w:rPr>
+        <w:t>Antenna</w:t>
+      </w:r>
+      <w:r>
+        <w:t xml:space="preserve">-Tab / </w:t>
+      </w:r>
+      <w:r>
+        <w:rPr>
+          <w:b/>
+        </w:rPr>
+        <w:t>Simulation → Antenna Pattern Viewer</w:t>
+      </w:r>
+      <w:r>
+        <w:t xml:space="preserve"> — NF2FF-Fernfeld:</w:t>
+      </w:r>
+    </w:p>
+    <w:p>
+      <w:r>
+        <w:t>3D-Polar des Gewinns, 2D-Polarschnitte (E/H-Ebene), Direktivität/Gain/η</w:t>
+      </w:r>
+    </w:p>
+    <w:p>
+      <w:r>
+        <w:t xml:space="preserve">über Frequenz; </w:t>
+      </w:r>
+      <w:r>
+        <w:rPr>
+          <w:b/>
+        </w:rPr>
+        <w:t>Pop-out Antenna Graph</w:t>
+      </w:r>
+      <w:r>
+        <w:t xml:space="preserve"> = Extra-Fenster; Feld-Dumps</w:t>
+      </w:r>
+    </w:p>
+    <w:p>
+      <w:r>
+        <w:t xml:space="preserve">weiterhin unter </w:t>
+      </w:r>
+      <w:r>
+        <w:rPr>
+          <w:rFonts w:ascii="Consolas" w:hAnsi="Consolas"/>
+          <w:sz w:val="18"/>
+        </w:rPr>
+        <w:t>work/&lt;projekt&gt;/fields/</w:t>
+      </w:r>
+      <w:r>
+        <w:t xml:space="preserve"> (S-Parameter in</w:t>
+      </w:r>
+    </w:p>
+    <w:p>
+      <w:r>
+        <w:rPr>
+          <w:rFonts w:ascii="Consolas" w:hAnsi="Consolas"/>
+          <w:sz w:val="18"/>
+        </w:rPr>
+        <w:t>work/&lt;projekt&gt;/sparams/</w:t>
+      </w:r>
+      <w:r>
+        <w:t xml:space="preserve">, NF2FF in </w:t>
+      </w:r>
+      <w:r>
+        <w:rPr>
+          <w:rFonts w:ascii="Consolas" w:hAnsi="Consolas"/>
+          <w:sz w:val="18"/>
+        </w:rPr>
+        <w:t>work/&lt;projekt&gt;/nf2ff/</w:t>
+      </w:r>
+      <w:r>
+        <w:t>).</w:t>
+      </w:r>
+    </w:p>
+    <w:p>
+      <w:r>
+        <w:rPr>
+          <w:b/>
+        </w:rPr>
+        <w:t>Polarization…</w:t>
+      </w:r>
+      <w:r>
+        <w:t xml:space="preserve"> (Button im Antenna-Tab) zeigt Größen aus demselben</w:t>
+      </w:r>
+    </w:p>
+    <w:p>
+      <w:r>
+        <w:t xml:space="preserve">NF2FF-Ergebnis — ohne neuen Lauf: </w:t>
+      </w:r>
+      <w:r>
+        <w:rPr>
+          <w:b/>
+        </w:rPr>
+        <w:t>Axial Ratio</w:t>
+      </w:r>
+      <w:r>
+        <w:t xml:space="preserve"> (dB, Drehsinn</w:t>
+      </w:r>
+    </w:p>
+    <w:p>
+      <w:r>
+        <w:t xml:space="preserve">RHCP/LHCP, Tilt; linear → „linear") und </w:t>
+      </w:r>
+      <w:r>
+        <w:rPr>
+          <w:b/>
+        </w:rPr>
+        <w:t>Phase Center</w:t>
+      </w:r>
+      <w:r>
+        <w:t xml:space="preserve"> (Δx/Δy/Δz in mm</w:t>
+      </w:r>
+    </w:p>
+    <w:p>
+      <w:r>
+        <w:t>plus RMS des Phasen-Fits) relativ zum NF2FF-Boxmittelpunkt. Der</w:t>
+      </w:r>
+    </w:p>
+    <w:p>
+      <w:r>
+        <w:t>Phase-Center-Wert ist eine Schätzung für einen klaren Hauptstrahl; passt</w:t>
+      </w:r>
+    </w:p>
+    <w:p>
+      <w:r>
+        <w:t>der Fit nicht, steht „—" mit „phase not well-defined". Details:</w:t>
+      </w:r>
+    </w:p>
+    <w:p>
+      <w:r>
+        <w:t>F1 → „Polarization &amp; Phase Center".</w:t>
+      </w:r>
+    </w:p>
+    <w:p>
+      <w:pPr>
+        <w:pStyle w:val="ListNumber"/>
+      </w:pPr>
+      <w:r>
+        <w:rPr>
+          <w:b/>
+        </w:rPr>
+        <w:t>2-Port (S2P)</w:t>
+      </w:r>
+      <w:r>
+        <w:t xml:space="preserve"> — ein FDTD-Lauf misst </w:t>
+      </w:r>
+      <w:r>
+        <w:rPr>
+          <w:b/>
+        </w:rPr>
+        <w:t>eine</w:t>
+      </w:r>
+      <w:r>
+        <w:t xml:space="preserve"> Spalte der S-Matrix (für 2 Ports:</w:t>
+      </w:r>
+    </w:p>
+    <w:p>
+      <w:r>
+        <w:t>S11 + S21). Weitere Spalten brauchen weitere Läufe mit anderem erregtem Port</w:t>
+      </w:r>
+    </w:p>
+    <w:p>
+      <w:r>
+        <w:t>(</w:t>
+      </w:r>
+      <w:r>
+        <w:rPr>
+          <w:rFonts w:ascii="Consolas" w:hAnsi="Consolas"/>
+          <w:sz w:val="18"/>
+        </w:rPr>
+        <w:t>excite_port</w:t>
+      </w:r>
+      <w:r>
+        <w:t xml:space="preserve"> umschalten); die JSON-Ergebnisse werden danach zusammengeführt —</w:t>
+      </w:r>
+    </w:p>
+    <w:p>
+      <w:r>
+        <w:t xml:space="preserve">Beispiel: </w:t>
+      </w:r>
+      <w:r>
+        <w:rPr>
+          <w:rFonts w:ascii="Consolas" w:hAnsi="Consolas"/>
+          <w:sz w:val="18"/>
+        </w:rPr>
+        <w:t>examples\run_pcb_filter_example.py</w:t>
+      </w:r>
+      <w:r>
+        <w:t>.</w:t>
+      </w:r>
+    </w:p>
+    <w:p>
+      <w:r>
+        <w:t xml:space="preserve">Nicht gemessene Einträge bleiben leer (NaN) in </w:t>
+      </w:r>
+      <w:r>
+        <w:rPr>
+          <w:rFonts w:ascii="Consolas" w:hAnsi="Consolas"/>
+          <w:sz w:val="18"/>
+        </w:rPr>
+        <w:t>sparams.json</w:t>
+      </w:r>
+      <w:r>
+        <w:t>, die Touchstone-Datei</w:t>
+      </w:r>
+    </w:p>
+    <w:p>
+      <w:r>
+        <w:t>(</w:t>
+      </w:r>
+      <w:r>
+        <w:rPr>
+          <w:rFonts w:ascii="Consolas" w:hAnsi="Consolas"/>
+          <w:sz w:val="18"/>
+        </w:rPr>
+        <w:t>.s2p</w:t>
+      </w:r>
+      <w:r>
+        <w:t>) entsteht erst, wenn die Matrix vollständig ist.</w:t>
+      </w:r>
+    </w:p>
+    <w:p>
+      <w:pPr>
+        <w:pStyle w:val="ListNumber"/>
+      </w:pPr>
+      <w:r>
+        <w:rPr>
+          <w:b/>
+        </w:rPr>
+        <w:t>Field Viewer</w:t>
+      </w:r>
+      <w:r>
+        <w:t xml:space="preserve"> — 3D-Ansicht der Felddumps (F1 für die Hilfe). Die</w:t>
+      </w:r>
+    </w:p>
+    <w:p>
+      <w:r>
+        <w:t xml:space="preserve">Vektor-Pfeile („Vectors") </w:t>
+      </w:r>
+      <w:r>
+        <w:rPr>
+          <w:b/>
+        </w:rPr>
+        <w:t>ersetzen</w:t>
+      </w:r>
+      <w:r>
+        <w:t xml:space="preserve"> die farbige Felddarstellung</w:t>
+      </w:r>
+    </w:p>
+    <w:p>
+      <w:r>
+        <w:t>(ParaView-Stil), damit keine opake Schnitt-/Oberflächenebene die Pfeile</w:t>
+      </w:r>
+    </w:p>
+    <w:p>
+      <w:r>
+        <w:t>verdeckt; mit „field underneath" läßt sich die Überlagerung wieder</w:t>
+      </w:r>
+    </w:p>
+    <w:p>
+      <w:r>
+        <w:t>einschalten. Beim manuellen Durchschalten einer Serie meldet die</w:t>
+      </w:r>
+    </w:p>
+    <w:p>
+      <w:r>
+        <w:t>Schritt-Anzeige, wie viele Pfeile sich gegenüber dem vorigen Schritt gedreht</w:t>
+      </w:r>
+    </w:p>
+    <w:p>
+      <w:r>
+        <w:t>haben — damit ist sofort sichtbar, ob die Pfeile dem Feld wirklich folgen.</w:t>
+      </w:r>
+    </w:p>
+    <w:p>
+      <w:r>
+        <w:t>Bei ausgeschaltetem „same length" zeigt die Pfeillänge die Amplitude; die</w:t>
+      </w:r>
+    </w:p>
+    <w:p>
+      <w:r>
+        <w:t>Referenz wird einmal über die ganze Serie gemessen, die Längen sind also</w:t>
+      </w:r>
+    </w:p>
+    <w:p>
+      <w:r>
+        <w:t>von Bild zu Bild vergleichbar.</w:t>
+      </w:r>
+    </w:p>
+    <w:p>
+      <w:r>
+        <w:t>Der Export schreibt zusätzlich eine ParaView-Collection (</w:t>
+      </w:r>
+      <w:r>
+        <w:rPr>
+          <w:rFonts w:ascii="Consolas" w:hAnsi="Consolas"/>
+          <w:sz w:val="18"/>
+        </w:rPr>
+        <w:t>&lt;dump&gt;.pvd</w:t>
+      </w:r>
+      <w:r>
+        <w:t>) neben</w:t>
+      </w:r>
+    </w:p>
+    <w:p>
+      <w:r>
+        <w:t>die Schritt-Dateien, damit die ganze Serie in ParaView aus einer Datei läuft</w:t>
+      </w:r>
+    </w:p>
+    <w:p>
+      <w:r>
+        <w:t>— siehe §12.4.</w:t>
+      </w:r>
+    </w:p>
+    <w:p>
+      <w:pPr>
+        <w:pStyle w:val="Heading3"/>
+      </w:pPr>
+      <w:r>
+        <w:t>7.1 Antenna-Tab in Bildern</w:t>
       </w:r>
     </w:p>
     <w:p>
@@ -6243,7 +6443,7 @@
         <w:drawing>
           <wp:inline xmlns:a="http://schemas.openxmlformats.org/drawingml/2006/main" xmlns:pic="http://schemas.openxmlformats.org/drawingml/2006/picture">
             <wp:extent cx="5669280" cy="3631882"/>
-            <wp:docPr id="8" name="Picture 8"/>
+            <wp:docPr id="12" name="Picture 12"/>
             <wp:cNvGraphicFramePr>
               <a:graphicFrameLocks noChangeAspect="1"/>
             </wp:cNvGraphicFramePr>
@@ -6251,11 +6451,11 @@
               <a:graphicData uri="http://schemas.openxmlformats.org/drawingml/2006/picture">
                 <pic:pic>
                   <pic:nvPicPr>
-                    <pic:cNvPr id="0" name="antenna_ar_cut.png"/>
+                    <pic:cNvPr id="0" name="antenna_tab_polar.png"/>
                     <pic:cNvPicPr/>
                   </pic:nvPicPr>
                   <pic:blipFill>
-                    <a:blip r:embed="rId16"/>
+                    <a:blip r:embed="rId20"/>
                     <a:stretch>
                       <a:fillRect/>
                     </a:stretch>
@@ -6279,10 +6479,10 @@
         <w:rPr>
           <w:b/>
         </w:rPr>
-        <w:t>Plottyp „Axial Ratio (theta cut)".</w:t>
-      </w:r>
-      <w:r>
-        <w:t xml:space="preserve"> AR über θ bei wählbarem Azimut (Wähler „AR φ" in der Plot-Toolbar, 0…315°). Das grüne Band ist der Bereich AR ≤ 3 dB; Punktlinie und Text nennen die größte Auslenkung ab Boresight, die diese Grenze noch einhält. Beispiel: GPS-L1-Patch bei 1,57542 GHz — 1,70 dB bei θ = 0°, ≤ 3 dB bis θ = 62°. Beim linear polarisierten 2,45-GHz-Beispiel liegt der AR durchgehend über 10 dB; dort taugt der Schnitt nur als Kontrolle.</w:t>
+        <w:t>Antenna-Tab, H-Ebene.</w:t>
+      </w:r>
+      <w:r>
+        <w:t xml:space="preserve"> Links die gefundenen NF2FF-Ergebnisse und der Details-Block (Dmax, Gmax, η, Prad, Raster), rechts der Polarschnitt mit dBi-Ringen. Rechtsklick auf den Plot öffnet das Analyse-Menü (HPBW, Vor-Rück-Verhältnis, Marker, Pop-out). Beispiel: der 2,45-GHz-Patch aus §2.2.</w:t>
       </w:r>
     </w:p>
     <w:p>
@@ -6293,7 +6493,7 @@
         <w:drawing>
           <wp:inline xmlns:a="http://schemas.openxmlformats.org/drawingml/2006/main" xmlns:pic="http://schemas.openxmlformats.org/drawingml/2006/picture">
             <wp:extent cx="5669280" cy="3631882"/>
-            <wp:docPr id="9" name="Picture 9"/>
+            <wp:docPr id="13" name="Picture 13"/>
             <wp:cNvGraphicFramePr>
               <a:graphicFrameLocks noChangeAspect="1"/>
             </wp:cNvGraphicFramePr>
@@ -6301,11 +6501,11 @@
               <a:graphicData uri="http://schemas.openxmlformats.org/drawingml/2006/picture">
                 <pic:pic>
                   <pic:nvPicPr>
-                    <pic:cNvPr id="0" name="antenna_3d_pattern.png"/>
+                    <pic:cNvPr id="0" name="antenna_ar_cut.png"/>
                     <pic:cNvPicPr/>
                   </pic:nvPicPr>
                   <pic:blipFill>
-                    <a:blip r:embed="rId17"/>
+                    <a:blip r:embed="rId21"/>
                     <a:stretch>
                       <a:fillRect/>
                     </a:stretch>
@@ -6329,10 +6529,10 @@
         <w:rPr>
           <w:b/>
         </w:rPr>
-        <w:t>3D-Muster.</w:t>
-      </w:r>
-      <w:r>
-        <w:t xml:space="preserve"> Die drei Raumrichtungen sind mit x/y/z beschriftet. Der Radius ist auf das dBi-Fenster normiert (Regler „dBi min" in der Toolbar), die absoluten Werte liefert die Farbskala rechts.</w:t>
+        <w:t>Plottyp „Axial Ratio (theta cut)".</w:t>
+      </w:r>
+      <w:r>
+        <w:t xml:space="preserve"> AR über θ bei wählbarem Azimut (Wähler „AR φ" in der Plot-Toolbar, 0…315°). Das grüne Band ist der Bereich AR ≤ 3 dB; Punktlinie und Text nennen die größte Auslenkung ab Boresight, die diese Grenze noch einhält. Beispiel: GPS-L1-Patch bei 1,57542 GHz — 1,70 dB bei θ = 0°, ≤ 3 dB bis θ = 62°. Beim linear polarisierten 2,45-GHz-Beispiel liegt der AR durchgehend über 10 dB; dort taugt der Schnitt nur als Kontrolle.</w:t>
       </w:r>
     </w:p>
     <w:p>
@@ -6342,8 +6542,58 @@
       <w:r>
         <w:drawing>
           <wp:inline xmlns:a="http://schemas.openxmlformats.org/drawingml/2006/main" xmlns:pic="http://schemas.openxmlformats.org/drawingml/2006/picture">
+            <wp:extent cx="5669280" cy="3631882"/>
+            <wp:docPr id="14" name="Picture 14"/>
+            <wp:cNvGraphicFramePr>
+              <a:graphicFrameLocks noChangeAspect="1"/>
+            </wp:cNvGraphicFramePr>
+            <a:graphic>
+              <a:graphicData uri="http://schemas.openxmlformats.org/drawingml/2006/picture">
+                <pic:pic>
+                  <pic:nvPicPr>
+                    <pic:cNvPr id="0" name="antenna_3d_pattern.png"/>
+                    <pic:cNvPicPr/>
+                  </pic:nvPicPr>
+                  <pic:blipFill>
+                    <a:blip r:embed="rId22"/>
+                    <a:stretch>
+                      <a:fillRect/>
+                    </a:stretch>
+                  </pic:blipFill>
+                  <pic:spPr>
+                    <a:xfrm>
+                      <a:off x="0" y="0"/>
+                      <a:ext cx="5669280" cy="3631882"/>
+                    </a:xfrm>
+                    <a:prstGeom prst="rect"/>
+                  </pic:spPr>
+                </pic:pic>
+              </a:graphicData>
+            </a:graphic>
+          </wp:inline>
+        </w:drawing>
+      </w:r>
+    </w:p>
+    <w:p>
+      <w:r>
+        <w:rPr>
+          <w:b/>
+        </w:rPr>
+        <w:t>3D-Muster.</w:t>
+      </w:r>
+      <w:r>
+        <w:t xml:space="preserve"> Die drei Raumrichtungen sind mit x/y/z beschriftet. Der Radius ist auf das dBi-Fenster normiert (Regler „dBi min" in der Toolbar), die absoluten Werte liefert die Farbskala rechts.</w:t>
+      </w:r>
+    </w:p>
+    <w:p>
+      <w:pPr>
+        <w:jc w:val="center"/>
+      </w:pPr>
+      <w:r>
+        <w:drawing>
+          <wp:inline xmlns:a="http://schemas.openxmlformats.org/drawingml/2006/main" xmlns:pic="http://schemas.openxmlformats.org/drawingml/2006/picture">
             <wp:extent cx="5669280" cy="2664562"/>
-            <wp:docPr id="10" name="Picture 10"/>
+            <wp:docPr id="15" name="Picture 15"/>
             <wp:cNvGraphicFramePr>
               <a:graphicFrameLocks noChangeAspect="1"/>
             </wp:cNvGraphicFramePr>
@@ -6355,7 +6605,7 @@
                     <pic:cNvPicPr/>
                   </pic:nvPicPr>
                   <pic:blipFill>
-                    <a:blip r:embed="rId18"/>
+                    <a:blip r:embed="rId23"/>
                     <a:stretch>
                       <a:fillRect/>
                     </a:stretch>
@@ -6401,7 +6651,7 @@
         <w:drawing>
           <wp:inline xmlns:a="http://schemas.openxmlformats.org/drawingml/2006/main" xmlns:pic="http://schemas.openxmlformats.org/drawingml/2006/picture">
             <wp:extent cx="5669280" cy="4724400"/>
-            <wp:docPr id="11" name="Picture 11"/>
+            <wp:docPr id="16" name="Picture 16"/>
             <wp:cNvGraphicFramePr>
               <a:graphicFrameLocks noChangeAspect="1"/>
             </wp:cNvGraphicFramePr>
@@ -6413,7 +6663,7 @@
                     <pic:cNvPicPr/>
                   </pic:nvPicPr>
                   <pic:blipFill>
-                    <a:blip r:embed="rId19"/>
+                    <a:blip r:embed="rId24"/>
                     <a:stretch>
                       <a:fillRect/>
                     </a:stretch>

</xml_diff>

<commit_message>
docs(ui): add the geometry cross-section and the domain overview
Eighteen figures per guide: section 2.2 now shows the cross-section the FreeCAD sketch has to produce (patch on 1.6 mm FR4 above the ground, port in the middle), section 5.6 shows the overview with the FDTD domain and the NF2FF box plus the cell statistics.

build_anleitung_docx.py deletes the target ODT before converting: LibreOffice reports success without overwriting an existing file, which had left a stale ANLEITUNG_EN.odt behind.
</commit_message>
<xml_diff>
--- a/docs/ANLEITUNG_DE.docx
+++ b/docs/ANLEITUNG_DE.docx
@@ -473,6 +473,56 @@
       </w:r>
     </w:p>
     <w:p>
+      <w:pPr>
+        <w:jc w:val="center"/>
+      </w:pPr>
+      <w:r>
+        <w:drawing>
+          <wp:inline xmlns:a="http://schemas.openxmlformats.org/drawingml/2006/main" xmlns:pic="http://schemas.openxmlformats.org/drawingml/2006/picture">
+            <wp:extent cx="5669280" cy="3631882"/>
+            <wp:docPr id="1" name="Picture 1"/>
+            <wp:cNvGraphicFramePr>
+              <a:graphicFrameLocks noChangeAspect="1"/>
+            </wp:cNvGraphicFramePr>
+            <a:graphic>
+              <a:graphicData uri="http://schemas.openxmlformats.org/drawingml/2006/picture">
+                <pic:pic>
+                  <pic:nvPicPr>
+                    <pic:cNvPr id="0" name="geometry_section.png"/>
+                    <pic:cNvPicPr/>
+                  </pic:nvPicPr>
+                  <pic:blipFill>
+                    <a:blip r:embed="rId9"/>
+                    <a:stretch>
+                      <a:fillRect/>
+                    </a:stretch>
+                  </pic:blipFill>
+                  <pic:spPr>
+                    <a:xfrm>
+                      <a:off x="0" y="0"/>
+                      <a:ext cx="5669280" cy="3631882"/>
+                    </a:xfrm>
+                    <a:prstGeom prst="rect"/>
+                  </pic:spPr>
+                </pic:pic>
+              </a:graphicData>
+            </a:graphic>
+          </wp:inline>
+        </w:drawing>
+      </w:r>
+    </w:p>
+    <w:p>
+      <w:r>
+        <w:rPr>
+          <w:b/>
+        </w:rPr>
+        <w:t>Querschnitt der Zielgeometrie.</w:t>
+      </w:r>
+      <w:r>
+        <w:t xml:space="preserve"> So muss die Skizze aussehen: Patch auf 1,6 mm FR4 über dem durchgehenden Ground, der Port als rote Linie in der Mitte. Das gezeigte Gitter ist schon auf die dünne Schicht verfeinert — im Mesh Viewer, nicht in FreeCAD.</w:t>
+      </w:r>
+    </w:p>
+    <w:p>
       <w:r>
         <w:t xml:space="preserve">Orientierung: </w:t>
       </w:r>
@@ -965,7 +1015,7 @@
         <w:drawing>
           <wp:inline xmlns:a="http://schemas.openxmlformats.org/drawingml/2006/main" xmlns:pic="http://schemas.openxmlformats.org/drawingml/2006/picture">
             <wp:extent cx="5669280" cy="3046468"/>
-            <wp:docPr id="1" name="Picture 1"/>
+            <wp:docPr id="2" name="Picture 2"/>
             <wp:cNvGraphicFramePr>
               <a:graphicFrameLocks noChangeAspect="1"/>
             </wp:cNvGraphicFramePr>
@@ -977,7 +1027,7 @@
                     <pic:cNvPicPr/>
                   </pic:nvPicPr>
                   <pic:blipFill>
-                    <a:blip r:embed="rId9"/>
+                    <a:blip r:embed="rId10"/>
                     <a:stretch>
                       <a:fillRect/>
                     </a:stretch>
@@ -1715,7 +1765,7 @@
         <w:drawing>
           <wp:inline xmlns:a="http://schemas.openxmlformats.org/drawingml/2006/main" xmlns:pic="http://schemas.openxmlformats.org/drawingml/2006/picture">
             <wp:extent cx="5669280" cy="4164740"/>
-            <wp:docPr id="2" name="Picture 2"/>
+            <wp:docPr id="3" name="Picture 3"/>
             <wp:cNvGraphicFramePr>
               <a:graphicFrameLocks noChangeAspect="1"/>
             </wp:cNvGraphicFramePr>
@@ -1727,7 +1777,7 @@
                     <pic:cNvPicPr/>
                   </pic:nvPicPr>
                   <pic:blipFill>
-                    <a:blip r:embed="rId10"/>
+                    <a:blip r:embed="rId11"/>
                     <a:stretch>
                       <a:fillRect/>
                     </a:stretch>
@@ -1945,7 +1995,7 @@
         <w:drawing>
           <wp:inline xmlns:a="http://schemas.openxmlformats.org/drawingml/2006/main" xmlns:pic="http://schemas.openxmlformats.org/drawingml/2006/picture">
             <wp:extent cx="5669280" cy="3046468"/>
-            <wp:docPr id="3" name="Picture 3"/>
+            <wp:docPr id="4" name="Picture 4"/>
             <wp:cNvGraphicFramePr>
               <a:graphicFrameLocks noChangeAspect="1"/>
             </wp:cNvGraphicFramePr>
@@ -1957,7 +2007,7 @@
                     <pic:cNvPicPr/>
                   </pic:nvPicPr>
                   <pic:blipFill>
-                    <a:blip r:embed="rId11"/>
+                    <a:blip r:embed="rId12"/>
                     <a:stretch>
                       <a:fillRect/>
                     </a:stretch>
@@ -3312,7 +3362,7 @@
         <w:drawing>
           <wp:inline xmlns:a="http://schemas.openxmlformats.org/drawingml/2006/main" xmlns:pic="http://schemas.openxmlformats.org/drawingml/2006/picture">
             <wp:extent cx="5669280" cy="5039360"/>
-            <wp:docPr id="4" name="Picture 4"/>
+            <wp:docPr id="5" name="Picture 5"/>
             <wp:cNvGraphicFramePr>
               <a:graphicFrameLocks noChangeAspect="1"/>
             </wp:cNvGraphicFramePr>
@@ -3324,7 +3374,7 @@
                     <pic:cNvPicPr/>
                   </pic:nvPicPr>
                   <pic:blipFill>
-                    <a:blip r:embed="rId12"/>
+                    <a:blip r:embed="rId13"/>
                     <a:stretch>
                       <a:fillRect/>
                     </a:stretch>
@@ -3837,7 +3887,7 @@
         <w:drawing>
           <wp:inline xmlns:a="http://schemas.openxmlformats.org/drawingml/2006/main" xmlns:pic="http://schemas.openxmlformats.org/drawingml/2006/picture">
             <wp:extent cx="5669280" cy="6105378"/>
-            <wp:docPr id="5" name="Picture 5"/>
+            <wp:docPr id="6" name="Picture 6"/>
             <wp:cNvGraphicFramePr>
               <a:graphicFrameLocks noChangeAspect="1"/>
             </wp:cNvGraphicFramePr>
@@ -3849,7 +3899,7 @@
                     <pic:cNvPicPr/>
                   </pic:nvPicPr>
                   <pic:blipFill>
-                    <a:blip r:embed="rId13"/>
+                    <a:blip r:embed="rId14"/>
                     <a:stretch>
                       <a:fillRect/>
                     </a:stretch>
@@ -4542,7 +4592,7 @@
         <w:drawing>
           <wp:inline xmlns:a="http://schemas.openxmlformats.org/drawingml/2006/main" xmlns:pic="http://schemas.openxmlformats.org/drawingml/2006/picture">
             <wp:extent cx="5669280" cy="4668819"/>
-            <wp:docPr id="6" name="Picture 6"/>
+            <wp:docPr id="7" name="Picture 7"/>
             <wp:cNvGraphicFramePr>
               <a:graphicFrameLocks noChangeAspect="1"/>
             </wp:cNvGraphicFramePr>
@@ -4554,7 +4604,7 @@
                     <pic:cNvPicPr/>
                   </pic:nvPicPr>
                   <pic:blipFill>
-                    <a:blip r:embed="rId14"/>
+                    <a:blip r:embed="rId15"/>
                     <a:stretch>
                       <a:fillRect/>
                     </a:stretch>
@@ -4714,7 +4764,7 @@
         <w:drawing>
           <wp:inline xmlns:a="http://schemas.openxmlformats.org/drawingml/2006/main" xmlns:pic="http://schemas.openxmlformats.org/drawingml/2006/picture">
             <wp:extent cx="5669280" cy="7698285"/>
-            <wp:docPr id="7" name="Picture 7"/>
+            <wp:docPr id="8" name="Picture 8"/>
             <wp:cNvGraphicFramePr>
               <a:graphicFrameLocks noChangeAspect="1"/>
             </wp:cNvGraphicFramePr>
@@ -4726,7 +4776,7 @@
                     <pic:cNvPicPr/>
                   </pic:nvPicPr>
                   <pic:blipFill>
-                    <a:blip r:embed="rId15"/>
+                    <a:blip r:embed="rId16"/>
                     <a:stretch>
                       <a:fillRect/>
                     </a:stretch>
@@ -4916,7 +4966,7 @@
         <w:drawing>
           <wp:inline xmlns:a="http://schemas.openxmlformats.org/drawingml/2006/main" xmlns:pic="http://schemas.openxmlformats.org/drawingml/2006/picture">
             <wp:extent cx="5669280" cy="5354320"/>
-            <wp:docPr id="8" name="Picture 8"/>
+            <wp:docPr id="9" name="Picture 9"/>
             <wp:cNvGraphicFramePr>
               <a:graphicFrameLocks noChangeAspect="1"/>
             </wp:cNvGraphicFramePr>
@@ -4928,7 +4978,7 @@
                     <pic:cNvPicPr/>
                   </pic:nvPicPr>
                   <pic:blipFill>
-                    <a:blip r:embed="rId16"/>
+                    <a:blip r:embed="rId17"/>
                     <a:stretch>
                       <a:fillRect/>
                     </a:stretch>
@@ -5151,6 +5201,56 @@
       </w:pPr>
       <w:r>
         <w:t>5.6 Domain-Größe (schwarzer Rahmen im Mesh Viewer)</w:t>
+      </w:r>
+    </w:p>
+    <w:p>
+      <w:pPr>
+        <w:jc w:val="center"/>
+      </w:pPr>
+      <w:r>
+        <w:drawing>
+          <wp:inline xmlns:a="http://schemas.openxmlformats.org/drawingml/2006/main" xmlns:pic="http://schemas.openxmlformats.org/drawingml/2006/picture">
+            <wp:extent cx="5669280" cy="3631882"/>
+            <wp:docPr id="10" name="Picture 10"/>
+            <wp:cNvGraphicFramePr>
+              <a:graphicFrameLocks noChangeAspect="1"/>
+            </wp:cNvGraphicFramePr>
+            <a:graphic>
+              <a:graphicData uri="http://schemas.openxmlformats.org/drawingml/2006/picture">
+                <pic:pic>
+                  <pic:nvPicPr>
+                    <pic:cNvPr id="0" name="mesh_viewer_overview.png"/>
+                    <pic:cNvPicPr/>
+                  </pic:nvPicPr>
+                  <pic:blipFill>
+                    <a:blip r:embed="rId18"/>
+                    <a:stretch>
+                      <a:fillRect/>
+                    </a:stretch>
+                  </pic:blipFill>
+                  <pic:spPr>
+                    <a:xfrm>
+                      <a:off x="0" y="0"/>
+                      <a:ext cx="5669280" cy="3631882"/>
+                    </a:xfrm>
+                    <a:prstGeom prst="rect"/>
+                  </pic:spPr>
+                </pic:pic>
+              </a:graphicData>
+            </a:graphic>
+          </wp:inline>
+        </w:drawing>
+      </w:r>
+    </w:p>
+    <w:p>
+      <w:r>
+        <w:rPr>
+          <w:b/>
+        </w:rPr>
+        <w:t>Domain und Boxen.</w:t>
+      </w:r>
+      <w:r>
+        <w:t xml:space="preserve"> Die Overview-Ansicht zeigt alle drei Projektionen: schwarz gestrichelt die Rechen-Domain, violett gestrichelt die NF2FF-Box, dazu Zellzahlen pro Achse und die Domain-Größe. Der schwarze Rahmen im Mesh Viewer ist genau diese Domain.</w:t>
       </w:r>
     </w:p>
     <w:p>
@@ -5668,7 +5768,7 @@
         <w:drawing>
           <wp:inline xmlns:a="http://schemas.openxmlformats.org/drawingml/2006/main" xmlns:pic="http://schemas.openxmlformats.org/drawingml/2006/picture">
             <wp:extent cx="5669280" cy="3968496"/>
-            <wp:docPr id="9" name="Picture 9"/>
+            <wp:docPr id="11" name="Picture 11"/>
             <wp:cNvGraphicFramePr>
               <a:graphicFrameLocks noChangeAspect="1"/>
             </wp:cNvGraphicFramePr>
@@ -5680,7 +5780,7 @@
                     <pic:cNvPicPr/>
                   </pic:nvPicPr>
                   <pic:blipFill>
-                    <a:blip r:embed="rId17"/>
+                    <a:blip r:embed="rId19"/>
                     <a:stretch>
                       <a:fillRect/>
                     </a:stretch>
@@ -5954,7 +6054,7 @@
         <w:drawing>
           <wp:inline xmlns:a="http://schemas.openxmlformats.org/drawingml/2006/main" xmlns:pic="http://schemas.openxmlformats.org/drawingml/2006/picture">
             <wp:extent cx="5669280" cy="3631882"/>
-            <wp:docPr id="10" name="Picture 10"/>
+            <wp:docPr id="12" name="Picture 12"/>
             <wp:cNvGraphicFramePr>
               <a:graphicFrameLocks noChangeAspect="1"/>
             </wp:cNvGraphicFramePr>
@@ -5963,495 +6063,6 @@
                 <pic:pic>
                   <pic:nvPicPr>
                     <pic:cNvPr id="0" name="mesh_viewer.png"/>
-                    <pic:cNvPicPr/>
-                  </pic:nvPicPr>
-                  <pic:blipFill>
-                    <a:blip r:embed="rId18"/>
-                    <a:stretch>
-                      <a:fillRect/>
-                    </a:stretch>
-                  </pic:blipFill>
-                  <pic:spPr>
-                    <a:xfrm>
-                      <a:off x="0" y="0"/>
-                      <a:ext cx="5669280" cy="3631882"/>
-                    </a:xfrm>
-                    <a:prstGeom prst="rect"/>
-                  </pic:spPr>
-                </pic:pic>
-              </a:graphicData>
-            </a:graphic>
-          </wp:inline>
-        </w:drawing>
-      </w:r>
-    </w:p>
-    <w:p>
-      <w:r>
-        <w:rPr>
-          <w:b/>
-        </w:rPr>
-        <w:t>Mesh-Viewer, XY-Schnitt bei z = 1,6 mm.</w:t>
-      </w:r>
-      <w:r>
-        <w:t xml:space="preserve"> Das Gitter erscheint als Linien, die Geometrie als Flächen: 75-mm-Board (blau), Patch mit den beiden Treppen-Fasen (orange), Port (rot), NF2FF-Box (violett gestrichelt) und Rechen-Domain (schwarz gestrichelt). Man sieht, wie die Zellen über dem Patch feiner werden und nach außen auf die maximal erlaubte Zellgröße wachsen. Der Schieber neben „Plane" legt den Schnitt, „Mesh grid" blendet das Gitter, „Cell sizes" färbt die Zellgrößen, „Overview" zeigt die 3D-Ansicht. Rechtsklick auf eine markierte Zelle öffnet die Reparatur-Aktionen aus §6.1.</w:t>
-      </w:r>
-    </w:p>
-    <w:p>
-      <w:r>
-        <w:t>────────────────────────────────────────────────────────────</w:t>
-      </w:r>
-    </w:p>
-    <w:p>
-      <w:pPr>
-        <w:pStyle w:val="Heading2"/>
-      </w:pPr>
-      <w:r>
-        <w:t>7. Auswertung</w:t>
-      </w:r>
-    </w:p>
-    <w:p>
-      <w:pPr>
-        <w:jc w:val="center"/>
-      </w:pPr>
-      <w:r>
-        <w:drawing>
-          <wp:inline xmlns:a="http://schemas.openxmlformats.org/drawingml/2006/main" xmlns:pic="http://schemas.openxmlformats.org/drawingml/2006/picture">
-            <wp:extent cx="5669280" cy="3631882"/>
-            <wp:docPr id="11" name="Picture 11"/>
-            <wp:cNvGraphicFramePr>
-              <a:graphicFrameLocks noChangeAspect="1"/>
-            </wp:cNvGraphicFramePr>
-            <a:graphic>
-              <a:graphicData uri="http://schemas.openxmlformats.org/drawingml/2006/picture">
-                <pic:pic>
-                  <pic:nvPicPr>
-                    <pic:cNvPr id="0" name="sparams_viewer.png"/>
-                    <pic:cNvPicPr/>
-                  </pic:nvPicPr>
-                  <pic:blipFill>
-                    <a:blip r:embed="rId19"/>
-                    <a:stretch>
-                      <a:fillRect/>
-                    </a:stretch>
-                  </pic:blipFill>
-                  <pic:spPr>
-                    <a:xfrm>
-                      <a:off x="0" y="0"/>
-                      <a:ext cx="5669280" cy="3631882"/>
-                    </a:xfrm>
-                    <a:prstGeom prst="rect"/>
-                  </pic:spPr>
-                </pic:pic>
-              </a:graphicData>
-            </a:graphic>
-          </wp:inline>
-        </w:drawing>
-      </w:r>
-    </w:p>
-    <w:p>
-      <w:r>
-        <w:rPr>
-          <w:b/>
-        </w:rPr>
-        <w:t>S-Params.</w:t>
-      </w:r>
-      <w:r>
-        <w:t xml:space="preserve"> Smith-Chart, |S| dB, Phase, VSWR; Marker per Klick, „Go to S-min“ springt auf das Resonanzminimum, „Pop out“ löst den Plot in ein eigenes Fenster.</w:t>
-      </w:r>
-    </w:p>
-    <w:p>
-      <w:pPr>
-        <w:pStyle w:val="ListNumber"/>
-      </w:pPr>
-      <w:r>
-        <w:rPr>
-          <w:b/>
-        </w:rPr>
-        <w:t>S-Params Viewer</w:t>
-      </w:r>
-    </w:p>
-    <w:p>
-      <w:pPr>
-        <w:pStyle w:val="ListBullet"/>
-      </w:pPr>
-      <w:r>
-        <w:t>S11 / S21, dB, Phase</w:t>
-      </w:r>
-    </w:p>
-    <w:p>
-      <w:pPr>
-        <w:pStyle w:val="ListBullet"/>
-      </w:pPr>
-      <w:r>
-        <w:t>Marker: Frequenz, S, Γ, Z/Y, VSWR, RL</w:t>
-      </w:r>
-    </w:p>
-    <w:p>
-      <w:pPr>
-        <w:pStyle w:val="ListBullet"/>
-      </w:pPr>
-      <w:r>
-        <w:t>Smith-Chart: Z- und Y-Marker</w:t>
-      </w:r>
-    </w:p>
-    <w:p>
-      <w:pPr>
-        <w:pStyle w:val="ListNumber"/>
-      </w:pPr>
-      <w:r>
-        <w:rPr>
-          <w:b/>
-        </w:rPr>
-        <w:t>Pop-out S-Graph</w:t>
-      </w:r>
-      <w:r>
-        <w:t xml:space="preserve"> — Plot in Extra-Fenster</w:t>
-      </w:r>
-    </w:p>
-    <w:p>
-      <w:pPr>
-        <w:pStyle w:val="ListNumber"/>
-      </w:pPr>
-      <w:r>
-        <w:rPr>
-          <w:b/>
-        </w:rPr>
-        <w:t>Antenna</w:t>
-      </w:r>
-      <w:r>
-        <w:t xml:space="preserve">-Tab / </w:t>
-      </w:r>
-      <w:r>
-        <w:rPr>
-          <w:b/>
-        </w:rPr>
-        <w:t>Simulation → Antenna Pattern Viewer</w:t>
-      </w:r>
-      <w:r>
-        <w:t xml:space="preserve"> — NF2FF-Fernfeld:</w:t>
-      </w:r>
-    </w:p>
-    <w:p>
-      <w:r>
-        <w:t>3D-Polar des Gewinns, 2D-Polarschnitte (E/H-Ebene), Direktivität/Gain/η</w:t>
-      </w:r>
-    </w:p>
-    <w:p>
-      <w:r>
-        <w:t xml:space="preserve">über Frequenz; </w:t>
-      </w:r>
-      <w:r>
-        <w:rPr>
-          <w:b/>
-        </w:rPr>
-        <w:t>Pop-out Antenna Graph</w:t>
-      </w:r>
-      <w:r>
-        <w:t xml:space="preserve"> = Extra-Fenster; Feld-Dumps</w:t>
-      </w:r>
-    </w:p>
-    <w:p>
-      <w:r>
-        <w:t xml:space="preserve">weiterhin unter </w:t>
-      </w:r>
-      <w:r>
-        <w:rPr>
-          <w:rFonts w:ascii="Consolas" w:hAnsi="Consolas"/>
-          <w:sz w:val="18"/>
-        </w:rPr>
-        <w:t>work/&lt;projekt&gt;/fields/</w:t>
-      </w:r>
-      <w:r>
-        <w:t xml:space="preserve"> (S-Parameter in</w:t>
-      </w:r>
-    </w:p>
-    <w:p>
-      <w:r>
-        <w:rPr>
-          <w:rFonts w:ascii="Consolas" w:hAnsi="Consolas"/>
-          <w:sz w:val="18"/>
-        </w:rPr>
-        <w:t>work/&lt;projekt&gt;/sparams/</w:t>
-      </w:r>
-      <w:r>
-        <w:t xml:space="preserve">, NF2FF in </w:t>
-      </w:r>
-      <w:r>
-        <w:rPr>
-          <w:rFonts w:ascii="Consolas" w:hAnsi="Consolas"/>
-          <w:sz w:val="18"/>
-        </w:rPr>
-        <w:t>work/&lt;projekt&gt;/nf2ff/</w:t>
-      </w:r>
-      <w:r>
-        <w:t>).</w:t>
-      </w:r>
-    </w:p>
-    <w:p>
-      <w:r>
-        <w:rPr>
-          <w:b/>
-        </w:rPr>
-        <w:t>Polarization…</w:t>
-      </w:r>
-      <w:r>
-        <w:t xml:space="preserve"> (Button im Antenna-Tab) zeigt Größen aus demselben</w:t>
-      </w:r>
-    </w:p>
-    <w:p>
-      <w:r>
-        <w:t xml:space="preserve">NF2FF-Ergebnis — ohne neuen Lauf: </w:t>
-      </w:r>
-      <w:r>
-        <w:rPr>
-          <w:b/>
-        </w:rPr>
-        <w:t>Axial Ratio</w:t>
-      </w:r>
-      <w:r>
-        <w:t xml:space="preserve"> (dB, Drehsinn</w:t>
-      </w:r>
-    </w:p>
-    <w:p>
-      <w:r>
-        <w:t xml:space="preserve">RHCP/LHCP, Tilt; linear → „linear") und </w:t>
-      </w:r>
-      <w:r>
-        <w:rPr>
-          <w:b/>
-        </w:rPr>
-        <w:t>Phase Center</w:t>
-      </w:r>
-      <w:r>
-        <w:t xml:space="preserve"> (Δx/Δy/Δz in mm</w:t>
-      </w:r>
-    </w:p>
-    <w:p>
-      <w:r>
-        <w:t>plus RMS des Phasen-Fits) relativ zum NF2FF-Boxmittelpunkt. Der</w:t>
-      </w:r>
-    </w:p>
-    <w:p>
-      <w:r>
-        <w:t>Phase-Center-Wert ist eine Schätzung für einen klaren Hauptstrahl; passt</w:t>
-      </w:r>
-    </w:p>
-    <w:p>
-      <w:r>
-        <w:t>der Fit nicht, steht „—" mit „phase not well-defined". Details:</w:t>
-      </w:r>
-    </w:p>
-    <w:p>
-      <w:r>
-        <w:t>F1 → „Polarization &amp; Phase Center".</w:t>
-      </w:r>
-    </w:p>
-    <w:p>
-      <w:pPr>
-        <w:pStyle w:val="ListNumber"/>
-      </w:pPr>
-      <w:r>
-        <w:rPr>
-          <w:b/>
-        </w:rPr>
-        <w:t>2-Port (S2P)</w:t>
-      </w:r>
-      <w:r>
-        <w:t xml:space="preserve"> — ein FDTD-Lauf misst </w:t>
-      </w:r>
-      <w:r>
-        <w:rPr>
-          <w:b/>
-        </w:rPr>
-        <w:t>eine</w:t>
-      </w:r>
-      <w:r>
-        <w:t xml:space="preserve"> Spalte der S-Matrix (für 2 Ports:</w:t>
-      </w:r>
-    </w:p>
-    <w:p>
-      <w:r>
-        <w:t>S11 + S21). Weitere Spalten brauchen weitere Läufe mit anderem erregtem Port</w:t>
-      </w:r>
-    </w:p>
-    <w:p>
-      <w:r>
-        <w:t>(</w:t>
-      </w:r>
-      <w:r>
-        <w:rPr>
-          <w:rFonts w:ascii="Consolas" w:hAnsi="Consolas"/>
-          <w:sz w:val="18"/>
-        </w:rPr>
-        <w:t>excite_port</w:t>
-      </w:r>
-      <w:r>
-        <w:t xml:space="preserve"> umschalten); die JSON-Ergebnisse werden danach zusammengeführt —</w:t>
-      </w:r>
-    </w:p>
-    <w:p>
-      <w:r>
-        <w:t xml:space="preserve">Beispiel: </w:t>
-      </w:r>
-      <w:r>
-        <w:rPr>
-          <w:rFonts w:ascii="Consolas" w:hAnsi="Consolas"/>
-          <w:sz w:val="18"/>
-        </w:rPr>
-        <w:t>examples\run_pcb_filter_example.py</w:t>
-      </w:r>
-      <w:r>
-        <w:t>.</w:t>
-      </w:r>
-    </w:p>
-    <w:p>
-      <w:r>
-        <w:t xml:space="preserve">Nicht gemessene Einträge bleiben leer (NaN) in </w:t>
-      </w:r>
-      <w:r>
-        <w:rPr>
-          <w:rFonts w:ascii="Consolas" w:hAnsi="Consolas"/>
-          <w:sz w:val="18"/>
-        </w:rPr>
-        <w:t>sparams.json</w:t>
-      </w:r>
-      <w:r>
-        <w:t>, die Touchstone-Datei</w:t>
-      </w:r>
-    </w:p>
-    <w:p>
-      <w:r>
-        <w:t>(</w:t>
-      </w:r>
-      <w:r>
-        <w:rPr>
-          <w:rFonts w:ascii="Consolas" w:hAnsi="Consolas"/>
-          <w:sz w:val="18"/>
-        </w:rPr>
-        <w:t>.s2p</w:t>
-      </w:r>
-      <w:r>
-        <w:t>) entsteht erst, wenn die Matrix vollständig ist.</w:t>
-      </w:r>
-    </w:p>
-    <w:p>
-      <w:pPr>
-        <w:pStyle w:val="ListNumber"/>
-      </w:pPr>
-      <w:r>
-        <w:rPr>
-          <w:b/>
-        </w:rPr>
-        <w:t>Field Viewer</w:t>
-      </w:r>
-      <w:r>
-        <w:t xml:space="preserve"> — 3D-Ansicht der Felddumps (F1 für die Hilfe). Die</w:t>
-      </w:r>
-    </w:p>
-    <w:p>
-      <w:r>
-        <w:t xml:space="preserve">Vektor-Pfeile („Vectors") </w:t>
-      </w:r>
-      <w:r>
-        <w:rPr>
-          <w:b/>
-        </w:rPr>
-        <w:t>ersetzen</w:t>
-      </w:r>
-      <w:r>
-        <w:t xml:space="preserve"> die farbige Felddarstellung</w:t>
-      </w:r>
-    </w:p>
-    <w:p>
-      <w:r>
-        <w:t>(ParaView-Stil), damit keine opake Schnitt-/Oberflächenebene die Pfeile</w:t>
-      </w:r>
-    </w:p>
-    <w:p>
-      <w:r>
-        <w:t>verdeckt; mit „field underneath" läßt sich die Überlagerung wieder</w:t>
-      </w:r>
-    </w:p>
-    <w:p>
-      <w:r>
-        <w:t>einschalten. Beim manuellen Durchschalten einer Serie meldet die</w:t>
-      </w:r>
-    </w:p>
-    <w:p>
-      <w:r>
-        <w:t>Schritt-Anzeige, wie viele Pfeile sich gegenüber dem vorigen Schritt gedreht</w:t>
-      </w:r>
-    </w:p>
-    <w:p>
-      <w:r>
-        <w:t>haben — damit ist sofort sichtbar, ob die Pfeile dem Feld wirklich folgen.</w:t>
-      </w:r>
-    </w:p>
-    <w:p>
-      <w:r>
-        <w:t>Bei ausgeschaltetem „same length" zeigt die Pfeillänge die Amplitude; die</w:t>
-      </w:r>
-    </w:p>
-    <w:p>
-      <w:r>
-        <w:t>Referenz wird einmal über die ganze Serie gemessen, die Längen sind also</w:t>
-      </w:r>
-    </w:p>
-    <w:p>
-      <w:r>
-        <w:t>von Bild zu Bild vergleichbar.</w:t>
-      </w:r>
-    </w:p>
-    <w:p>
-      <w:r>
-        <w:t>Der Export schreibt zusätzlich eine ParaView-Collection (</w:t>
-      </w:r>
-      <w:r>
-        <w:rPr>
-          <w:rFonts w:ascii="Consolas" w:hAnsi="Consolas"/>
-          <w:sz w:val="18"/>
-        </w:rPr>
-        <w:t>&lt;dump&gt;.pvd</w:t>
-      </w:r>
-      <w:r>
-        <w:t>) neben</w:t>
-      </w:r>
-    </w:p>
-    <w:p>
-      <w:r>
-        <w:t>die Schritt-Dateien, damit die ganze Serie in ParaView aus einer Datei läuft</w:t>
-      </w:r>
-    </w:p>
-    <w:p>
-      <w:r>
-        <w:t>— siehe §12.4.</w:t>
-      </w:r>
-    </w:p>
-    <w:p>
-      <w:pPr>
-        <w:pStyle w:val="Heading3"/>
-      </w:pPr>
-      <w:r>
-        <w:t>7.1 Antenna-Tab in Bildern</w:t>
-      </w:r>
-    </w:p>
-    <w:p>
-      <w:pPr>
-        <w:jc w:val="center"/>
-      </w:pPr>
-      <w:r>
-        <w:drawing>
-          <wp:inline xmlns:a="http://schemas.openxmlformats.org/drawingml/2006/main" xmlns:pic="http://schemas.openxmlformats.org/drawingml/2006/picture">
-            <wp:extent cx="5669280" cy="3631882"/>
-            <wp:docPr id="12" name="Picture 12"/>
-            <wp:cNvGraphicFramePr>
-              <a:graphicFrameLocks noChangeAspect="1"/>
-            </wp:cNvGraphicFramePr>
-            <a:graphic>
-              <a:graphicData uri="http://schemas.openxmlformats.org/drawingml/2006/picture">
-                <pic:pic>
-                  <pic:nvPicPr>
-                    <pic:cNvPr id="0" name="antenna_tab_polar.png"/>
                     <pic:cNvPicPr/>
                   </pic:nvPicPr>
                   <pic:blipFill>
@@ -6479,10 +6090,23 @@
         <w:rPr>
           <w:b/>
         </w:rPr>
-        <w:t>Antenna-Tab, H-Ebene.</w:t>
-      </w:r>
-      <w:r>
-        <w:t xml:space="preserve"> Links die gefundenen NF2FF-Ergebnisse und der Details-Block (Dmax, Gmax, η, Prad, Raster), rechts der Polarschnitt mit dBi-Ringen. Rechtsklick auf den Plot öffnet das Analyse-Menü (HPBW, Vor-Rück-Verhältnis, Marker, Pop-out). Beispiel: der 2,45-GHz-Patch aus §2.2.</w:t>
+        <w:t>Mesh-Viewer, XY-Schnitt bei z = 1,6 mm.</w:t>
+      </w:r>
+      <w:r>
+        <w:t xml:space="preserve"> Das Gitter erscheint als Linien, die Geometrie als Flächen: 75-mm-Board (blau), Patch mit den beiden Treppen-Fasen (orange), Port (rot), NF2FF-Box (violett gestrichelt) und Rechen-Domain (schwarz gestrichelt). Man sieht, wie die Zellen über dem Patch feiner werden und nach außen auf die maximal erlaubte Zellgröße wachsen. Der Schieber neben „Plane" legt den Schnitt, „Mesh grid" blendet das Gitter, „Cell sizes" färbt die Zellgrößen, „Overview" zeigt die 3D-Ansicht. Rechtsklick auf eine markierte Zelle öffnet die Reparatur-Aktionen aus §6.1.</w:t>
+      </w:r>
+    </w:p>
+    <w:p>
+      <w:r>
+        <w:t>────────────────────────────────────────────────────────────</w:t>
+      </w:r>
+    </w:p>
+    <w:p>
+      <w:pPr>
+        <w:pStyle w:val="Heading2"/>
+      </w:pPr>
+      <w:r>
+        <w:t>7. Auswertung</w:t>
       </w:r>
     </w:p>
     <w:p>
@@ -6501,7 +6125,7 @@
               <a:graphicData uri="http://schemas.openxmlformats.org/drawingml/2006/picture">
                 <pic:pic>
                   <pic:nvPicPr>
-                    <pic:cNvPr id="0" name="antenna_ar_cut.png"/>
+                    <pic:cNvPr id="0" name="sparams_viewer.png"/>
                     <pic:cNvPicPr/>
                   </pic:nvPicPr>
                   <pic:blipFill>
@@ -6529,10 +6153,386 @@
         <w:rPr>
           <w:b/>
         </w:rPr>
-        <w:t>Plottyp „Axial Ratio (theta cut)".</w:t>
-      </w:r>
-      <w:r>
-        <w:t xml:space="preserve"> AR über θ bei wählbarem Azimut (Wähler „AR φ" in der Plot-Toolbar, 0…315°). Das grüne Band ist der Bereich AR ≤ 3 dB; Punktlinie und Text nennen die größte Auslenkung ab Boresight, die diese Grenze noch einhält. Beispiel: GPS-L1-Patch bei 1,57542 GHz — 1,70 dB bei θ = 0°, ≤ 3 dB bis θ = 62°. Beim linear polarisierten 2,45-GHz-Beispiel liegt der AR durchgehend über 10 dB; dort taugt der Schnitt nur als Kontrolle.</w:t>
+        <w:t>S-Params.</w:t>
+      </w:r>
+      <w:r>
+        <w:t xml:space="preserve"> Smith-Chart, |S| dB, Phase, VSWR; Marker per Klick, „Go to S-min“ springt auf das Resonanzminimum, „Pop out“ löst den Plot in ein eigenes Fenster.</w:t>
+      </w:r>
+    </w:p>
+    <w:p>
+      <w:pPr>
+        <w:pStyle w:val="ListNumber"/>
+      </w:pPr>
+      <w:r>
+        <w:rPr>
+          <w:b/>
+        </w:rPr>
+        <w:t>S-Params Viewer</w:t>
+      </w:r>
+    </w:p>
+    <w:p>
+      <w:pPr>
+        <w:pStyle w:val="ListBullet"/>
+      </w:pPr>
+      <w:r>
+        <w:t>S11 / S21, dB, Phase</w:t>
+      </w:r>
+    </w:p>
+    <w:p>
+      <w:pPr>
+        <w:pStyle w:val="ListBullet"/>
+      </w:pPr>
+      <w:r>
+        <w:t>Marker: Frequenz, S, Γ, Z/Y, VSWR, RL</w:t>
+      </w:r>
+    </w:p>
+    <w:p>
+      <w:pPr>
+        <w:pStyle w:val="ListBullet"/>
+      </w:pPr>
+      <w:r>
+        <w:t>Smith-Chart: Z- und Y-Marker</w:t>
+      </w:r>
+    </w:p>
+    <w:p>
+      <w:pPr>
+        <w:pStyle w:val="ListNumber"/>
+      </w:pPr>
+      <w:r>
+        <w:rPr>
+          <w:b/>
+        </w:rPr>
+        <w:t>Pop-out S-Graph</w:t>
+      </w:r>
+      <w:r>
+        <w:t xml:space="preserve"> — Plot in Extra-Fenster</w:t>
+      </w:r>
+    </w:p>
+    <w:p>
+      <w:pPr>
+        <w:pStyle w:val="ListNumber"/>
+      </w:pPr>
+      <w:r>
+        <w:rPr>
+          <w:b/>
+        </w:rPr>
+        <w:t>Antenna</w:t>
+      </w:r>
+      <w:r>
+        <w:t xml:space="preserve">-Tab / </w:t>
+      </w:r>
+      <w:r>
+        <w:rPr>
+          <w:b/>
+        </w:rPr>
+        <w:t>Simulation → Antenna Pattern Viewer</w:t>
+      </w:r>
+      <w:r>
+        <w:t xml:space="preserve"> — NF2FF-Fernfeld:</w:t>
+      </w:r>
+    </w:p>
+    <w:p>
+      <w:r>
+        <w:t>3D-Polar des Gewinns, 2D-Polarschnitte (E/H-Ebene), Direktivität/Gain/η</w:t>
+      </w:r>
+    </w:p>
+    <w:p>
+      <w:r>
+        <w:t xml:space="preserve">über Frequenz; </w:t>
+      </w:r>
+      <w:r>
+        <w:rPr>
+          <w:b/>
+        </w:rPr>
+        <w:t>Pop-out Antenna Graph</w:t>
+      </w:r>
+      <w:r>
+        <w:t xml:space="preserve"> = Extra-Fenster; Feld-Dumps</w:t>
+      </w:r>
+    </w:p>
+    <w:p>
+      <w:r>
+        <w:t xml:space="preserve">weiterhin unter </w:t>
+      </w:r>
+      <w:r>
+        <w:rPr>
+          <w:rFonts w:ascii="Consolas" w:hAnsi="Consolas"/>
+          <w:sz w:val="18"/>
+        </w:rPr>
+        <w:t>work/&lt;projekt&gt;/fields/</w:t>
+      </w:r>
+      <w:r>
+        <w:t xml:space="preserve"> (S-Parameter in</w:t>
+      </w:r>
+    </w:p>
+    <w:p>
+      <w:r>
+        <w:rPr>
+          <w:rFonts w:ascii="Consolas" w:hAnsi="Consolas"/>
+          <w:sz w:val="18"/>
+        </w:rPr>
+        <w:t>work/&lt;projekt&gt;/sparams/</w:t>
+      </w:r>
+      <w:r>
+        <w:t xml:space="preserve">, NF2FF in </w:t>
+      </w:r>
+      <w:r>
+        <w:rPr>
+          <w:rFonts w:ascii="Consolas" w:hAnsi="Consolas"/>
+          <w:sz w:val="18"/>
+        </w:rPr>
+        <w:t>work/&lt;projekt&gt;/nf2ff/</w:t>
+      </w:r>
+      <w:r>
+        <w:t>).</w:t>
+      </w:r>
+    </w:p>
+    <w:p>
+      <w:r>
+        <w:rPr>
+          <w:b/>
+        </w:rPr>
+        <w:t>Polarization…</w:t>
+      </w:r>
+      <w:r>
+        <w:t xml:space="preserve"> (Button im Antenna-Tab) zeigt Größen aus demselben</w:t>
+      </w:r>
+    </w:p>
+    <w:p>
+      <w:r>
+        <w:t xml:space="preserve">NF2FF-Ergebnis — ohne neuen Lauf: </w:t>
+      </w:r>
+      <w:r>
+        <w:rPr>
+          <w:b/>
+        </w:rPr>
+        <w:t>Axial Ratio</w:t>
+      </w:r>
+      <w:r>
+        <w:t xml:space="preserve"> (dB, Drehsinn</w:t>
+      </w:r>
+    </w:p>
+    <w:p>
+      <w:r>
+        <w:t xml:space="preserve">RHCP/LHCP, Tilt; linear → „linear") und </w:t>
+      </w:r>
+      <w:r>
+        <w:rPr>
+          <w:b/>
+        </w:rPr>
+        <w:t>Phase Center</w:t>
+      </w:r>
+      <w:r>
+        <w:t xml:space="preserve"> (Δx/Δy/Δz in mm</w:t>
+      </w:r>
+    </w:p>
+    <w:p>
+      <w:r>
+        <w:t>plus RMS des Phasen-Fits) relativ zum NF2FF-Boxmittelpunkt. Der</w:t>
+      </w:r>
+    </w:p>
+    <w:p>
+      <w:r>
+        <w:t>Phase-Center-Wert ist eine Schätzung für einen klaren Hauptstrahl; passt</w:t>
+      </w:r>
+    </w:p>
+    <w:p>
+      <w:r>
+        <w:t>der Fit nicht, steht „—" mit „phase not well-defined". Details:</w:t>
+      </w:r>
+    </w:p>
+    <w:p>
+      <w:r>
+        <w:t>F1 → „Polarization &amp; Phase Center".</w:t>
+      </w:r>
+    </w:p>
+    <w:p>
+      <w:pPr>
+        <w:pStyle w:val="ListNumber"/>
+      </w:pPr>
+      <w:r>
+        <w:rPr>
+          <w:b/>
+        </w:rPr>
+        <w:t>2-Port (S2P)</w:t>
+      </w:r>
+      <w:r>
+        <w:t xml:space="preserve"> — ein FDTD-Lauf misst </w:t>
+      </w:r>
+      <w:r>
+        <w:rPr>
+          <w:b/>
+        </w:rPr>
+        <w:t>eine</w:t>
+      </w:r>
+      <w:r>
+        <w:t xml:space="preserve"> Spalte der S-Matrix (für 2 Ports:</w:t>
+      </w:r>
+    </w:p>
+    <w:p>
+      <w:r>
+        <w:t>S11 + S21). Weitere Spalten brauchen weitere Läufe mit anderem erregtem Port</w:t>
+      </w:r>
+    </w:p>
+    <w:p>
+      <w:r>
+        <w:t>(</w:t>
+      </w:r>
+      <w:r>
+        <w:rPr>
+          <w:rFonts w:ascii="Consolas" w:hAnsi="Consolas"/>
+          <w:sz w:val="18"/>
+        </w:rPr>
+        <w:t>excite_port</w:t>
+      </w:r>
+      <w:r>
+        <w:t xml:space="preserve"> umschalten); die JSON-Ergebnisse werden danach zusammengeführt —</w:t>
+      </w:r>
+    </w:p>
+    <w:p>
+      <w:r>
+        <w:t xml:space="preserve">Beispiel: </w:t>
+      </w:r>
+      <w:r>
+        <w:rPr>
+          <w:rFonts w:ascii="Consolas" w:hAnsi="Consolas"/>
+          <w:sz w:val="18"/>
+        </w:rPr>
+        <w:t>examples\run_pcb_filter_example.py</w:t>
+      </w:r>
+      <w:r>
+        <w:t>.</w:t>
+      </w:r>
+    </w:p>
+    <w:p>
+      <w:r>
+        <w:t xml:space="preserve">Nicht gemessene Einträge bleiben leer (NaN) in </w:t>
+      </w:r>
+      <w:r>
+        <w:rPr>
+          <w:rFonts w:ascii="Consolas" w:hAnsi="Consolas"/>
+          <w:sz w:val="18"/>
+        </w:rPr>
+        <w:t>sparams.json</w:t>
+      </w:r>
+      <w:r>
+        <w:t>, die Touchstone-Datei</w:t>
+      </w:r>
+    </w:p>
+    <w:p>
+      <w:r>
+        <w:t>(</w:t>
+      </w:r>
+      <w:r>
+        <w:rPr>
+          <w:rFonts w:ascii="Consolas" w:hAnsi="Consolas"/>
+          <w:sz w:val="18"/>
+        </w:rPr>
+        <w:t>.s2p</w:t>
+      </w:r>
+      <w:r>
+        <w:t>) entsteht erst, wenn die Matrix vollständig ist.</w:t>
+      </w:r>
+    </w:p>
+    <w:p>
+      <w:pPr>
+        <w:pStyle w:val="ListNumber"/>
+      </w:pPr>
+      <w:r>
+        <w:rPr>
+          <w:b/>
+        </w:rPr>
+        <w:t>Field Viewer</w:t>
+      </w:r>
+      <w:r>
+        <w:t xml:space="preserve"> — 3D-Ansicht der Felddumps (F1 für die Hilfe). Die</w:t>
+      </w:r>
+    </w:p>
+    <w:p>
+      <w:r>
+        <w:t xml:space="preserve">Vektor-Pfeile („Vectors") </w:t>
+      </w:r>
+      <w:r>
+        <w:rPr>
+          <w:b/>
+        </w:rPr>
+        <w:t>ersetzen</w:t>
+      </w:r>
+      <w:r>
+        <w:t xml:space="preserve"> die farbige Felddarstellung</w:t>
+      </w:r>
+    </w:p>
+    <w:p>
+      <w:r>
+        <w:t>(ParaView-Stil), damit keine opake Schnitt-/Oberflächenebene die Pfeile</w:t>
+      </w:r>
+    </w:p>
+    <w:p>
+      <w:r>
+        <w:t>verdeckt; mit „field underneath" läßt sich die Überlagerung wieder</w:t>
+      </w:r>
+    </w:p>
+    <w:p>
+      <w:r>
+        <w:t>einschalten. Beim manuellen Durchschalten einer Serie meldet die</w:t>
+      </w:r>
+    </w:p>
+    <w:p>
+      <w:r>
+        <w:t>Schritt-Anzeige, wie viele Pfeile sich gegenüber dem vorigen Schritt gedreht</w:t>
+      </w:r>
+    </w:p>
+    <w:p>
+      <w:r>
+        <w:t>haben — damit ist sofort sichtbar, ob die Pfeile dem Feld wirklich folgen.</w:t>
+      </w:r>
+    </w:p>
+    <w:p>
+      <w:r>
+        <w:t>Bei ausgeschaltetem „same length" zeigt die Pfeillänge die Amplitude; die</w:t>
+      </w:r>
+    </w:p>
+    <w:p>
+      <w:r>
+        <w:t>Referenz wird einmal über die ganze Serie gemessen, die Längen sind also</w:t>
+      </w:r>
+    </w:p>
+    <w:p>
+      <w:r>
+        <w:t>von Bild zu Bild vergleichbar.</w:t>
+      </w:r>
+    </w:p>
+    <w:p>
+      <w:r>
+        <w:t>Der Export schreibt zusätzlich eine ParaView-Collection (</w:t>
+      </w:r>
+      <w:r>
+        <w:rPr>
+          <w:rFonts w:ascii="Consolas" w:hAnsi="Consolas"/>
+          <w:sz w:val="18"/>
+        </w:rPr>
+        <w:t>&lt;dump&gt;.pvd</w:t>
+      </w:r>
+      <w:r>
+        <w:t>) neben</w:t>
+      </w:r>
+    </w:p>
+    <w:p>
+      <w:r>
+        <w:t>die Schritt-Dateien, damit die ganze Serie in ParaView aus einer Datei läuft</w:t>
+      </w:r>
+    </w:p>
+    <w:p>
+      <w:r>
+        <w:t>— siehe §12.4.</w:t>
+      </w:r>
+    </w:p>
+    <w:p>
+      <w:pPr>
+        <w:pStyle w:val="Heading3"/>
+      </w:pPr>
+      <w:r>
+        <w:t>7.1 Antenna-Tab in Bildern</w:t>
       </w:r>
     </w:p>
     <w:p>
@@ -6551,7 +6551,7 @@
               <a:graphicData uri="http://schemas.openxmlformats.org/drawingml/2006/picture">
                 <pic:pic>
                   <pic:nvPicPr>
-                    <pic:cNvPr id="0" name="antenna_3d_pattern.png"/>
+                    <pic:cNvPr id="0" name="antenna_tab_polar.png"/>
                     <pic:cNvPicPr/>
                   </pic:nvPicPr>
                   <pic:blipFill>
@@ -6579,10 +6579,10 @@
         <w:rPr>
           <w:b/>
         </w:rPr>
-        <w:t>3D-Muster.</w:t>
-      </w:r>
-      <w:r>
-        <w:t xml:space="preserve"> Die drei Raumrichtungen sind mit x/y/z beschriftet. Der Radius ist auf das dBi-Fenster normiert (Regler „dBi min" in der Toolbar), die absoluten Werte liefert die Farbskala rechts.</w:t>
+        <w:t>Antenna-Tab, H-Ebene.</w:t>
+      </w:r>
+      <w:r>
+        <w:t xml:space="preserve"> Links die gefundenen NF2FF-Ergebnisse und der Details-Block (Dmax, Gmax, η, Prad, Raster), rechts der Polarschnitt mit dBi-Ringen. Rechtsklick auf den Plot öffnet das Analyse-Menü (HPBW, Vor-Rück-Verhältnis, Marker, Pop-out). Beispiel: der 2,45-GHz-Patch aus §2.2.</w:t>
       </w:r>
     </w:p>
     <w:p>
@@ -6592,8 +6592,108 @@
       <w:r>
         <w:drawing>
           <wp:inline xmlns:a="http://schemas.openxmlformats.org/drawingml/2006/main" xmlns:pic="http://schemas.openxmlformats.org/drawingml/2006/picture">
+            <wp:extent cx="5669280" cy="3631882"/>
+            <wp:docPr id="15" name="Picture 15"/>
+            <wp:cNvGraphicFramePr>
+              <a:graphicFrameLocks noChangeAspect="1"/>
+            </wp:cNvGraphicFramePr>
+            <a:graphic>
+              <a:graphicData uri="http://schemas.openxmlformats.org/drawingml/2006/picture">
+                <pic:pic>
+                  <pic:nvPicPr>
+                    <pic:cNvPr id="0" name="antenna_ar_cut.png"/>
+                    <pic:cNvPicPr/>
+                  </pic:nvPicPr>
+                  <pic:blipFill>
+                    <a:blip r:embed="rId23"/>
+                    <a:stretch>
+                      <a:fillRect/>
+                    </a:stretch>
+                  </pic:blipFill>
+                  <pic:spPr>
+                    <a:xfrm>
+                      <a:off x="0" y="0"/>
+                      <a:ext cx="5669280" cy="3631882"/>
+                    </a:xfrm>
+                    <a:prstGeom prst="rect"/>
+                  </pic:spPr>
+                </pic:pic>
+              </a:graphicData>
+            </a:graphic>
+          </wp:inline>
+        </w:drawing>
+      </w:r>
+    </w:p>
+    <w:p>
+      <w:r>
+        <w:rPr>
+          <w:b/>
+        </w:rPr>
+        <w:t>Plottyp „Axial Ratio (theta cut)".</w:t>
+      </w:r>
+      <w:r>
+        <w:t xml:space="preserve"> AR über θ bei wählbarem Azimut (Wähler „AR φ" in der Plot-Toolbar, 0…315°). Das grüne Band ist der Bereich AR ≤ 3 dB; Punktlinie und Text nennen die größte Auslenkung ab Boresight, die diese Grenze noch einhält. Beispiel: GPS-L1-Patch bei 1,57542 GHz — 1,70 dB bei θ = 0°, ≤ 3 dB bis θ = 62°. Beim linear polarisierten 2,45-GHz-Beispiel liegt der AR durchgehend über 10 dB; dort taugt der Schnitt nur als Kontrolle.</w:t>
+      </w:r>
+    </w:p>
+    <w:p>
+      <w:pPr>
+        <w:jc w:val="center"/>
+      </w:pPr>
+      <w:r>
+        <w:drawing>
+          <wp:inline xmlns:a="http://schemas.openxmlformats.org/drawingml/2006/main" xmlns:pic="http://schemas.openxmlformats.org/drawingml/2006/picture">
+            <wp:extent cx="5669280" cy="3631882"/>
+            <wp:docPr id="16" name="Picture 16"/>
+            <wp:cNvGraphicFramePr>
+              <a:graphicFrameLocks noChangeAspect="1"/>
+            </wp:cNvGraphicFramePr>
+            <a:graphic>
+              <a:graphicData uri="http://schemas.openxmlformats.org/drawingml/2006/picture">
+                <pic:pic>
+                  <pic:nvPicPr>
+                    <pic:cNvPr id="0" name="antenna_3d_pattern.png"/>
+                    <pic:cNvPicPr/>
+                  </pic:nvPicPr>
+                  <pic:blipFill>
+                    <a:blip r:embed="rId24"/>
+                    <a:stretch>
+                      <a:fillRect/>
+                    </a:stretch>
+                  </pic:blipFill>
+                  <pic:spPr>
+                    <a:xfrm>
+                      <a:off x="0" y="0"/>
+                      <a:ext cx="5669280" cy="3631882"/>
+                    </a:xfrm>
+                    <a:prstGeom prst="rect"/>
+                  </pic:spPr>
+                </pic:pic>
+              </a:graphicData>
+            </a:graphic>
+          </wp:inline>
+        </w:drawing>
+      </w:r>
+    </w:p>
+    <w:p>
+      <w:r>
+        <w:rPr>
+          <w:b/>
+        </w:rPr>
+        <w:t>3D-Muster.</w:t>
+      </w:r>
+      <w:r>
+        <w:t xml:space="preserve"> Die drei Raumrichtungen sind mit x/y/z beschriftet. Der Radius ist auf das dBi-Fenster normiert (Regler „dBi min" in der Toolbar), die absoluten Werte liefert die Farbskala rechts.</w:t>
+      </w:r>
+    </w:p>
+    <w:p>
+      <w:pPr>
+        <w:jc w:val="center"/>
+      </w:pPr>
+      <w:r>
+        <w:drawing>
+          <wp:inline xmlns:a="http://schemas.openxmlformats.org/drawingml/2006/main" xmlns:pic="http://schemas.openxmlformats.org/drawingml/2006/picture">
             <wp:extent cx="5669280" cy="2664562"/>
-            <wp:docPr id="15" name="Picture 15"/>
+            <wp:docPr id="17" name="Picture 17"/>
             <wp:cNvGraphicFramePr>
               <a:graphicFrameLocks noChangeAspect="1"/>
             </wp:cNvGraphicFramePr>
@@ -6605,7 +6705,7 @@
                     <pic:cNvPicPr/>
                   </pic:nvPicPr>
                   <pic:blipFill>
-                    <a:blip r:embed="rId23"/>
+                    <a:blip r:embed="rId25"/>
                     <a:stretch>
                       <a:fillRect/>
                     </a:stretch>
@@ -6651,7 +6751,7 @@
         <w:drawing>
           <wp:inline xmlns:a="http://schemas.openxmlformats.org/drawingml/2006/main" xmlns:pic="http://schemas.openxmlformats.org/drawingml/2006/picture">
             <wp:extent cx="5669280" cy="4724400"/>
-            <wp:docPr id="16" name="Picture 16"/>
+            <wp:docPr id="18" name="Picture 18"/>
             <wp:cNvGraphicFramePr>
               <a:graphicFrameLocks noChangeAspect="1"/>
             </wp:cNvGraphicFramePr>
@@ -6663,7 +6763,7 @@
                     <pic:cNvPicPr/>
                   </pic:nvPicPr>
                   <pic:blipFill>
-                    <a:blip r:embed="rId24"/>
+                    <a:blip r:embed="rId26"/>
                     <a:stretch>
                       <a:fillRect/>
                     </a:stretch>

</xml_diff>

<commit_message>
docs(release): prepare 0.8.0 - viewer extras in changelog, README and guides
The field viewer extras (3 planes, contours, streamlines) and the streamline
fix were only listed under Unreleased. Cut 0.8.0:

- CHANGELOG: new 0.8.0 section with Added/Fixed/Changed, fresh empty
  Unreleased; the docs paragraphs that landed after the v0.7.0 tag move out of
  the 0.7.0 section, which keeps the four-screenshot wording it shipped with.
- README: the three new switches in the Field Viewer section.
- Guides (DE/EN): section 7.2 describes 3 planes, Contours and Streamlines,
  including why streamlines need a dump with the `field` vector array; DOCX and
  ODT rebuilt.
- app/__init__.py: __version__ 0.6.0 -> 0.8.0 (the About dialog was two
  releases behind).
</commit_message>
<xml_diff>
--- a/docs/ANLEITUNG_DE.docx
+++ b/docs/ANLEITUNG_DE.docx
@@ -6820,6 +6820,140 @@
       </w:r>
       <w:r>
         <w:t>) und als MP4.</w:t>
+      </w:r>
+    </w:p>
+    <w:p>
+      <w:r>
+        <w:t>Drei Schalter erweitern die Ansicht in Richtung ParaView:</w:t>
+      </w:r>
+    </w:p>
+    <w:tbl>
+      <w:tblPr>
+        <w:tblStyle w:val="TableGrid"/>
+        <w:tblW w:type="auto" w:w="0"/>
+        <w:tblLook w:firstColumn="1" w:firstRow="1" w:lastColumn="0" w:lastRow="0" w:noHBand="0" w:noVBand="1" w:val="04A0"/>
+      </w:tblPr>
+      <w:tblGrid>
+        <w:gridCol w:w="5040"/>
+        <w:gridCol w:w="5040"/>
+      </w:tblGrid>
+      <w:tr>
+        <w:tc>
+          <w:tcPr>
+            <w:tcW w:type="dxa" w:w="5040"/>
+          </w:tcPr>
+          <w:p>
+            <w:r/>
+            <w:r>
+              <w:rPr>
+                <w:b/>
+              </w:rPr>
+              <w:t>----------</w:t>
+            </w:r>
+          </w:p>
+        </w:tc>
+        <w:tc>
+          <w:tcPr>
+            <w:tcW w:type="dxa" w:w="5040"/>
+          </w:tcPr>
+          <w:p>
+            <w:r/>
+            <w:r>
+              <w:rPr>
+                <w:b/>
+              </w:rPr>
+              <w:t>---------</w:t>
+            </w:r>
+          </w:p>
+        </w:tc>
+      </w:tr>
+      <w:tr>
+        <w:tc>
+          <w:tcPr>
+            <w:tcW w:type="dxa" w:w="5040"/>
+          </w:tcPr>
+          <w:p>
+            <w:r/>
+            <w:r>
+              <w:t>3 planes</w:t>
+            </w:r>
+          </w:p>
+        </w:tc>
+        <w:tc>
+          <w:tcPr>
+            <w:tcW w:type="dxa" w:w="5040"/>
+          </w:tcPr>
+          <w:p>
+            <w:r/>
+            <w:r>
+              <w:t>zeigt die X-, Y- und Z-Schnittfläche gleichzeitig; die gewählte Achse folgt dem Schieber, die beiden anderen schneiden durch die Mitte ihres Bereichs</w:t>
+            </w:r>
+          </w:p>
+        </w:tc>
+      </w:tr>
+      <w:tr>
+        <w:tc>
+          <w:tcPr>
+            <w:tcW w:type="dxa" w:w="5040"/>
+          </w:tcPr>
+          <w:p>
+            <w:r/>
+            <w:r>
+              <w:t>Contours</w:t>
+            </w:r>
+          </w:p>
+        </w:tc>
+        <w:tc>
+          <w:tcPr>
+            <w:tcW w:type="dxa" w:w="5040"/>
+          </w:tcPr>
+          <w:p>
+            <w:r/>
+            <w:r>
+              <w:t>legt 2…24 Iso-Linien des gewählten Arrays auf die Schnittflächen</w:t>
+            </w:r>
+          </w:p>
+        </w:tc>
+      </w:tr>
+      <w:tr>
+        <w:tc>
+          <w:tcPr>
+            <w:tcW w:type="dxa" w:w="5040"/>
+          </w:tcPr>
+          <w:p>
+            <w:r/>
+            <w:r>
+              <w:t>Streamlines</w:t>
+            </w:r>
+          </w:p>
+        </w:tc>
+        <w:tc>
+          <w:tcPr>
+            <w:tcW w:type="dxa" w:w="5040"/>
+          </w:tcPr>
+          <w:p>
+            <w:r/>
+            <w:r>
+              <w:t>zeichnet Feldlinien durch das Volumen (vtkStreamTracer, als Röhrchen), eingefärbt vom Feldwert; Start ist eine Seed-Ebene durch die Mitte</w:t>
+            </w:r>
+          </w:p>
+        </w:tc>
+      </w:tr>
+    </w:tbl>
+    <w:p/>
+    <w:p>
+      <w:r>
+        <w:t xml:space="preserve">Die Stromlinien brauchen ein Vektor-Array mit drei Komponenten. Der VTK-Export schreibt es als </w:t>
+      </w:r>
+      <w:r>
+        <w:rPr>
+          <w:rFonts w:ascii="Consolas" w:hAnsi="Consolas"/>
+          <w:sz w:val="18"/>
+        </w:rPr>
+        <w:t>field</w:t>
+      </w:r>
+      <w:r>
+        <w:t>, sobald der Dump xyz-Komponenten enthält — genau dann ist der Schalter aktiv. Ein Dump, der nur den Betrag speichert, lässt ihn ausgegraut, und der Tooltip nennt den Grund.</w:t>
       </w:r>
     </w:p>
     <w:p>

</xml_diff>

<commit_message>
docs(readme): add the magic tee field picture to README and guides
WR-90 magic tee at 10 GHz, 0.75 mm mesh, 149k dump points: 3 planes, contours and streamlines in one view. The guides get the same figure in section 7.2, DOCX and ODT rebuilt.
</commit_message>
<xml_diff>
--- a/docs/ANLEITUNG_DE.docx
+++ b/docs/ANLEITUNG_DE.docx
@@ -6954,6 +6954,56 @@
       </w:r>
       <w:r>
         <w:t>, sobald der Dump xyz-Komponenten enthält — genau dann ist der Schalter aktiv. Ein Dump, der nur den Betrag speichert, lässt ihn ausgegraut, und der Tooltip nennt den Grund.</w:t>
+      </w:r>
+    </w:p>
+    <w:p>
+      <w:pPr>
+        <w:jc w:val="center"/>
+      </w:pPr>
+      <w:r>
+        <w:drawing>
+          <wp:inline xmlns:a="http://schemas.openxmlformats.org/drawingml/2006/main" xmlns:pic="http://schemas.openxmlformats.org/drawingml/2006/picture">
+            <wp:extent cx="5669280" cy="3401568"/>
+            <wp:docPr id="19" name="Picture 19"/>
+            <wp:cNvGraphicFramePr>
+              <a:graphicFrameLocks noChangeAspect="1"/>
+            </wp:cNvGraphicFramePr>
+            <a:graphic>
+              <a:graphicData uri="http://schemas.openxmlformats.org/drawingml/2006/picture">
+                <pic:pic>
+                  <pic:nvPicPr>
+                    <pic:cNvPr id="0" name="field_viewer_magic_tee.png"/>
+                    <pic:cNvPicPr/>
+                  </pic:nvPicPr>
+                  <pic:blipFill>
+                    <a:blip r:embed="rId27"/>
+                    <a:stretch>
+                      <a:fillRect/>
+                    </a:stretch>
+                  </pic:blipFill>
+                  <pic:spPr>
+                    <a:xfrm>
+                      <a:off x="0" y="0"/>
+                      <a:ext cx="5669280" cy="3401568"/>
+                    </a:xfrm>
+                    <a:prstGeom prst="rect"/>
+                  </pic:spPr>
+                </pic:pic>
+              </a:graphicData>
+            </a:graphic>
+          </wp:inline>
+        </w:drawing>
+      </w:r>
+    </w:p>
+    <w:p>
+      <w:r>
+        <w:rPr>
+          <w:b/>
+        </w:rPr>
+        <w:t>3 planes, Contours und Streamlines an einem Magic Tee (WR-90, 10 GHz).</w:t>
+      </w:r>
+      <w:r>
+        <w:t xml:space="preserve"> Netz 0,75 mm, 149 000 Dump-Punkte, logarithmische Farbskala. Das helle Band ist der Knoten, an dem sich die Welle auf die beiden Arme aufteilt.</w:t>
       </w:r>
     </w:p>
     <w:p>

</xml_diff>

<commit_message>
fix: use VisualopenEMS spelling everywhere (v0.9.2)
Correct branding to exactly VisualopenEMS in APP_NAME, window/About, docs (MD/DOCX/ODT), tool footers and the PyInstaller output (dist/VisualopenEMS.exe). Repository/package identifiers unchanged.
</commit_message>
<xml_diff>
--- a/docs/ANLEITUNG_DE.docx
+++ b/docs/ANLEITUNG_DE.docx
@@ -29,7 +29,7 @@
         <w:t>Projekt:</w:t>
       </w:r>
       <w:r>
-        <w:t xml:space="preserve"> FreeCAD OpenEMS GUI</w:t>
+        <w:t xml:space="preserve"> VisualopenEMS</w:t>
       </w:r>
     </w:p>
     <w:p>
@@ -6824,6 +6824,163 @@
     </w:p>
     <w:p>
       <w:r>
+        <w:t>Aufbau: oben die Aktionsleiste (</w:t>
+      </w:r>
+      <w:r>
+        <w:rPr>
+          <w:rFonts w:ascii="Consolas" w:hAnsi="Consolas"/>
+          <w:sz w:val="18"/>
+        </w:rPr>
+        <w:t>Open</w:t>
+      </w:r>
+      <w:r>
+        <w:t xml:space="preserve">, </w:t>
+      </w:r>
+      <w:r>
+        <w:rPr>
+          <w:rFonts w:ascii="Consolas" w:hAnsi="Consolas"/>
+          <w:sz w:val="18"/>
+        </w:rPr>
+        <w:t>Export ▾</w:t>
+      </w:r>
+      <w:r>
+        <w:t xml:space="preserve">, </w:t>
+      </w:r>
+      <w:r>
+        <w:rPr>
+          <w:rFonts w:ascii="Consolas" w:hAnsi="Consolas"/>
+          <w:sz w:val="18"/>
+        </w:rPr>
+        <w:t>Video</w:t>
+      </w:r>
+      <w:r>
+        <w:t xml:space="preserve">, </w:t>
+      </w:r>
+      <w:r>
+        <w:rPr>
+          <w:rFonts w:ascii="Consolas" w:hAnsi="Consolas"/>
+          <w:sz w:val="18"/>
+        </w:rPr>
+        <w:t>Pop out</w:t>
+      </w:r>
+      <w:r>
+        <w:t xml:space="preserve">, </w:t>
+      </w:r>
+      <w:r>
+        <w:rPr>
+          <w:rFonts w:ascii="Consolas" w:hAnsi="Consolas"/>
+          <w:sz w:val="18"/>
+        </w:rPr>
+        <w:t>Reset view</w:t>
+      </w:r>
+      <w:r>
+        <w:t xml:space="preserve">), links das einklappbare Display-Panel mit </w:t>
+      </w:r>
+      <w:r>
+        <w:rPr>
+          <w:b/>
+        </w:rPr>
+        <w:t>Data</w:t>
+      </w:r>
+      <w:r>
+        <w:t xml:space="preserve">, </w:t>
+      </w:r>
+      <w:r>
+        <w:rPr>
+          <w:b/>
+        </w:rPr>
+        <w:t>Slice / Iso</w:t>
+      </w:r>
+      <w:r>
+        <w:t xml:space="preserve">, </w:t>
+      </w:r>
+      <w:r>
+        <w:rPr>
+          <w:b/>
+        </w:rPr>
+        <w:t>Colour</w:t>
+      </w:r>
+      <w:r>
+        <w:t xml:space="preserve"> und </w:t>
+      </w:r>
+      <w:r>
+        <w:rPr>
+          <w:b/>
+        </w:rPr>
+        <w:t>Vectors</w:t>
+      </w:r>
+      <w:r>
+        <w:t xml:space="preserve">, unten die Playback-Leiste. Der Slice-/Iso-Block erscheint nur bei den passenden Darstellungen; die Export-Details (per-step, step stride) liegen im </w:t>
+      </w:r>
+      <w:r>
+        <w:rPr>
+          <w:rFonts w:ascii="Consolas" w:hAnsi="Consolas"/>
+          <w:sz w:val="18"/>
+        </w:rPr>
+        <w:t>Export ▾</w:t>
+      </w:r>
+      <w:r>
+        <w:t xml:space="preserve">-Menü. Unter </w:t>
+      </w:r>
+      <w:r>
+        <w:rPr>
+          <w:rFonts w:ascii="Consolas" w:hAnsi="Consolas"/>
+          <w:sz w:val="18"/>
+        </w:rPr>
+        <w:t>Settings</w:t>
+      </w:r>
+      <w:r>
+        <w:t xml:space="preserve"> → </w:t>
+      </w:r>
+      <w:r>
+        <w:rPr>
+          <w:b/>
+        </w:rPr>
+        <w:t>Viewer settings…</w:t>
+      </w:r>
+      <w:r>
+        <w:t xml:space="preserve"> → </w:t>
+      </w:r>
+      <w:r>
+        <w:rPr>
+          <w:b/>
+        </w:rPr>
+        <w:t>Layout</w:t>
+      </w:r>
+      <w:r>
+        <w:t xml:space="preserve"> ist wählbar: </w:t>
+      </w:r>
+      <w:r>
+        <w:rPr>
+          <w:b/>
+        </w:rPr>
+        <w:t>B</w:t>
+      </w:r>
+      <w:r>
+        <w:t xml:space="preserve"> = Panel fest links, </w:t>
+      </w:r>
+      <w:r>
+        <w:rPr>
+          <w:b/>
+        </w:rPr>
+        <w:t>C</w:t>
+      </w:r>
+      <w:r>
+        <w:t xml:space="preserve"> = Minimal-Ansicht mit </w:t>
+      </w:r>
+      <w:r>
+        <w:rPr>
+          <w:rFonts w:ascii="Consolas" w:hAnsi="Consolas"/>
+          <w:sz w:val="18"/>
+        </w:rPr>
+        <w:t>Display…</w:t>
+      </w:r>
+      <w:r>
+        <w:t>-Popup.</w:t>
+      </w:r>
+    </w:p>
+    <w:p>
+      <w:r>
         <w:t>Drei Schalter erweitern die Ansicht in Richtung ParaView:</w:t>
       </w:r>
     </w:p>
@@ -6954,6 +7111,169 @@
       </w:r>
       <w:r>
         <w:t>, sobald der Dump xyz-Komponenten enthält — genau dann ist der Schalter aktiv. Ein Dump, der nur den Betrag speichert, lässt ihn ausgegraut, und der Tooltip nennt den Grund.</w:t>
+      </w:r>
+    </w:p>
+    <w:p>
+      <w:r>
+        <w:t xml:space="preserve">Unter </w:t>
+      </w:r>
+      <w:r>
+        <w:rPr>
+          <w:rFonts w:ascii="Consolas" w:hAnsi="Consolas"/>
+          <w:sz w:val="18"/>
+        </w:rPr>
+        <w:t>Settings</w:t>
+      </w:r>
+      <w:r>
+        <w:t xml:space="preserve"> → </w:t>
+      </w:r>
+      <w:r>
+        <w:rPr>
+          <w:b/>
+        </w:rPr>
+        <w:t>Viewer settings…</w:t>
+      </w:r>
+      <w:r>
+        <w:t xml:space="preserve"> liegen alle Field-Viewer-Defaults (Auto-play, Standardansicht, Vektorpfeile) und die </w:t>
+      </w:r>
+      <w:r>
+        <w:rPr>
+          <w:b/>
+        </w:rPr>
+        <w:t>Farbskala</w:t>
+      </w:r>
+      <w:r>
+        <w:t xml:space="preserve">: Colormap (jet, turbo, viridis, plasma, inferno, magma, coolwarm, rainbow, grayscale), </w:t>
+      </w:r>
+      <w:r>
+        <w:rPr>
+          <w:b/>
+        </w:rPr>
+        <w:t>Reverse the colours</w:t>
+      </w:r>
+      <w:r>
+        <w:t xml:space="preserve">, Anzahl der </w:t>
+      </w:r>
+      <w:r>
+        <w:rPr>
+          <w:b/>
+        </w:rPr>
+        <w:t>Colour steps</w:t>
+      </w:r>
+      <w:r>
+        <w:t xml:space="preserve"> (256 = weicher Verlauf, bis 2 = diskrete Farbbänder) und eine Live-Vorschau. Die Einstellung wirkt sofort auf Fläche und Farbleiste und wird gespeichert; der Default bleibt die klassische Blau-nach-Rot-Tabelle. Die Zahlen-Grenzen bleiben im Viewer (</w:t>
+      </w:r>
+      <w:r>
+        <w:rPr>
+          <w:rFonts w:ascii="Consolas" w:hAnsi="Consolas"/>
+          <w:sz w:val="18"/>
+        </w:rPr>
+        <w:t>Auto</w:t>
+      </w:r>
+      <w:r>
+        <w:t xml:space="preserve">, </w:t>
+      </w:r>
+      <w:r>
+        <w:rPr>
+          <w:rFonts w:ascii="Consolas" w:hAnsi="Consolas"/>
+          <w:sz w:val="18"/>
+        </w:rPr>
+        <w:t>min</w:t>
+      </w:r>
+      <w:r>
+        <w:t xml:space="preserve">, </w:t>
+      </w:r>
+      <w:r>
+        <w:rPr>
+          <w:rFonts w:ascii="Consolas" w:hAnsi="Consolas"/>
+          <w:sz w:val="18"/>
+        </w:rPr>
+        <w:t>max</w:t>
+      </w:r>
+      <w:r>
+        <w:t xml:space="preserve">, </w:t>
+      </w:r>
+      <w:r>
+        <w:rPr>
+          <w:rFonts w:ascii="Consolas" w:hAnsi="Consolas"/>
+          <w:sz w:val="18"/>
+        </w:rPr>
+        <w:t>Log scale</w:t>
+      </w:r>
+      <w:r>
+        <w:t xml:space="preserve">). Der Farbleisten-Titel wird im selben Fenster unter </w:t>
+      </w:r>
+      <w:r>
+        <w:rPr>
+          <w:b/>
+        </w:rPr>
+        <w:t>Colour bar title</w:t>
+      </w:r>
+      <w:r>
+        <w:t xml:space="preserve"> eingestellt: links neben oder über dem Balken, mit X/Y-Position (normierte Viewport-Koordinaten), Textgröße und Drehwinkel. Der Balken selbst hat unter </w:t>
+      </w:r>
+      <w:r>
+        <w:rPr>
+          <w:b/>
+        </w:rPr>
+        <w:t>Colour bar</w:t>
+      </w:r>
+      <w:r>
+        <w:t xml:space="preserve"> X/Y-Position, Breite/Höhe, Schriftart (Arial/Times/Courier) und Label-Schriftgröße. </w:t>
+      </w:r>
+      <w:r>
+        <w:rPr>
+          <w:b/>
+        </w:rPr>
+        <w:t>Preview</w:t>
+      </w:r>
+      <w:r>
+        <w:t xml:space="preserve"> wendet die Einstellungen ohne Speichern auf den Viewer an; </w:t>
+      </w:r>
+      <w:r>
+        <w:rPr>
+          <w:b/>
+        </w:rPr>
+        <w:t>Cancel</w:t>
+      </w:r>
+      <w:r>
+        <w:t xml:space="preserve"> stellt den vorherigen Zustand wieder her, </w:t>
+      </w:r>
+      <w:r>
+        <w:rPr>
+          <w:b/>
+        </w:rPr>
+        <w:t>Save</w:t>
+      </w:r>
+      <w:r>
+        <w:t xml:space="preserve"> übernimmt sie. Das Fenster ist in die Tabs </w:t>
+      </w:r>
+      <w:r>
+        <w:rPr>
+          <w:b/>
+        </w:rPr>
+        <w:t>Viewer</w:t>
+      </w:r>
+      <w:r>
+        <w:t xml:space="preserve">, </w:t>
+      </w:r>
+      <w:r>
+        <w:rPr>
+          <w:b/>
+        </w:rPr>
+        <w:t>Colour</w:t>
+      </w:r>
+      <w:r>
+        <w:t xml:space="preserve"> und </w:t>
+      </w:r>
+      <w:r>
+        <w:rPr>
+          <w:b/>
+        </w:rPr>
+        <w:t>Colour bar</w:t>
+      </w:r>
+      <w:r>
+        <w:t xml:space="preserve"> gegliedert.</w:t>
       </w:r>
     </w:p>
     <w:p>
@@ -9383,7 +9703,7 @@
           <w:color w:val="666666"/>
           <w:sz w:val="18"/>
         </w:rPr>
-        <w:t>Generiert aus docs/ANLEITUNG_DE.md — FreeCAD OpenEMS GUI</w:t>
+        <w:t>Generiert aus docs/ANLEITUNG_DE.md — VisualopenEMS</w:t>
       </w:r>
     </w:p>
     <w:sectPr>

</xml_diff>